<commit_message>
Reconcile internship submission with full research history and critical review
</commit_message>
<xml_diff>
--- a/rapor/final_2026/deliverables/CS395_FinalReport_EfeHan_Keles_25September2026.docx
+++ b/rapor/final_2026/deliverables/CS395_FinalReport_EfeHan_Keles_25September2026.docx
@@ -555,7 +555,7 @@
         </w:rPr>
         <w:t>4.4 Expected outcomes and deliverables</w:t>
         <w:tab/>
-        <w:t>12</w:t>
+        <w:t>13</w:t>
       </w:r>
     </w:p>
     <w:p>
@@ -612,7 +612,7 @@
         </w:rPr>
         <w:t>4.5.2 Data integrity and corrected conclusions</w:t>
         <w:tab/>
-        <w:t>13</w:t>
+        <w:t>14</w:t>
       </w:r>
     </w:p>
     <w:p>
@@ -631,7 +631,7 @@
         </w:rPr>
         <w:t>4.5.3 Data roles and processing conditions</w:t>
         <w:tab/>
-        <w:t>14</w:t>
+        <w:t>15</w:t>
       </w:r>
     </w:p>
     <w:p>
@@ -650,7 +650,7 @@
         </w:rPr>
         <w:t>4.5.4 E92 representation and learning</w:t>
         <w:tab/>
-        <w:t>15</w:t>
+        <w:t>16</w:t>
       </w:r>
     </w:p>
     <w:p>
@@ -669,7 +669,7 @@
         </w:rPr>
         <w:t>4.5.5 Development improvement and acceptance limits</w:t>
         <w:tab/>
-        <w:t>16</w:t>
+        <w:t>17</w:t>
       </w:r>
     </w:p>
     <w:p>
@@ -688,7 +688,7 @@
         </w:rPr>
         <w:t>4.5.6 Honest scores and the web demonstration</w:t>
         <w:tab/>
-        <w:t>17</w:t>
+        <w:t>19</w:t>
       </w:r>
     </w:p>
     <w:p>
@@ -707,7 +707,7 @@
         </w:rPr>
         <w:t>4.5.7 Broader checks and rejected improvements</w:t>
         <w:tab/>
-        <w:t>18</w:t>
+        <w:t>20</w:t>
       </w:r>
     </w:p>
     <w:p>
@@ -726,7 +726,7 @@
         </w:rPr>
         <w:t>4.5.8 Model2 localization and its limits</w:t>
         <w:tab/>
-        <w:t>19</w:t>
+        <w:t>21</w:t>
       </w:r>
     </w:p>
     <w:p>
@@ -770,7 +770,7 @@
         </w:rPr>
         <w:t>4.6 Results</w:t>
         <w:tab/>
-        <w:t>20</w:t>
+        <w:t>22</w:t>
       </w:r>
     </w:p>
     <w:p>
@@ -789,7 +789,7 @@
         </w:rPr>
         <w:t>5. Internship experience</w:t>
         <w:tab/>
-        <w:t>21</w:t>
+        <w:t>23</w:t>
       </w:r>
     </w:p>
     <w:p>
@@ -808,7 +808,7 @@
         </w:rPr>
         <w:t>5.1 Learning</w:t>
         <w:tab/>
-        <w:t>21</w:t>
+        <w:t>23</w:t>
       </w:r>
     </w:p>
     <w:p>
@@ -827,7 +827,7 @@
         </w:rPr>
         <w:t>5.2 Relation to undergraduate education</w:t>
         <w:tab/>
-        <w:t>21</w:t>
+        <w:t>23</w:t>
       </w:r>
     </w:p>
     <w:p>
@@ -846,7 +846,7 @@
         </w:rPr>
         <w:t>5.3 Major difficulties</w:t>
         <w:tab/>
-        <w:t>22</w:t>
+        <w:t>24</w:t>
       </w:r>
     </w:p>
     <w:p>
@@ -865,7 +865,7 @@
         </w:rPr>
         <w:t>5.4 A typical day</w:t>
         <w:tab/>
-        <w:t>22</w:t>
+        <w:t>24</w:t>
       </w:r>
     </w:p>
     <w:p>
@@ -884,7 +884,7 @@
         </w:rPr>
         <w:t>6. Conclusions</w:t>
         <w:tab/>
-        <w:t>23</w:t>
+        <w:t>25</w:t>
       </w:r>
     </w:p>
     <w:p>
@@ -903,7 +903,7 @@
         </w:rPr>
         <w:t>7. Recommendations</w:t>
         <w:tab/>
-        <w:t>24</w:t>
+        <w:t>26</w:t>
       </w:r>
     </w:p>
     <w:p>
@@ -922,7 +922,7 @@
         </w:rPr>
         <w:t>8. References</w:t>
         <w:tab/>
-        <w:t>25</w:t>
+        <w:t>27</w:t>
       </w:r>
     </w:p>
     <w:p>
@@ -941,7 +941,7 @@
         </w:rPr>
         <w:t>9. Appendices</w:t>
         <w:tab/>
-        <w:t>27</w:t>
+        <w:t>29</w:t>
       </w:r>
     </w:p>
     <w:p>
@@ -960,7 +960,7 @@
         </w:rPr>
         <w:t>9.1 Development criteria</w:t>
         <w:tab/>
-        <w:t>27</w:t>
+        <w:t>29</w:t>
       </w:r>
     </w:p>
     <w:p>
@@ -979,7 +979,7 @@
         </w:rPr>
         <w:t>9.2 Evidence and reproduction map</w:t>
         <w:tab/>
-        <w:t>28</w:t>
+        <w:t>30</w:t>
       </w:r>
       <w:r>
         <w:rPr>
@@ -1045,7 +1045,7 @@
           <w:color w:val="000000"/>
           <w:sz w:val="24"/>
         </w:rPr>
-        <w:t>The main achievement is a functioning research system with measurable development improvements, a usable local interface and an evaluation process that also records failures. The strongest current demonstration uses E92. Its success is qualified: it satisfies 20 numerical checks on reused development observations, but fails a separate rule that protects previously detected AI examples. Independent universal reliability remains unproven.</w:t>
+        <w:t>The main achievement is a functioning research system with measurable development improvements, a usable local interface and an evaluation process that also records failures. The current local demonstration uses E92. Its success is qualified: it satisfies 20 numerical checks on reused development observations, but fails a separate rule that protects previously detected AI examples. Independent universal reliability remains unproven.</w:t>
       </w:r>
     </w:p>
     <w:p>
@@ -1502,6 +1502,20 @@
     </w:p>
     <w:p>
       <w:pPr>
+        <w:widowControl/>
+        <w:spacing w:line="480" w:lineRule="auto" w:before="0" w:after="0"/>
+      </w:pPr>
+      <w:r>
+        <w:rPr>
+          <w:rFonts w:ascii="Times New Roman" w:hAnsi="Times New Roman"/>
+          <w:color w:val="000000"/>
+          <w:sz w:val="24"/>
+        </w:rPr>
+        <w:t>An industry example addresses the same trust problem through a different form of evidence. Adobe Content Credentials can record a file’s origin, edits and use of generative AI (Adobe, n.d.). PixelProof instead estimates a signal from image pixels. These approaches could complement each other, but this project did not implement credential verification. The comparison helps explain why a detector score alone should not be presented as proof of authenticity.</w:t>
+      </w:r>
+    </w:p>
+    <w:p>
+      <w:pPr>
         <w:pStyle w:val="Heading1"/>
         <w:pageBreakBefore/>
         <w:widowControl/>
@@ -1628,7 +1642,21 @@
           <w:color w:val="000000"/>
           <w:sz w:val="24"/>
         </w:rPr>
-        <w:t>Experiments followed a recorded hypothesis, a fixed population and configuration, execution, saved results and an explicit disposition. TRAIN supplied learning data. Calibration selected an operating rule. DEVELOPMENT exposed weaknesses and guided further work. A protected final collection was not treated as another tuning resource. These roles describe permissible use, not simply folder names.</w:t>
+        <w:t>The workflow became more disciplined as problems emerged. Before a later experiment, the plan stated the question, data and acceptance rules. After the run, the experiment log recorded results and failures, and the history explained the decision. The dataset register recorded what was acquired and why it could be used. For example, correcting reversed labels required rerunning affected experiments and withdrawing an earlier conclusion. These records show how a result changed the next step; they are not simply a collection of successful scores.</w:t>
+      </w:r>
+    </w:p>
+    <w:p>
+      <w:pPr>
+        <w:widowControl/>
+        <w:spacing w:line="480" w:lineRule="auto" w:before="0" w:after="0"/>
+      </w:pPr>
+      <w:r>
+        <w:rPr>
+          <w:rFonts w:ascii="Times New Roman" w:hAnsi="Times New Roman"/>
+          <w:color w:val="000000"/>
+          <w:sz w:val="24"/>
+        </w:rPr>
+        <w:t>Training data taught the model. Calibration data helped choose the score threshold. Development data revealed weaknesses and guided further changes. Final evaluation required data that had not influenced these decisions. Repeatedly checking the same collection makes it development evidence, even when each new run has fixed settings. The main error measures were AI detection rate and false alerts on real photographs. AUC measured ranking across thresholds; it did not establish that a particular decision rule was safe.</w:t>
       </w:r>
     </w:p>
     <w:p>
@@ -2146,6 +2174,34 @@
     </w:p>
     <w:p>
       <w:pPr>
+        <w:widowControl/>
+        <w:spacing w:line="480" w:lineRule="auto" w:before="0" w:after="0"/>
+      </w:pPr>
+      <w:r>
+        <w:rPr>
+          <w:rFonts w:ascii="Times New Roman" w:hAnsi="Times New Roman"/>
+          <w:color w:val="000000"/>
+          <w:sz w:val="24"/>
+        </w:rPr>
+        <w:t>The next phase compared the project-trained E20 tile model with frozen Community-Forensics and B-Free detectors. External representations improved some results, but each still produced severe false alerts on particular real-image sources. The E26 comparison used a union of source-calibrated alerts, while later modern-generator probes exposed remaining blind spots. E31 and E32 then showed that strong internal results could collapse on new real-image sources. These stages explain why the project continued beyond its first working demo (Keleş, 2026, E20–E32).</w:t>
+      </w:r>
+    </w:p>
+    <w:p>
+      <w:pPr>
+        <w:widowControl/>
+        <w:spacing w:line="480" w:lineRule="auto" w:before="0" w:after="0"/>
+      </w:pPr>
+      <w:r>
+        <w:rPr>
+          <w:rFonts w:ascii="Times New Roman" w:hAnsi="Times New Roman"/>
+          <w:color w:val="000000"/>
+          <w:sz w:val="24"/>
+        </w:rPr>
+        <w:t>Threshold changes and more balanced training sources did not consistently solve transfer failures. E42 still failed a larger RR evaluation covering 16,953 original images and 50,858 linked versions. Its successor, E43, improved on familiar RR data but struggled with reconstructed images. Combining specialist detectors then exposed two opposing problems: false alerts on real photographs and missed GAN-generated images. The next phase therefore aimed to correct real-photo errors while retaining AI detections already made by the reference (Keleş, 2026, E33–E50).</w:t>
+      </w:r>
+    </w:p>
+    <w:p>
+      <w:pPr>
         <w:pStyle w:val="Heading3"/>
         <w:widowControl/>
         <w:spacing w:line="480" w:lineRule="auto" w:before="0" w:after="0"/>
@@ -2227,7 +2283,7 @@
           <w:color w:val="000000"/>
           <w:sz w:val="24"/>
         </w:rPr>
-        <w:t>Each source was documented with its origin, intended role, licensing status and integrity checks. Acquired bytes were not automatically admitted into training. Exact identities, available perceptual matches and known parent, scene or prompt relationships informed grouping. Unresolved ancestry was retained as a limitation rather than replaced by an independence assumption.</w:t>
+        <w:t>The dataset register recorded each source, its licence, intended use and integrity checks. Downloading a collection did not make it training data. The audit checked identical files, similar images and known shared scenes or prompts. Where the original source could not be established, the report keeps that uncertainty. A parent image means the original observation before this project creates resized or compressed versions of it.</w:t>
       </w:r>
     </w:p>
     <w:p>
@@ -2881,6 +2937,20 @@
     </w:p>
     <w:p>
       <w:pPr>
+        <w:widowControl/>
+        <w:spacing w:line="480" w:lineRule="auto" w:before="0" w:after="0"/>
+      </w:pPr>
+      <w:r>
+        <w:rPr>
+          <w:rFonts w:ascii="Times New Roman" w:hAnsi="Times New Roman"/>
+          <w:color w:val="000000"/>
+          <w:sz w:val="24"/>
+        </w:rPr>
+        <w:t>An earlier, larger E49-C test contained 1,000 real and 1,000 AI parent images. E43 falsely flagged 391 real originals and 490 processed copies, while detecting 943 and 955 AI images respectively. It passed 11 of 20 checks. After inspection, these results could guide research but no longer serve as an untouched final test. E92 was not evaluated on this collection because it failed the earlier acceptance stage. Its later 20/20 development result therefore cannot be reported as passing E49-C (Keleş, 2026, E49 and E92).</w:t>
+      </w:r>
+    </w:p>
+    <w:p>
+      <w:pPr>
         <w:pStyle w:val="Heading3"/>
         <w:widowControl/>
         <w:spacing w:line="480" w:lineRule="auto" w:before="0" w:after="0"/>
@@ -2905,7 +2975,21 @@
           <w:color w:val="000000"/>
           <w:sz w:val="24"/>
         </w:rPr>
-        <w:t>E92 combines frozen DINOv2, CLIP and DEAR features with earlier learned components and a supervised representation. A constrained correction head then adjusts the reference decision score. The optimization emphasized difficult real-image sources while protecting training AI responses. Constraints on training examples are useful safeguards, but they do not guarantee the same protection on a different population.</w:t>
+        <w:t>The route to E92 involved several rejected alternatives. Broader real-image coverage reduced false alerts but sometimes lost AI detections. Fine-tuning, grayscale input and small score corrections did not meet the full requirements. Later work added CLIP and DEAR features, a learned representation, and processing conditions closer to web use. E83 and E86 each passed 17 of 20 development checks. Additional training coverage preceded E92, although this sequence alone does not prove which added source caused the improvement (Keleş, 2026, E51–E92).</w:t>
+      </w:r>
+    </w:p>
+    <w:p>
+      <w:pPr>
+        <w:widowControl/>
+        <w:spacing w:line="480" w:lineRule="auto" w:before="0" w:after="0"/>
+      </w:pPr>
+      <w:r>
+        <w:rPr>
+          <w:rFonts w:ascii="Times New Roman" w:hAnsi="Times New Roman"/>
+          <w:color w:val="000000"/>
+          <w:sz w:val="24"/>
+        </w:rPr>
+        <w:t>E92 uses pretrained DINOv2, CLIP and DEAR components to turn images into numerical features. Their weights stay fixed. Project-trained components then learn how to use those features, and a correction adjusts the reference score. The correction was constrained to protect AI responses on training examples while reducing errors on difficult real-image sources. This protection had to be checked again on development images; a training constraint alone could not guarantee it.</w:t>
       </w:r>
     </w:p>
     <w:p>
@@ -3123,6 +3207,20 @@
     </w:p>
     <w:p>
       <w:pPr>
+        <w:widowControl/>
+        <w:spacing w:line="480" w:lineRule="auto" w:before="0" w:after="0"/>
+      </w:pPr>
+      <w:r>
+        <w:rPr>
+          <w:rFonts w:ascii="Times New Roman" w:hAnsi="Times New Roman"/>
+          <w:color w:val="000000"/>
+          <w:sz w:val="24"/>
+        </w:rPr>
+        <w:t>The later E102 candidate reduced processed-view real false alerts further, from 14 to 12 of 160, and retained every E92-detected AI image. Nevertheless, it still missed the same E43-detected original AI example and failed complete acceptance. It was not promoted, and its gallery and E49 evaluations were not opened. E92 therefore identifies the current demo version, not the lowest value ever recorded in a development table (Keleş, 2026, E102).</w:t>
+      </w:r>
+    </w:p>
+    <w:p>
+      <w:pPr>
         <w:pStyle w:val="Heading3"/>
         <w:widowControl/>
         <w:spacing w:line="480" w:lineRule="auto" w:before="0" w:after="0"/>
@@ -3147,7 +3245,7 @@
           <w:color w:val="000000"/>
           <w:sz w:val="24"/>
         </w:rPr>
-        <w:t>The local demonstration presents AI evidence, no clear AI evidence or an uncertain result. It does not certify an image as real. E92 uses an upper raw-score cut of 0.07940196245908739 and a lower cut of 0.011505939625203613. On the interface these correspond approximately to 7.94 and 1.15 on a 0–100 score scale. They are inherited experimental operating points, not calibrated probabilities or universal optima.</w:t>
+        <w:t>The local demonstration reports AI evidence, no clear AI evidence or uncertainty. It does not certify a photograph as real. On the displayed 0–100 score scale, the upper threshold is about 7.94 and the lower threshold about 1.15. The upper threshold came from earlier E48 calibration with limits on real-photo false alerts. The lower one came from E49 analysis of already-used calibration and development data. Neither is a probability or a universal optimum. Exact values are preserved in the project records.</w:t>
       </w:r>
     </w:p>
     <w:p>
@@ -3175,7 +3273,7 @@
           <w:color w:val="000000"/>
           <w:sz w:val="24"/>
         </w:rPr>
-        <w:t>The current-policy audit of the reused 320-parent collection recorded 139 no-clear results and 21 uncertain results among real images, with no real AI alerts. Among AI images it recorded 159 AI alerts and one uncertain result. This is a different endpoint from the per-view classification rates. It must not be presented as 100% accuracy among all uploads, and the gallery has different errors (Keleş, 2026, current-policy audit).</w:t>
+        <w:t>The final interface rule was also checked on the same 320 development images. Of 160 real images, 139 received no clear AI evidence and 21 remained uncertain; none received an AI alert. Of 160 AI images, 159 received an AI alert and one remained uncertain. These counts combine two views into one user result. They differ from the separate-view rates reported earlier, and they do not predict the outcome of every future upload (Keleş, 2026, current-policy audit).</w:t>
       </w:r>
     </w:p>
     <w:p>
@@ -3189,7 +3287,7 @@
           <w:color w:val="000000"/>
           <w:sz w:val="24"/>
         </w:rPr>
-        <w:t>Software protection includes upload bounds, supported-image checks, explicit unavailable responses, response-schema validation and preservation of the single heavy-worker slot during request cancellation. A pinned manifest is verified before model deserialization. These changes reduce implementation failure risk, but they do not measure detection accuracy.</w:t>
+        <w:t>The service rejects unsupported or oversized uploads and gives an explicit error when the model is unavailable. It checks the saved model files before loading them. Cancellation handling prevents a second heavy inference job from starting while an earlier one still runs. The browser checks the response format before showing a result. These repairs make the demo more dependable to use; they do not increase the model’s measured accuracy.</w:t>
       </w:r>
     </w:p>
     <w:p>
@@ -3218,7 +3316,7 @@
           <w:color w:val="000000"/>
           <w:sz w:val="24"/>
         </w:rPr>
-        <w:t>The owner-gallery diagnostic found 9 false AI alerts among 206 unique original real-image byte identities, rising to 18 after social-style processing. These correspond to 4.37% and 8.74%. The collection is dominated by one phone and correlated scenes, and had been inspected before. It is useful evidence of practical failure modes, but does not supply an independent deployment test. Private photographs and per-image identifiers are not reproduced here (Keleş, 2026, E95).</w:t>
+        <w:t>The owner-gallery check found 9 false AI alerts among 206 distinct original real-image files, rising to 18 after social-style processing: 4.37% and 8.74%. The gallery mostly represents one phone and related scenes. It had already influenced earlier development and calibration decisions, so it is not an independent test. It nevertheless shows practical mistakes that the main development result could hide. Private photographs and individual file identifiers are excluded from this report (Keleş, 2026, E95).</w:t>
       </w:r>
     </w:p>
     <w:p>
@@ -3260,7 +3358,21 @@
           <w:color w:val="000000"/>
           <w:sz w:val="24"/>
         </w:rPr>
-        <w:t>Adding those features in E151 slightly improved clean aggregate recall but lowered AI recall in all three transported conditions. For example, the center-control comparison changed JPEG75 AI recall from 75.73% to 74.15%. E152 then decomposed the fixed score changes without retraining: the added residual term was the largest harmful change in 94 of 131 newly missed JPEG75 AI views. The candidate remained rejected. That count describes an error subset, not a detection rate or proof that removing the term would solve the problem.</w:t>
+        <w:t>The added features slightly improved clean-image averages but reduced AI detection after all three tested processing conditions. In one JPEG75 comparison, detection fell from 75.73% to 74.15%. A follow-up analysis examined 131 newly missed AI views. The added residual feature term was the largest harmful score change in 94 cases. This helped locate a weakness, but did not prove that removing the term would fix it. The candidate was rejected (Keleş, 2026, E151–E152).</w:t>
+      </w:r>
+    </w:p>
+    <w:p>
+      <w:pPr>
+        <w:widowControl/>
+        <w:spacing w:line="480" w:lineRule="auto" w:before="0" w:after="0"/>
+      </w:pPr>
+      <w:r>
+        <w:rPr>
+          <w:rFonts w:ascii="Times New Roman" w:hAnsi="Times New Roman"/>
+          <w:color w:val="000000"/>
+          <w:sz w:val="24"/>
+        </w:rPr>
+        <w:t>The later training audit could form only three AI-bearing groups under the known source relationships. Some shared origins and prompts remained unknown. Another 300 AI images in MNW and 100 real images in HDR+ remained unscored, but they had not been approved together as a balanced, independent final test. Unused data are useful only if their coverage and independence answer the intended question (Keleş, 2026, E139–E146).</w:t>
       </w:r>
     </w:p>
     <w:p>
@@ -3289,7 +3401,7 @@
           <w:color w:val="000000"/>
           <w:sz w:val="24"/>
         </w:rPr>
-        <w:t>Model2 compares predicted regions with intended edit masks, using authentic and conventional-edit controls. Early overlap scores were misleading because selecting the predicted area from the true mask size could reward large masks without useful localization. Later experiments separated mask information from inference.</w:t>
+        <w:t>Model2 compares predicted edit regions with reference masks and checks authentic images for false alarms. Early tests used the true mask size to choose the predicted area, which made their overlap scores misleading. In the later 120-image CocoGlide evaluation, a simple central-region baseline still outperformed the detector. This prompted tests with edits placed elsewhere. A separate audit also found shared COCO image origins, limiting claims of independent data (Keleş, 2026, E17, E107 and E115–E117).</w:t>
       </w:r>
     </w:p>
     <w:p>
@@ -3303,7 +3415,7 @@
           <w:color w:val="000000"/>
           <w:sz w:val="24"/>
         </w:rPr>
-        <w:t>The recent controlled pilot used sixteen previously inspected parents and one Stable Diffusion 1.5 editor. A frozen local head obtained mean pixel AUC 0.742 on the original placement, but only 0.566 when edits moved to new locations. Training on both placements increased the new-location value to 0.638, while reducing the original-placement value to 0.699. Authentic falsely flagged area increased from 17.11% to 25.74%. Table 3 shows the original-image condition (Keleş, 2026, E132–E135).</w:t>
+        <w:t>The controlled pilot used sixteen previously inspected images and one Stable Diffusion 1.5 editor. Moving edits reduced the earlier model’s pixel AUC from 0.742 to 0.566. Training on both placements partly recovered new-placement performance, but harmed original-placement performance and highlighted more authentic pixels incorrectly. Table 3 summarizes these trade-offs, with AUC rounded to two decimals (Keleş, 2026, E132–E135).</w:t>
       </w:r>
     </w:p>
     <w:p>
@@ -3320,7 +3432,7 @@
           <w:color w:val="000000"/>
           <w:sz w:val="24"/>
         </w:rPr>
-        <w:t>Table 3. Model2 placement sensitivity on sixteen consumed parents, original-image condition.</w:t>
+        <w:t>Table 3. Model2 placement sensitivity on sixteen reused parents, original-image condition.</w:t>
       </w:r>
     </w:p>
     <w:tbl>
@@ -3484,7 +3596,7 @@
                 <w:color w:val="000000"/>
                 <w:sz w:val="24"/>
               </w:rPr>
-              <w:t>0.742</w:t>
+              <w:t>0.74</w:t>
             </w:r>
           </w:p>
         </w:tc>
@@ -3512,7 +3624,7 @@
                 <w:color w:val="000000"/>
                 <w:sz w:val="24"/>
               </w:rPr>
-              <w:t>0.699</w:t>
+              <w:t>0.70</w:t>
             </w:r>
           </w:p>
         </w:tc>
@@ -3573,7 +3685,7 @@
                 <w:color w:val="000000"/>
                 <w:sz w:val="24"/>
               </w:rPr>
-              <w:t>0.566</w:t>
+              <w:t>0.57</w:t>
             </w:r>
           </w:p>
         </w:tc>
@@ -3601,7 +3713,7 @@
                 <w:color w:val="000000"/>
                 <w:sz w:val="24"/>
               </w:rPr>
-              <w:t>0.638</w:t>
+              <w:t>0.64</w:t>
             </w:r>
           </w:p>
         </w:tc>
@@ -4364,7 +4476,7 @@
           <w:color w:val="000000"/>
           <w:sz w:val="24"/>
         </w:rPr>
-        <w:t>The strongest technical lesson is that a working pipeline and a high score answer different questions. A model may run correctly and still fail on unfamiliar sources. Conversely, a rejected model can produce useful knowledge when its hypothesis, data and errors are documented. The label-direction correction demonstrated why a convincing explanation should not be accepted before the underlying measurement is checked.</w:t>
+        <w:t>The most useful lesson from the work is to ask what a good score actually proves. The first high accuracy values encouraged further development, but errors on new sources changed the priority. The project then needed better data checks and comparisons, not just a larger model. The reversed-label incident is the clearest example: checking the inputs overturned an explanation that had sounded convincing.</w:t>
       </w:r>
     </w:p>
     <w:p>
@@ -4565,7 +4677,7 @@
           <w:color w:val="000000"/>
           <w:sz w:val="24"/>
         </w:rPr>
-        <w:t>The central scientific conclusion is qualified. Passing 20 numerical development checks did not satisfy the full acceptance contract or establish universal performance. A reference-relative AI miss remained, development reuse limited independence, and later diagnostics exposed processing and source failures. Model2 also remained experimental because localization gains introduced other errors.</w:t>
+        <w:t>The main result has a clear limit. The 20 numerical checks passed, but one AI image caught by the reference became a new miss. Repeated use of the development data also restricts how far the result can be generalized. Later source tests and the Model2 pilot found further weaknesses. These findings explain why the system remains a research prototype.</w:t>
       </w:r>
     </w:p>
     <w:p>
@@ -4669,6 +4781,21 @@
           <w:sz w:val="24"/>
         </w:rPr>
         <w:t>Abdelhamed, A., Lin, S., &amp; Brown, M. S. (2018). A high-quality denoising dataset for smartphone cameras. Proceedings of the IEEE Conference on Computer Vision and Pattern Recognition. Retrieved September 25, 2026, from https://abdokamel.github.io/sidd/</w:t>
+      </w:r>
+    </w:p>
+    <w:p>
+      <w:pPr>
+        <w:keepLines/>
+        <w:widowControl/>
+        <w:spacing w:line="240" w:lineRule="auto" w:before="0" w:after="240"/>
+      </w:pPr>
+      <w:r>
+        <w:rPr>
+          <w:rFonts w:ascii="Times New Roman" w:hAnsi="Times New Roman"/>
+          <w:color w:val="000000"/>
+          <w:sz w:val="24"/>
+        </w:rPr>
+        <w:t>Adobe. (n.d.). Content Credentials overview. Adobe Help Center. Retrieved September 25, 2026, from https://helpx.adobe.com/creative-cloud/apps/adobe-content-authenticity/content-credentials/overview.html</w:t>
       </w:r>
     </w:p>
     <w:p>
@@ -6437,6 +6564,67 @@
                 <w:color w:val="000000"/>
                 <w:sz w:val="24"/>
               </w:rPr>
+              <w:t>Earlier comprehensive-final failure</w:t>
+            </w:r>
+          </w:p>
+        </w:tc>
+        <w:tc>
+          <w:tcPr>
+            <w:tcW w:type="dxa" w:w="5501"/>
+            <w:vAlign w:val="center"/>
+            <w:tcBorders>
+              <w:top w:val="single" w:sz="4" w:color="D9D9D9"/>
+              <w:left w:val="single" w:sz="4" w:color="D9D9D9"/>
+              <w:bottom w:val="single" w:sz="4" w:color="D9D9D9"/>
+              <w:right w:val="single" w:sz="4" w:color="D9D9D9"/>
+            </w:tcBorders>
+          </w:tcPr>
+          <w:p>
+            <w:pPr>
+              <w:keepNext/>
+              <w:spacing w:line="480" w:lineRule="auto" w:before="0" w:after="0"/>
+              <w:jc w:val="both"/>
+            </w:pPr>
+            <w:r>
+              <w:rPr>
+                <w:rFonts w:ascii="Times New Roman" w:hAnsi="Times New Roman"/>
+                <w:b w:val="0"/>
+                <w:color w:val="000000"/>
+                <w:sz w:val="24"/>
+              </w:rPr>
+              <w:t>evidence/e49_final_result.json</w:t>
+            </w:r>
+          </w:p>
+        </w:tc>
+      </w:tr>
+      <w:tr>
+        <w:trPr>
+          <w:cantSplit/>
+        </w:trPr>
+        <w:tc>
+          <w:tcPr>
+            <w:tcW w:type="dxa" w:w="3528"/>
+            <w:vAlign w:val="center"/>
+            <w:tcBorders>
+              <w:top w:val="single" w:sz="4" w:color="D9D9D9"/>
+              <w:left w:val="single" w:sz="4" w:color="D9D9D9"/>
+              <w:bottom w:val="single" w:sz="4" w:color="D9D9D9"/>
+              <w:right w:val="single" w:sz="4" w:color="D9D9D9"/>
+            </w:tcBorders>
+          </w:tcPr>
+          <w:p>
+            <w:pPr>
+              <w:keepNext/>
+              <w:spacing w:line="480" w:lineRule="auto" w:before="0" w:after="0"/>
+              <w:jc w:val="both"/>
+            </w:pPr>
+            <w:r>
+              <w:rPr>
+                <w:rFonts w:ascii="Times New Roman" w:hAnsi="Times New Roman"/>
+                <w:b w:val="0"/>
+                <w:color w:val="000000"/>
+                <w:sz w:val="24"/>
+              </w:rPr>
               <w:t>E92 numerical result and failed retention</w:t>
             </w:r>
           </w:p>
@@ -6466,6 +6654,67 @@
                 <w:sz w:val="24"/>
               </w:rPr>
               <w:t>evidence/e92_development.json</w:t>
+            </w:r>
+          </w:p>
+        </w:tc>
+      </w:tr>
+      <w:tr>
+        <w:trPr>
+          <w:cantSplit/>
+        </w:trPr>
+        <w:tc>
+          <w:tcPr>
+            <w:tcW w:type="dxa" w:w="3528"/>
+            <w:vAlign w:val="center"/>
+            <w:tcBorders>
+              <w:top w:val="single" w:sz="4" w:color="D9D9D9"/>
+              <w:left w:val="single" w:sz="4" w:color="D9D9D9"/>
+              <w:bottom w:val="single" w:sz="4" w:color="D9D9D9"/>
+              <w:right w:val="single" w:sz="4" w:color="D9D9D9"/>
+            </w:tcBorders>
+          </w:tcPr>
+          <w:p>
+            <w:pPr>
+              <w:keepNext/>
+              <w:spacing w:line="480" w:lineRule="auto" w:before="0" w:after="0"/>
+              <w:jc w:val="both"/>
+            </w:pPr>
+            <w:r>
+              <w:rPr>
+                <w:rFonts w:ascii="Times New Roman" w:hAnsi="Times New Roman"/>
+                <w:b w:val="0"/>
+                <w:color w:val="000000"/>
+                <w:sz w:val="24"/>
+              </w:rPr>
+              <w:t>Unpromoted E102 successor</w:t>
+            </w:r>
+          </w:p>
+        </w:tc>
+        <w:tc>
+          <w:tcPr>
+            <w:tcW w:type="dxa" w:w="5501"/>
+            <w:vAlign w:val="center"/>
+            <w:tcBorders>
+              <w:top w:val="single" w:sz="4" w:color="D9D9D9"/>
+              <w:left w:val="single" w:sz="4" w:color="D9D9D9"/>
+              <w:bottom w:val="single" w:sz="4" w:color="D9D9D9"/>
+              <w:right w:val="single" w:sz="4" w:color="D9D9D9"/>
+            </w:tcBorders>
+          </w:tcPr>
+          <w:p>
+            <w:pPr>
+              <w:keepNext/>
+              <w:spacing w:line="480" w:lineRule="auto" w:before="0" w:after="0"/>
+              <w:jc w:val="both"/>
+            </w:pPr>
+            <w:r>
+              <w:rPr>
+                <w:rFonts w:ascii="Times New Roman" w:hAnsi="Times New Roman"/>
+                <w:b w:val="0"/>
+                <w:color w:val="000000"/>
+                <w:sz w:val="24"/>
+              </w:rPr>
+              <w:t>evidence/e102_development.json</w:t>
             </w:r>
           </w:p>
         </w:tc>

</xml_diff>

<commit_message>
docs: incorporate student internship details and refresh submission files
</commit_message>
<xml_diff>
--- a/rapor/final_2026/deliverables/CS395_FinalReport_EfeHan_Keles_25September2026.docx
+++ b/rapor/final_2026/deliverables/CS395_FinalReport_EfeHan_Keles_25September2026.docx
@@ -98,7 +98,7 @@
           <w:color w:val="000000"/>
           <w:sz w:val="24"/>
         </w:rPr>
-        <w:t>Student ID: [TO COMPLETE]</w:t>
+        <w:t>Student ID: 31994</w:t>
       </w:r>
     </w:p>
     <w:p>
@@ -1104,7 +1104,7 @@
           <w:color w:val="000000"/>
           <w:sz w:val="24"/>
         </w:rPr>
-        <w:t>The host organization is Türk Telekomünikasyon A.Ş. Its registered office is Turgut Özal Bulvarı, 06103 Aydınlıkevler, Ankara. The corporate website is https://www.turktelekom.com.tr. The internship contact supplied in the approved record is +90 312 555 93 92. The actual internship office address remains [TO COMPLETE: internship office], which must not be confused with the registered headquarters (Türk Telekom, 2026a).</w:t>
+        <w:t>The host organization is Türk Telekomünikasyon A.Ş. Its registered office is Turgut Özal Bulvarı, 06103 Aydınlıkevler, Ankara (Türk Telekom, 2026a). I completed my internship at Fatih Sultan Mehmet Mah., Balkan Cad. No:49, 34771 Ümraniye, İstanbul. This is the internship office, distinct from the registered headquarters. The corporate website is https://www.turktelekom.com.tr. The internship contact supplied in the approved record is +90 312 555 93 92.</w:t>
       </w:r>
     </w:p>
     <w:p>
@@ -1146,7 +1146,7 @@
           <w:color w:val="000000"/>
           <w:sz w:val="24"/>
         </w:rPr>
-        <w:t>The company operates in the telecommunications market, with competition across mobile and fixed connectivity. A host-confirmed account of the main competitors and major suppliers relevant to the internship unit remains [TO COMPLETE: relevant competitors and suppliers]. No supplier ranking or customer account has been inferred from the project. PixelProof used research datasets and public pretrained components, not customer telecommunications records.</w:t>
+        <w:t>The company operates in the telecommunications market, with competition across mobile and fixed connectivity. Competitors and suppliers were mentioned during my internship, but we did not discuss them in detail. The main competitors and major suppliers relevant to the unit remain [TO COMPLETE: confirmed competitor and supplier names]. I have not inferred a supplier ranking from these brief discussions. PixelProof used research datasets and public pretrained components, not customer telecommunications records.</w:t>
       </w:r>
     </w:p>
     <w:p>
@@ -1175,7 +1175,7 @@
           <w:color w:val="000000"/>
           <w:sz w:val="24"/>
         </w:rPr>
-        <w:t>Figure 1 summarizes the corporate reporting structure published in the 2025 Annual Report. It retains the distinction between functions reporting to the general manager and internal audit reporting to the board. Functional descriptions are summarized from the published department titles. The diagram is corporate context and does not assign my internship to an unconfirmed unit (Türk Telekom, 2026a, p. 33).</w:t>
+        <w:t>Figure 1 summarizes the corporate reporting structure published in the 2025 Annual Report. It retains the distinction between functions reporting to the general manager and internal audit reporting to the board. Functional descriptions are summarized from the published department titles. The diagram provides corporate context; the reporting line of my host unit still requires confirmation (Türk Telekom, 2026a, p. 33).</w:t>
       </w:r>
     </w:p>
     <w:p>
@@ -1253,7 +1253,7 @@
           <w:color w:val="000000"/>
           <w:sz w:val="24"/>
         </w:rPr>
-        <w:t>Network and IT cover communications infrastructure and information systems. Commercial functions include customer experience, consumer sales, corporate sales and wholesale services. Support functions include finance, people operations, procurement, legal compliance and risk. Regional directorates coordinate local operations. The specific host unit and its place in this structure remain [TO COMPLETE: department and reporting line].</w:t>
+        <w:t>Network and IT cover communications infrastructure and information systems. Commercial functions include customer experience, consumer sales, corporate sales and wholesale services. Support functions include finance, people operations, procurement, legal compliance and risk. Regional directorates coordinate local operations. My host unit was Planlama ve Geliştirme Müdürlüğü (Planning and Development Directorate). Its formal reporting line remains [TO COMPLETE: department reporting line].</w:t>
       </w:r>
     </w:p>
     <w:p>
@@ -1298,7 +1298,7 @@
           <w:color w:val="000000"/>
           <w:sz w:val="24"/>
         </w:rPr>
-        <w:t>The approved company supervisor is Önder Çelebi. The supplied contact is onder.celebi@turktelekom.com.tr. His title is [TO COMPLETE: supervisor title]. The department is [TO COMPLETE: department name and responsibilities]. Other close collaborators, their titles and work email addresses are [TO COMPLETE: collaborators, or confirm none]. These fields have deliberately been left open pending confirmation.</w:t>
+        <w:t>My host unit was Planlama ve Geliştirme Müdürlüğü (Planning and Development Directorate). Its specific responsibilities remain [TO COMPLETE: department responsibilities]. My supervisor was Önder Çelebi, whose supplied contact is onder.celebi@turktelekom.com.tr. His title remains [TO COMPLETE: supervisor title]. I also consulted mentors, whose names, titles and work email addresses remain [TO COMPLETE: mentor details]. These consultations supported an individually conducted project.</w:t>
       </w:r>
     </w:p>
     <w:p>
@@ -1613,7 +1613,7 @@
           <w:color w:val="000000"/>
           <w:sz w:val="24"/>
         </w:rPr>
-        <w:t>The project work included dataset acquisition and admission records, label mapping, duplicate and ancestry checks, model experiments, API and interface development, and maintenance of PLAN.md, HISTORY.md, ml/EXPERIMENTS.md and DATASETS.md. Responsibilities of other people remain [TO COMPLETE: confirmed team roles]. Public pretrained encoders and external datasets are acknowledged separately from the project-owned adaptation and application code.</w:t>
+        <w:t>I carried out the project individually. I consulted my supervisor and mentors when I needed guidance, but generally made the project decisions myself. They explained evaluation concepts such as true positives and false negatives. Their role was advisory rather than shared implementation. My work covered dataset acquisition and admission records, label mapping, duplicate and ancestry checks, model experiments, API and interface development, and maintenance of PLAN.md, HISTORY.md, ml/EXPERIMENTS.md and DATASETS.md. Public pretrained encoders and external datasets are acknowledged separately from the project-owned adaptation and application code.</w:t>
       </w:r>
     </w:p>
     <w:p>
@@ -4490,7 +4490,7 @@
           <w:color w:val="000000"/>
           <w:sz w:val="24"/>
         </w:rPr>
-        <w:t>The work also provided practice in reading research papers critically, separating a method from its published performance claim, and maintaining reproducible records. Cached features made repeated analysis possible within local hardware limits. User-facing uncertainty required careful wording because a raw score can easily be misunderstood as confidence. [TO COMPLETE: personal learning reflection and whether this experience changed career plans.]</w:t>
+        <w:t>I learned how to sustain a long project on my own and reduce its scope when the work became too complex. Asking focused questions helped me communicate problems and use advice while remaining responsible for my decisions. Running my own experiments made machine learning concepts more concrete. I was already interested in this field before the internship; applying it in a substantial project strengthened that interest and gave me a clearer understanding of the work involved.</w:t>
       </w:r>
     </w:p>
     <w:p>
@@ -4519,7 +4519,7 @@
           <w:color w:val="000000"/>
           <w:sz w:val="24"/>
         </w:rPr>
-        <w:t>Three undergraduate foundations connect directly to the technical work. Probability and statistics support conditional error rates, sample dependence and interpretation of uncertainty. Linear algebra and optimization support feature vectors, projections, principal components and fitted classification heads. Software engineering supports modular interfaces, tests, version control and reproducible builds. These connections explain the methods used without claiming that a particular course covered every advanced technique.</w:t>
+        <w:t>CS412 Machine Learning gave me the concepts I used to start this project and develop the initial experiments. PROJ201 had introduced me to applied machine learning through a team project for an application intended to guide visually impaired users. We trained YOLOv11 on a custom dataset and integrated it into the application; our team placed first in our group. That experience gave me an initial understanding of model training and application integration. DSA210 provided my early foundations in data science, which helped me approach the data preparation and analysis in this internship.</w:t>
       </w:r>
     </w:p>
     <w:p>
@@ -4533,7 +4533,7 @@
           <w:color w:val="000000"/>
           <w:sz w:val="24"/>
         </w:rPr>
-        <w:t>More preparation in experimental design and data provenance would have been particularly useful. A dataset can contain valid files but inconsistent meanings, and a test can contain different files while still sharing scenes or generation ancestry. [TO COMPLETE: confirm the three course connections and personal preparation needs against actual coursework.]</w:t>
+        <w:t>The internship exposed preparation needs beyond the initial model fit. Experimental design and data provenance required particular attention: valid image files could still have inconsistent labels, and different files could share scenes or generation ancestry. These issues became clearer through the project’s failed experiments and corrections.</w:t>
       </w:r>
     </w:p>
     <w:p>
@@ -4619,7 +4619,7 @@
           <w:color w:val="000000"/>
           <w:sz w:val="24"/>
         </w:rPr>
-        <w:t>The approved schedule was Monday through Thursday on site and Friday remote. The documented work cycle was to review the plan, audit or implement a change, run a bounded experiment, interpret results and update the records.</w:t>
+        <w:t>The approved schedule was Monday through Thursday on site and Friday remote. On office days, I usually arrived at 7:30 a.m. After breakfast, I worked through the morning until around noon or early afternoon. I continued working afterwards, with occasional short tea or coffee breaks.</w:t>
       </w:r>
     </w:p>
     <w:p>
@@ -4633,7 +4633,7 @@
           <w:color w:val="000000"/>
           <w:sz w:val="24"/>
         </w:rPr>
-        <w:t>[TO COMPLETE: add a personally verified account of a typical on-site day and team communication. The repository establishes the technical workflow, not actual meetings or attendance hours.]</w:t>
+        <w:t>My tasks followed the stage of the project: reviewing the plan, implementing a change, running experiments, interpreting results and updating the records. When a question arose, I consulted my supervisor or mentors for clarification and then decided how to proceed. This routine helped me maintain progress during a long individual project.</w:t>
       </w:r>
     </w:p>
     <w:p>

</xml_diff>

<commit_message>
docs: confirm supervisor title and defer submission dates
</commit_message>
<xml_diff>
--- a/rapor/final_2026/deliverables/CS395_FinalReport_EfeHan_Keles_25September2026.docx
+++ b/rapor/final_2026/deliverables/CS395_FinalReport_EfeHan_Keles_25September2026.docx
@@ -140,7 +140,7 @@
           <w:color w:val="000000"/>
           <w:sz w:val="24"/>
         </w:rPr>
-        <w:t>Supervisor title: [TO COMPLETE]</w:t>
+        <w:t>Supervisor title: Director</w:t>
       </w:r>
     </w:p>
     <w:p>
@@ -196,7 +196,7 @@
           <w:color w:val="000000"/>
           <w:sz w:val="24"/>
         </w:rPr>
-        <w:t>Submission date: 25 September 2026</w:t>
+        <w:t>Submission date: [TO COMPLETE]</w:t>
       </w:r>
     </w:p>
     <w:p>
@@ -1298,7 +1298,7 @@
           <w:color w:val="000000"/>
           <w:sz w:val="24"/>
         </w:rPr>
-        <w:t>My host unit was Planlama ve Geliştirme Müdürlüğü (Planning and Development Directorate). Its specific responsibilities remain [TO COMPLETE: department responsibilities]. My supervisor was Önder Çelebi, whose supplied contact is onder.celebi@turktelekom.com.tr. His title remains [TO COMPLETE: supervisor title]. I also consulted mentors, whose names, titles and work email addresses remain [TO COMPLETE: mentor details]. These consultations supported an individually conducted project.</w:t>
+        <w:t>My host unit was Planlama ve Geliştirme Müdürlüğü (Planning and Development Directorate). Its specific responsibilities remain [TO COMPLETE: department responsibilities]. My supervisor was Önder Çelebi, whose supplied contact is onder.celebi@turktelekom.com.tr. He is the Director of this unit. I also consulted mentors, whose names, titles and work email addresses remain [TO COMPLETE: mentor details]. These consultations supported an individually conducted project.</w:t>
       </w:r>
     </w:p>
     <w:p>

</xml_diff>

<commit_message>
Clarify report evidence and refresh internship submission package
</commit_message>
<xml_diff>
--- a/rapor/final_2026/deliverables/CS395_FinalReport_EfeHan_Keles_25September2026.docx
+++ b/rapor/final_2026/deliverables/CS395_FinalReport_EfeHan_Keles_25September2026.docx
@@ -1045,7 +1045,7 @@
           <w:color w:val="000000"/>
           <w:sz w:val="24"/>
         </w:rPr>
-        <w:t>The main achievement is a functioning research system with measurable development improvements, a usable local interface and an evaluation process that also records failures. The current local demonstration uses E92. Its success is qualified: it satisfies 20 numerical checks on reused development observations, but fails a separate rule that protects previously detected AI examples. Independent universal reliability remains unproven.</w:t>
+        <w:t>The main achievement is a functioning research system with measurable development improvements, a usable local interface and an evaluation process that also records failures. The current local demonstration uses E92. It passes 20 numerical checks on reused development images, but newly misses one AI image caught by the reference model. That new miss breaks a separate acceptance rule. Independent universal reliability remains unproven.</w:t>
       </w:r>
     </w:p>
     <w:p>
@@ -3273,7 +3273,7 @@
           <w:color w:val="000000"/>
           <w:sz w:val="24"/>
         </w:rPr>
-        <w:t>The final interface rule was also checked on the same 320 development images. Of 160 real images, 139 received no clear AI evidence and 21 remained uncertain; none received an AI alert. Of 160 AI images, 159 received an AI alert and one remained uncertain. These counts combine two views into one user result. They differ from the separate-view rates reported earlier, and they do not predict the outcome of every future upload (Keleş, 2026, current-policy audit).</w:t>
+        <w:t>The final interface rule was also checked on the same 320 development images. Of 160 real images, 139 received no clear AI evidence and 21 remained uncertain; none received an AI alert. Of 160 AI images, 159 received an AI alert and one remained uncertain. These counts combine two views into one user result. Thus 14 processed-view false alerts do not mean 14 final AI warnings: a low original score can instead leave the result uncertain. These development counts cannot predict every future upload (Keleş, 2026, current-policy audit).</w:t>
       </w:r>
     </w:p>
     <w:p>
@@ -5088,7 +5088,7 @@
           <w:color w:val="000000"/>
           <w:sz w:val="24"/>
         </w:rPr>
-        <w:t>Table 5 lists the ten inherited numerical criteria, applied separately to original and social-style views. They are project-defined requirements, not an external certification standard. Automatic coverage and uncertainty are complementary, and several other metrics are correlated. The extra zero-new-reference-AI-miss requirement remains separate and failed for E92.</w:t>
+        <w:t>Table 5 lists the ten inherited numerical criteria, applied separately to original and social-style views. They are project-defined requirements, not an external certification standard. Automatic coverage and uncertainty are complementary, and several other metrics are correlated. The separate rule against newly missing any reference-detected AI image failed for E92. Coverage and uncertainty here describe each view separately; they are not the paired website outcomes in Section 4.5.6.</w:t>
       </w:r>
     </w:p>
     <w:p>

</xml_diff>

<commit_message>
docs: clarify historical decisions and training evidence in internship package
</commit_message>
<xml_diff>
--- a/rapor/final_2026/deliverables/CS395_FinalReport_EfeHan_Keles_25September2026.docx
+++ b/rapor/final_2026/deliverables/CS395_FinalReport_EfeHan_Keles_25September2026.docx
@@ -235,7 +235,7 @@
           <w:color w:val="000000"/>
           <w:sz w:val="24"/>
         </w:rPr>
-        <w:t>Türk Telekom provides telecommunications and digital services across Türkiye. During my CS395 internship, I developed PixelProof as a research prototype for examining whether an image contains evidence of AI generation. A second, experimental module investigated where a local AI edit might occur. The work combined dataset auditing, machine learning experiments and a local web demonstration. Early models performed well on familiar data but failed on different image sources. Subsequent work therefore emphasized correct labels, separated data roles, processing robustness and reproducible evaluation. The E92 model detected 159 of 160 AI images in each of two conditions on a repeatedly used development set. False alerts on 160 real images decreased from 68 to zero for original inputs and from 68 to 14 after a fixed resizing and JPEG transformation, compared with the E43 reference. E92 met all 20 numerical development criteria but still missed one original AI image previously detected by E43, so it failed the complete acceptance contract. Later source-separated diagnostics and localization experiments exposed additional limitations. The completed deliverables include trained research artifacts, a guarded web demo, experiment and dataset records, and automated software checks. The project demonstrates a working, traceable prototype and substantial improvement on a defined development collection. It does not establish universal detection or production readiness. Future work should prioritize genuinely independent sources, calibration separated from evaluation and broader localization tests before stronger claims.</w:t>
+        <w:t>Türk Telekom provides telecommunications and digital services across Türkiye. During my CS395 internship, I developed PixelProof to investigate AI-generated image detection while reducing false alerts on real photographs. A second experimental module explored locating AI-edited regions. Development followed an iterative process: inspect errors, define the next experiment, measure the result and record the decision. Dataset records tracked acquisition and permitted use, while experiment and history logs retained both improvements and failed approaches. Early transfer failures and label errors shifted the focus toward data quality and reliable evaluation. E92's learned components used 12,269 training images represented under four processing conditions, producing 49,076 training views. A separate but repeatedly used development collection contained 160 real and 160 AI images. E92 detected 159 AI images in each of two evaluation conditions. Compared with E43, false alerts fell from 68 to zero on real originals and from 68 to 14 after resizing and JPEG compression. All 20 numerical checks passed, but one newly missed reference-detected AI image prevented full acceptance. The deliverables include trained research components, a local web demonstration and reproducible records. Model2 remains experimental. The project demonstrates improvement on a defined development collection, rather than universal detection or production readiness. Further work should use independent, diverse evaluation sources, keep calibration separate from evaluation and test localization with more editors.</w:t>
       </w:r>
     </w:p>
     <w:p>
@@ -669,7 +669,7 @@
         </w:rPr>
         <w:t>4.5.5 Development improvement and acceptance limits</w:t>
         <w:tab/>
-        <w:t>17</w:t>
+        <w:t>18</w:t>
       </w:r>
     </w:p>
     <w:p>
@@ -1642,7 +1642,7 @@
           <w:color w:val="000000"/>
           <w:sz w:val="24"/>
         </w:rPr>
-        <w:t>The workflow became more disciplined as problems emerged. Before a later experiment, the plan stated the question, data and acceptance rules. After the run, the experiment log recorded results and failures, and the history explained the decision. The dataset register recorded what was acquired and why it could be used. For example, correcting reversed labels required rerunning affected experiments and withdrawing an earlier conclusion. These records show how a result changed the next step; they are not simply a collection of successful scores.</w:t>
+        <w:t>The workflow became more disciplined as problems emerged. In later experiments, PLAN.md stated the question, allowed data and acceptance rules before a run. The experiment log recorded the settings and measurements, including failures. HISTORY.md explained what those results changed, while DATASETS.md recorded acquisition, source checks and permitted use. Earlier entries were retained when a later audit corrected them. This made it possible to trace an idea from its original motivation through its test to the decision that followed.</w:t>
       </w:r>
     </w:p>
     <w:p>
@@ -1670,7 +1670,7 @@
           <w:color w:val="000000"/>
           <w:sz w:val="24"/>
         </w:rPr>
-        <w:t>Python, PyTorch, NumPy, SciPy and scikit-learn supported modelling and analysis. The local interface used React and TypeScript with a FastAPI inference service. Git preserved implementation history, while automated Python and web checks supported reproducibility. Model artifacts and important input records were bound to cryptographic hashes. Table 1 distinguishes these components by purpose.</w:t>
+        <w:t>Python, PyTorch, NumPy, SciPy and scikit-learn supported modelling and analysis. React and TypeScript provided the interface, with FastAPI serving inference. Git preserved changes and automated checks tested the software. Saved models and key inputs were identified by file hashes so that later comparisons could use the intended versions. Table 1 gives representative decisions recorded during this workflow (Keleş, 2026).</w:t>
       </w:r>
     </w:p>
     <w:p>
@@ -1687,7 +1687,7 @@
           <w:color w:val="000000"/>
           <w:sz w:val="24"/>
         </w:rPr>
-        <w:t>Table 1. Main tools and their roles in the project.</w:t>
+        <w:t>Table 1. How recorded findings changed development.</w:t>
       </w:r>
     </w:p>
     <w:tbl>
@@ -1698,8 +1698,8 @@
         <w:tblLook w:firstColumn="1" w:firstRow="1" w:lastColumn="0" w:lastRow="0" w:noHBand="0" w:noVBand="1" w:val="04A0"/>
       </w:tblPr>
       <w:tblGrid>
-        <w:gridCol w:w="3024"/>
-        <w:gridCol w:w="6005"/>
+        <w:gridCol w:w="4176"/>
+        <w:gridCol w:w="4853"/>
       </w:tblGrid>
       <w:tr>
         <w:trPr>
@@ -1708,7 +1708,7 @@
         </w:trPr>
         <w:tc>
           <w:tcPr>
-            <w:tcW w:type="dxa" w:w="3024"/>
+            <w:tcW w:type="dxa" w:w="4176"/>
             <w:vAlign w:val="center"/>
             <w:tcBorders>
               <w:top w:val="single" w:sz="4" w:color="D9D9D9"/>
@@ -1731,13 +1731,13 @@
                 <w:color w:val="000000"/>
                 <w:sz w:val="24"/>
               </w:rPr>
-              <w:t>Component</w:t>
+              <w:t>Finding</w:t>
             </w:r>
           </w:p>
         </w:tc>
         <w:tc>
           <w:tcPr>
-            <w:tcW w:type="dxa" w:w="6005"/>
+            <w:tcW w:type="dxa" w:w="4853"/>
             <w:vAlign w:val="center"/>
             <w:tcBorders>
               <w:top w:val="single" w:sz="4" w:color="D9D9D9"/>
@@ -1760,7 +1760,7 @@
                 <w:color w:val="000000"/>
                 <w:sz w:val="24"/>
               </w:rPr>
-              <w:t>Purpose</w:t>
+              <w:t>Recorded response</w:t>
             </w:r>
           </w:p>
         </w:tc>
@@ -1771,7 +1771,7 @@
         </w:trPr>
         <w:tc>
           <w:tcPr>
-            <w:tcW w:type="dxa" w:w="3024"/>
+            <w:tcW w:type="dxa" w:w="4176"/>
             <w:vAlign w:val="center"/>
             <w:tcBorders>
               <w:top w:val="single" w:sz="4" w:color="D9D9D9"/>
@@ -1793,13 +1793,13 @@
                 <w:color w:val="000000"/>
                 <w:sz w:val="24"/>
               </w:rPr>
-              <w:t>PyTorch and pretrained encoders</w:t>
+              <w:t>Weak transfer to new image sources</w:t>
             </w:r>
           </w:p>
         </w:tc>
         <w:tc>
           <w:tcPr>
-            <w:tcW w:type="dxa" w:w="6005"/>
+            <w:tcW w:type="dxa" w:w="4853"/>
             <w:vAlign w:val="center"/>
             <w:tcBorders>
               <w:top w:val="single" w:sz="4" w:color="D9D9D9"/>
@@ -1821,7 +1821,7 @@
                 <w:color w:val="000000"/>
                 <w:sz w:val="24"/>
               </w:rPr>
-              <w:t>Visual features and learned adaptation</w:t>
+              <w:t>Compare sources and processing conditions</w:t>
             </w:r>
           </w:p>
         </w:tc>
@@ -1832,7 +1832,7 @@
         </w:trPr>
         <w:tc>
           <w:tcPr>
-            <w:tcW w:type="dxa" w:w="3024"/>
+            <w:tcW w:type="dxa" w:w="4176"/>
             <w:vAlign w:val="center"/>
             <w:tcBorders>
               <w:top w:val="single" w:sz="4" w:color="D9D9D9"/>
@@ -1854,13 +1854,13 @@
                 <w:color w:val="000000"/>
                 <w:sz w:val="24"/>
               </w:rPr>
-              <w:t>NumPy, SciPy and scikit-learn</w:t>
+              <w:t>Reversed source labels in E19b</w:t>
             </w:r>
           </w:p>
         </w:tc>
         <w:tc>
           <w:tcPr>
-            <w:tcW w:type="dxa" w:w="6005"/>
+            <w:tcW w:type="dxa" w:w="4853"/>
             <w:vAlign w:val="center"/>
             <w:tcBorders>
               <w:top w:val="single" w:sz="4" w:color="D9D9D9"/>
@@ -1882,7 +1882,7 @@
                 <w:color w:val="000000"/>
                 <w:sz w:val="24"/>
               </w:rPr>
-              <w:t>Feature transforms, optimization and metrics</w:t>
+              <w:t>Remap labels and rerun affected experiments</w:t>
             </w:r>
           </w:p>
         </w:tc>
@@ -1893,7 +1893,7 @@
         </w:trPr>
         <w:tc>
           <w:tcPr>
-            <w:tcW w:type="dxa" w:w="3024"/>
+            <w:tcW w:type="dxa" w:w="4176"/>
             <w:vAlign w:val="center"/>
             <w:tcBorders>
               <w:top w:val="single" w:sz="4" w:color="D9D9D9"/>
@@ -1915,13 +1915,13 @@
                 <w:color w:val="000000"/>
                 <w:sz w:val="24"/>
               </w:rPr>
-              <w:t>FastAPI</w:t>
+              <w:t>Evaluation used in E27 threshold selection</w:t>
             </w:r>
           </w:p>
         </w:tc>
         <w:tc>
           <w:tcPr>
-            <w:tcW w:type="dxa" w:w="6005"/>
+            <w:tcW w:type="dxa" w:w="4853"/>
             <w:vAlign w:val="center"/>
             <w:tcBorders>
               <w:top w:val="single" w:sz="4" w:color="D9D9D9"/>
@@ -1943,7 +1943,7 @@
                 <w:color w:val="000000"/>
                 <w:sz w:val="24"/>
               </w:rPr>
-              <w:t>Validated local inference requests</w:t>
+              <w:t>Recompute using calibration data only</w:t>
             </w:r>
           </w:p>
         </w:tc>
@@ -1954,7 +1954,7 @@
         </w:trPr>
         <w:tc>
           <w:tcPr>
-            <w:tcW w:type="dxa" w:w="3024"/>
+            <w:tcW w:type="dxa" w:w="4176"/>
             <w:vAlign w:val="center"/>
             <w:tcBorders>
               <w:top w:val="single" w:sz="4" w:color="D9D9D9"/>
@@ -1976,13 +1976,13 @@
                 <w:color w:val="000000"/>
                 <w:sz w:val="24"/>
               </w:rPr>
-              <w:t>React and TypeScript</w:t>
+              <w:t>E92 reduced false alerts but added an AI miss</w:t>
             </w:r>
           </w:p>
         </w:tc>
         <w:tc>
           <w:tcPr>
-            <w:tcW w:type="dxa" w:w="6005"/>
+            <w:tcW w:type="dxa" w:w="4853"/>
             <w:vAlign w:val="center"/>
             <w:tcBorders>
               <w:top w:val="single" w:sz="4" w:color="D9D9D9"/>
@@ -2004,7 +2004,7 @@
                 <w:color w:val="000000"/>
                 <w:sz w:val="24"/>
               </w:rPr>
-              <w:t>Uploads and understandable result display</w:t>
+              <w:t>Retain the failed acceptance result</w:t>
             </w:r>
           </w:p>
         </w:tc>
@@ -2015,7 +2015,7 @@
         </w:trPr>
         <w:tc>
           <w:tcPr>
-            <w:tcW w:type="dxa" w:w="3024"/>
+            <w:tcW w:type="dxa" w:w="4176"/>
             <w:vAlign w:val="center"/>
             <w:tcBorders>
               <w:top w:val="single" w:sz="4" w:color="D9D9D9"/>
@@ -2037,13 +2037,13 @@
                 <w:color w:val="000000"/>
                 <w:sz w:val="24"/>
               </w:rPr>
-              <w:t>Git and GitHub Actions</w:t>
+              <w:t>E151 features harmed processed-image detection</w:t>
             </w:r>
           </w:p>
         </w:tc>
         <w:tc>
           <w:tcPr>
-            <w:tcW w:type="dxa" w:w="6005"/>
+            <w:tcW w:type="dxa" w:w="4853"/>
             <w:vAlign w:val="center"/>
             <w:tcBorders>
               <w:top w:val="single" w:sz="4" w:color="D9D9D9"/>
@@ -2065,7 +2065,7 @@
                 <w:color w:val="000000"/>
                 <w:sz w:val="24"/>
               </w:rPr>
-              <w:t>Version history and automated checks</w:t>
+              <w:t>Reject the candidate and investigate its errors</w:t>
             </w:r>
           </w:p>
         </w:tc>
@@ -2141,7 +2141,7 @@
           <w:color w:val="000000"/>
           <w:sz w:val="24"/>
         </w:rPr>
-        <w:t>The first phase compared a small CNN, classifiers on frozen embeddings and a pretrained ResNet-18. On the familiar CIFAKE test, the ResNet result improved to 97.66%, yet its accuracy on the 995-image external collection fell to 25.2%. A control that reproduced the training resolution bottleneck recovered much of the loss. This showed that a stronger architecture could still fail when image preparation changed (Keleş, 2026, E1–E6).</w:t>
+        <w:t>The first phase compared a small CNN, classifiers on frozen embeddings and a pretrained ResNet-18. The CNN used 90,000 CIFAKE training images and 10,000 validation images; its familiar test contained 20,000 images. ResNet improved familiar-test accuracy to 97.66%, yet accuracy on the separate 995-image collection fell to 25.2%. Reproducing the training resolution bottleneck recovered much of that loss. These comparisons showed why a larger familiar dataset and a stronger architecture did not establish reliable transfer (Keleş, 2026, E1–E6).</w:t>
       </w:r>
     </w:p>
     <w:p>
@@ -2155,7 +2155,7 @@
           <w:color w:val="000000"/>
           <w:sz w:val="24"/>
         </w:rPr>
-        <w:t>Later experiments used native-resolution data, image statistics and tile-based features. The goal was to retain fine detail without allowing dimensions or processing history to dominate the decision. Some specialist methods helped particular sources but harmed others. Simple averaging of model scores did not supply a consistently better detector. These comparisons redirected the work toward source coverage and evaluation design rather than selecting the most impressive isolated score.</w:t>
+        <w:t>Native-resolution data, image statistics and tile features were then tested to retain fine detail. Some methods helped particular sources but harmed others. Averaging their scores did not consistently improve detection, so attention shifted toward source coverage and evaluation design.</w:t>
       </w:r>
     </w:p>
     <w:p>
@@ -2169,7 +2169,7 @@
           <w:color w:val="000000"/>
           <w:sz w:val="24"/>
         </w:rPr>
-        <w:t>The early conclusions also required correction. Fixed-size crops do not automatically make a biased dataset safe, and a plausible physical explanation does not prove what a learned model uses. Later notes explicitly qualified the original camera-noise and preprocessing assumptions. The report follows those corrections rather than repeating the strongest early wording.</w:t>
+        <w:t>Later audits qualified the early explanations. Fixed-size crops do not remove every dataset shortcut, and plausible camera-noise arguments do not establish what a model learned. These were hypotheses to test, not universal rules.</w:t>
       </w:r>
     </w:p>
     <w:p>
@@ -2183,7 +2183,7 @@
           <w:color w:val="000000"/>
           <w:sz w:val="24"/>
         </w:rPr>
-        <w:t>The next phase compared the project-trained E20 tile model with frozen Community-Forensics and B-Free detectors. External representations improved some results, but each still produced severe false alerts on particular real-image sources. The E26 comparison used a union of source-calibrated alerts, while later modern-generator probes exposed remaining blind spots. E31 and E32 then showed that strong internal results could collapse on new real-image sources. These stages explain why the project continued beyond its first working demo (Keleş, 2026, E20–E32).</w:t>
+        <w:t>The E20 tile model was compared with frozen Community-Forensics and B-Free detectors. Each still falsely flagged particular real-image sources. E26 combined source-calibrated alerts, but modern-generator probes found blind spots. E31 and E32 also lost performance on new real sources, showing why the first working demo required further research (Keleş, 2026, E20–E32).</w:t>
       </w:r>
     </w:p>
     <w:p>
@@ -2197,7 +2197,7 @@
           <w:color w:val="000000"/>
           <w:sz w:val="24"/>
         </w:rPr>
-        <w:t>Threshold changes and more balanced training sources did not consistently solve transfer failures. E42 still failed a larger RR evaluation covering 16,953 original images and 50,858 linked versions. Its successor, E43, improved on familiar RR data but struggled with reconstructed images. Combining specialist detectors then exposed two opposing problems: false alerts on real photographs and missed GAN-generated images. The next phase therefore aimed to correct real-photo errors while retaining AI detections already made by the reference (Keleş, 2026, E33–E50).</w:t>
+        <w:t>Threshold changes and balanced sources did not consistently solve transfer. E42 failed an RR evaluation of 16,953 images and 50,858 linked views. E43 improved familiar RR results but struggled with reconstructed images. Specialist combinations also missed GAN images or raised real-photo errors. Later correction models therefore had to reduce false alerts while protecting previously detected AI examples (Keleş, 2026, E33–E50).</w:t>
       </w:r>
     </w:p>
     <w:p>
@@ -2240,7 +2240,7 @@
           <w:color w:val="000000"/>
           <w:sz w:val="24"/>
         </w:rPr>
-        <w:t>One consequence was especially instructive: a DINOv2 result previously interpreted as near chance on Defactify changed from AUC 0.480 to 0.764 after label correction. The original explanation for failure was therefore withdrawn. This was a data-semantics error, not an architectural discovery. The record preserves the mistake and the correction so later conclusions do not silently inherit invalid evidence.</w:t>
+        <w:t>The corrected labels changed which methods were worth pursuing. DINOv2 had scored AUC 0.480 on Defactify, leading to an explanation that its features were unsuitable. After correction, AUC rose to 0.764 and that explanation was withdrawn. The claim that a larger training pool brought little benefit also needed revision: it reduced false alerts more than first reported, although performance still varied by source. The correction changed both the measurements and the next research direction (Keleş, 2026, E19c).</w:t>
       </w:r>
     </w:p>
     <w:p>
@@ -2283,7 +2283,7 @@
           <w:color w:val="000000"/>
           <w:sz w:val="24"/>
         </w:rPr>
-        <w:t>The dataset register recorded each source, its licence, intended use and integrity checks. Downloading a collection did not make it training data. The audit checked identical files, similar images and known shared scenes or prompts. Where the original source could not be established, the report keeps that uncertainty. A parent image means the original observation before this project creates resized or compressed versions of it.</w:t>
+        <w:t>The dataset register recorded each source, its licence, intended use and integrity checks. Acquired archives, selected training images and evaluation images were distinct populations. Download size therefore did not measure how many examples trained E92 or how reliable it was. The audit checked identical files, similar images and known shared scenes or prompts. Where origins remained unknown, that uncertainty was retained. A parent image means an original observation before this project creates resized or compressed versions of it.</w:t>
       </w:r>
     </w:p>
     <w:p>
@@ -2297,7 +2297,7 @@
           <w:color w:val="000000"/>
           <w:sz w:val="24"/>
         </w:rPr>
-        <w:t>E92 used 12,269 training parent images, comprising 7,674 real and 4,595 AI examples. Four processing conditions produced 49,076 views. Later research expanded the real population to 7,930, giving 12,525 parents and 50,100 views. These later counts must not be attributed to the earlier E92 fit. Table 2 separates the main populations (Keleş, 2026, E92 and E139).</w:t>
+        <w:t>E92 used 12,269 training parent images: 7,674 real and 4,595 AI. Four processing conditions produced 49,076 views. Later research added real images, giving 12,525 parents and 50,100 views; these were not the earlier E92 training counts. Table 2 places the E92 comparison alongside larger earlier evaluations. Each row describes a different model or data role, and the rows must not be summed into one independent test (Keleş, 2026, E42, E49, E92 and E139).</w:t>
       </w:r>
     </w:p>
     <w:p>
@@ -2314,7 +2314,7 @@
           <w:color w:val="000000"/>
           <w:sz w:val="24"/>
         </w:rPr>
-        <w:t>Table 2. Distinct populations and their permissible interpretation.</w:t>
+        <w:t>Table 2. Training and evaluation populations at different project stages.</w:t>
       </w:r>
     </w:p>
     <w:tbl>
@@ -2325,10 +2325,10 @@
         <w:tblLook w:firstColumn="1" w:firstRow="1" w:lastColumn="0" w:lastRow="0" w:noHBand="0" w:noVBand="1" w:val="04A0"/>
       </w:tblPr>
       <w:tblGrid>
-        <w:gridCol w:w="3456"/>
+        <w:gridCol w:w="3096"/>
         <w:gridCol w:w="1152"/>
-        <w:gridCol w:w="1584"/>
-        <w:gridCol w:w="2837"/>
+        <w:gridCol w:w="1224"/>
+        <w:gridCol w:w="3557"/>
       </w:tblGrid>
       <w:tr>
         <w:trPr>
@@ -2337,7 +2337,7 @@
         </w:trPr>
         <w:tc>
           <w:tcPr>
-            <w:tcW w:type="dxa" w:w="3456"/>
+            <w:tcW w:type="dxa" w:w="3096"/>
             <w:vAlign w:val="center"/>
             <w:tcBorders>
               <w:top w:val="single" w:sz="4" w:color="D9D9D9"/>
@@ -2395,7 +2395,7 @@
         </w:tc>
         <w:tc>
           <w:tcPr>
-            <w:tcW w:type="dxa" w:w="1584"/>
+            <w:tcW w:type="dxa" w:w="1224"/>
             <w:vAlign w:val="center"/>
             <w:tcBorders>
               <w:top w:val="single" w:sz="4" w:color="D9D9D9"/>
@@ -2424,7 +2424,7 @@
         </w:tc>
         <w:tc>
           <w:tcPr>
-            <w:tcW w:type="dxa" w:w="2837"/>
+            <w:tcW w:type="dxa" w:w="3557"/>
             <w:vAlign w:val="center"/>
             <w:tcBorders>
               <w:top w:val="single" w:sz="4" w:color="D9D9D9"/>
@@ -2458,7 +2458,241 @@
         </w:trPr>
         <w:tc>
           <w:tcPr>
-            <w:tcW w:type="dxa" w:w="3456"/>
+            <w:tcW w:type="dxa" w:w="3096"/>
+            <w:vAlign w:val="center"/>
+            <w:tcBorders>
+              <w:top w:val="single" w:sz="4" w:color="D9D9D9"/>
+              <w:left w:val="single" w:sz="4" w:color="D9D9D9"/>
+              <w:bottom w:val="single" w:sz="4" w:color="D9D9D9"/>
+              <w:right w:val="single" w:sz="4" w:color="D9D9D9"/>
+            </w:tcBorders>
+          </w:tcPr>
+          <w:p>
+            <w:pPr>
+              <w:keepNext/>
+              <w:spacing w:line="480" w:lineRule="auto" w:before="0" w:after="0"/>
+              <w:jc w:val="both"/>
+            </w:pPr>
+            <w:r>
+              <w:rPr>
+                <w:rFonts w:ascii="Times New Roman" w:hAnsi="Times New Roman"/>
+                <w:b w:val="0"/>
+                <w:color w:val="000000"/>
+                <w:sz w:val="24"/>
+              </w:rPr>
+              <w:t>E42 RR evaluation</w:t>
+            </w:r>
+          </w:p>
+        </w:tc>
+        <w:tc>
+          <w:tcPr>
+            <w:tcW w:type="dxa" w:w="1152"/>
+            <w:vAlign w:val="center"/>
+            <w:tcBorders>
+              <w:top w:val="single" w:sz="4" w:color="D9D9D9"/>
+              <w:left w:val="single" w:sz="4" w:color="D9D9D9"/>
+              <w:bottom w:val="single" w:sz="4" w:color="D9D9D9"/>
+              <w:right w:val="single" w:sz="4" w:color="D9D9D9"/>
+            </w:tcBorders>
+          </w:tcPr>
+          <w:p>
+            <w:pPr>
+              <w:keepNext/>
+              <w:spacing w:line="480" w:lineRule="auto" w:before="0" w:after="0"/>
+              <w:jc w:val="both"/>
+            </w:pPr>
+            <w:r>
+              <w:rPr>
+                <w:rFonts w:ascii="Times New Roman" w:hAnsi="Times New Roman"/>
+                <w:b w:val="0"/>
+                <w:color w:val="000000"/>
+                <w:sz w:val="24"/>
+              </w:rPr>
+              <w:t>16,953</w:t>
+            </w:r>
+          </w:p>
+        </w:tc>
+        <w:tc>
+          <w:tcPr>
+            <w:tcW w:type="dxa" w:w="1224"/>
+            <w:vAlign w:val="center"/>
+            <w:tcBorders>
+              <w:top w:val="single" w:sz="4" w:color="D9D9D9"/>
+              <w:left w:val="single" w:sz="4" w:color="D9D9D9"/>
+              <w:bottom w:val="single" w:sz="4" w:color="D9D9D9"/>
+              <w:right w:val="single" w:sz="4" w:color="D9D9D9"/>
+            </w:tcBorders>
+          </w:tcPr>
+          <w:p>
+            <w:pPr>
+              <w:keepNext/>
+              <w:spacing w:line="480" w:lineRule="auto" w:before="0" w:after="0"/>
+              <w:jc w:val="both"/>
+            </w:pPr>
+            <w:r>
+              <w:rPr>
+                <w:rFonts w:ascii="Times New Roman" w:hAnsi="Times New Roman"/>
+                <w:b w:val="0"/>
+                <w:color w:val="000000"/>
+                <w:sz w:val="24"/>
+              </w:rPr>
+              <w:t>50,858</w:t>
+            </w:r>
+          </w:p>
+        </w:tc>
+        <w:tc>
+          <w:tcPr>
+            <w:tcW w:type="dxa" w:w="3557"/>
+            <w:vAlign w:val="center"/>
+            <w:tcBorders>
+              <w:top w:val="single" w:sz="4" w:color="D9D9D9"/>
+              <w:left w:val="single" w:sz="4" w:color="D9D9D9"/>
+              <w:bottom w:val="single" w:sz="4" w:color="D9D9D9"/>
+              <w:right w:val="single" w:sz="4" w:color="D9D9D9"/>
+            </w:tcBorders>
+          </w:tcPr>
+          <w:p>
+            <w:pPr>
+              <w:keepNext/>
+              <w:spacing w:line="480" w:lineRule="auto" w:before="0" w:after="0"/>
+              <w:jc w:val="both"/>
+            </w:pPr>
+            <w:r>
+              <w:rPr>
+                <w:rFonts w:ascii="Times New Roman" w:hAnsi="Times New Roman"/>
+                <w:b w:val="0"/>
+                <w:color w:val="000000"/>
+                <w:sz w:val="24"/>
+              </w:rPr>
+              <w:t>Earlier model; failed acceptance</w:t>
+            </w:r>
+          </w:p>
+        </w:tc>
+      </w:tr>
+      <w:tr>
+        <w:trPr>
+          <w:cantSplit/>
+        </w:trPr>
+        <w:tc>
+          <w:tcPr>
+            <w:tcW w:type="dxa" w:w="3096"/>
+            <w:vAlign w:val="center"/>
+            <w:tcBorders>
+              <w:top w:val="single" w:sz="4" w:color="D9D9D9"/>
+              <w:left w:val="single" w:sz="4" w:color="D9D9D9"/>
+              <w:bottom w:val="single" w:sz="4" w:color="D9D9D9"/>
+              <w:right w:val="single" w:sz="4" w:color="D9D9D9"/>
+            </w:tcBorders>
+          </w:tcPr>
+          <w:p>
+            <w:pPr>
+              <w:keepNext/>
+              <w:spacing w:line="480" w:lineRule="auto" w:before="0" w:after="0"/>
+              <w:jc w:val="both"/>
+            </w:pPr>
+            <w:r>
+              <w:rPr>
+                <w:rFonts w:ascii="Times New Roman" w:hAnsi="Times New Roman"/>
+                <w:b w:val="0"/>
+                <w:color w:val="000000"/>
+                <w:sz w:val="24"/>
+              </w:rPr>
+              <w:t>E43 on E49-C</w:t>
+            </w:r>
+          </w:p>
+        </w:tc>
+        <w:tc>
+          <w:tcPr>
+            <w:tcW w:type="dxa" w:w="1152"/>
+            <w:vAlign w:val="center"/>
+            <w:tcBorders>
+              <w:top w:val="single" w:sz="4" w:color="D9D9D9"/>
+              <w:left w:val="single" w:sz="4" w:color="D9D9D9"/>
+              <w:bottom w:val="single" w:sz="4" w:color="D9D9D9"/>
+              <w:right w:val="single" w:sz="4" w:color="D9D9D9"/>
+            </w:tcBorders>
+          </w:tcPr>
+          <w:p>
+            <w:pPr>
+              <w:keepNext/>
+              <w:spacing w:line="480" w:lineRule="auto" w:before="0" w:after="0"/>
+              <w:jc w:val="both"/>
+            </w:pPr>
+            <w:r>
+              <w:rPr>
+                <w:rFonts w:ascii="Times New Roman" w:hAnsi="Times New Roman"/>
+                <w:b w:val="0"/>
+                <w:color w:val="000000"/>
+                <w:sz w:val="24"/>
+              </w:rPr>
+              <w:t>2,000</w:t>
+            </w:r>
+          </w:p>
+        </w:tc>
+        <w:tc>
+          <w:tcPr>
+            <w:tcW w:type="dxa" w:w="1224"/>
+            <w:vAlign w:val="center"/>
+            <w:tcBorders>
+              <w:top w:val="single" w:sz="4" w:color="D9D9D9"/>
+              <w:left w:val="single" w:sz="4" w:color="D9D9D9"/>
+              <w:bottom w:val="single" w:sz="4" w:color="D9D9D9"/>
+              <w:right w:val="single" w:sz="4" w:color="D9D9D9"/>
+            </w:tcBorders>
+          </w:tcPr>
+          <w:p>
+            <w:pPr>
+              <w:keepNext/>
+              <w:spacing w:line="480" w:lineRule="auto" w:before="0" w:after="0"/>
+              <w:jc w:val="both"/>
+            </w:pPr>
+            <w:r>
+              <w:rPr>
+                <w:rFonts w:ascii="Times New Roman" w:hAnsi="Times New Roman"/>
+                <w:b w:val="0"/>
+                <w:color w:val="000000"/>
+                <w:sz w:val="24"/>
+              </w:rPr>
+              <w:t>4,000</w:t>
+            </w:r>
+          </w:p>
+        </w:tc>
+        <w:tc>
+          <w:tcPr>
+            <w:tcW w:type="dxa" w:w="3557"/>
+            <w:vAlign w:val="center"/>
+            <w:tcBorders>
+              <w:top w:val="single" w:sz="4" w:color="D9D9D9"/>
+              <w:left w:val="single" w:sz="4" w:color="D9D9D9"/>
+              <w:bottom w:val="single" w:sz="4" w:color="D9D9D9"/>
+              <w:right w:val="single" w:sz="4" w:color="D9D9D9"/>
+            </w:tcBorders>
+          </w:tcPr>
+          <w:p>
+            <w:pPr>
+              <w:keepNext/>
+              <w:spacing w:line="480" w:lineRule="auto" w:before="0" w:after="0"/>
+              <w:jc w:val="both"/>
+            </w:pPr>
+            <w:r>
+              <w:rPr>
+                <w:rFonts w:ascii="Times New Roman" w:hAnsi="Times New Roman"/>
+                <w:b w:val="0"/>
+                <w:color w:val="000000"/>
+                <w:sz w:val="24"/>
+              </w:rPr>
+              <w:t>Earlier final; failed acceptance</w:t>
+            </w:r>
+          </w:p>
+        </w:tc>
+      </w:tr>
+      <w:tr>
+        <w:trPr>
+          <w:cantSplit/>
+        </w:trPr>
+        <w:tc>
+          <w:tcPr>
+            <w:tcW w:type="dxa" w:w="3096"/>
             <w:vAlign w:val="center"/>
             <w:tcBorders>
               <w:top w:val="single" w:sz="4" w:color="D9D9D9"/>
@@ -2514,7 +2748,7 @@
         </w:tc>
         <w:tc>
           <w:tcPr>
-            <w:tcW w:type="dxa" w:w="1584"/>
+            <w:tcW w:type="dxa" w:w="1224"/>
             <w:vAlign w:val="center"/>
             <w:tcBorders>
               <w:top w:val="single" w:sz="4" w:color="D9D9D9"/>
@@ -2542,7 +2776,7 @@
         </w:tc>
         <w:tc>
           <w:tcPr>
-            <w:tcW w:type="dxa" w:w="2837"/>
+            <w:tcW w:type="dxa" w:w="3557"/>
             <w:vAlign w:val="center"/>
             <w:tcBorders>
               <w:top w:val="single" w:sz="4" w:color="D9D9D9"/>
@@ -2575,7 +2809,7 @@
         </w:trPr>
         <w:tc>
           <w:tcPr>
-            <w:tcW w:type="dxa" w:w="3456"/>
+            <w:tcW w:type="dxa" w:w="3096"/>
             <w:vAlign w:val="center"/>
             <w:tcBorders>
               <w:top w:val="single" w:sz="4" w:color="D9D9D9"/>
@@ -2597,7 +2831,7 @@
                 <w:color w:val="000000"/>
                 <w:sz w:val="24"/>
               </w:rPr>
-              <w:t>E66 comparison</w:t>
+              <w:t>E92 on E66</w:t>
             </w:r>
           </w:p>
         </w:tc>
@@ -2631,7 +2865,7 @@
         </w:tc>
         <w:tc>
           <w:tcPr>
-            <w:tcW w:type="dxa" w:w="1584"/>
+            <w:tcW w:type="dxa" w:w="1224"/>
             <w:vAlign w:val="center"/>
             <w:tcBorders>
               <w:top w:val="single" w:sz="4" w:color="D9D9D9"/>
@@ -2659,7 +2893,7 @@
         </w:tc>
         <w:tc>
           <w:tcPr>
-            <w:tcW w:type="dxa" w:w="2837"/>
+            <w:tcW w:type="dxa" w:w="3557"/>
             <w:vAlign w:val="center"/>
             <w:tcBorders>
               <w:top w:val="single" w:sz="4" w:color="D9D9D9"/>
@@ -2692,7 +2926,7 @@
         </w:trPr>
         <w:tc>
           <w:tcPr>
-            <w:tcW w:type="dxa" w:w="3456"/>
+            <w:tcW w:type="dxa" w:w="3096"/>
             <w:vAlign w:val="center"/>
             <w:tcBorders>
               <w:top w:val="single" w:sz="4" w:color="D9D9D9"/>
@@ -2748,7 +2982,7 @@
         </w:tc>
         <w:tc>
           <w:tcPr>
-            <w:tcW w:type="dxa" w:w="1584"/>
+            <w:tcW w:type="dxa" w:w="1224"/>
             <w:vAlign w:val="center"/>
             <w:tcBorders>
               <w:top w:val="single" w:sz="4" w:color="D9D9D9"/>
@@ -2776,7 +3010,7 @@
         </w:tc>
         <w:tc>
           <w:tcPr>
-            <w:tcW w:type="dxa" w:w="2837"/>
+            <w:tcW w:type="dxa" w:w="3557"/>
             <w:vAlign w:val="center"/>
             <w:tcBorders>
               <w:top w:val="single" w:sz="4" w:color="D9D9D9"/>
@@ -2809,7 +3043,7 @@
         </w:trPr>
         <w:tc>
           <w:tcPr>
-            <w:tcW w:type="dxa" w:w="3456"/>
+            <w:tcW w:type="dxa" w:w="3096"/>
             <w:vAlign w:val="center"/>
             <w:tcBorders>
               <w:top w:val="single" w:sz="4" w:color="D9D9D9"/>
@@ -2865,7 +3099,7 @@
         </w:tc>
         <w:tc>
           <w:tcPr>
-            <w:tcW w:type="dxa" w:w="1584"/>
+            <w:tcW w:type="dxa" w:w="1224"/>
             <w:vAlign w:val="center"/>
             <w:tcBorders>
               <w:top w:val="single" w:sz="4" w:color="D9D9D9"/>
@@ -2893,7 +3127,7 @@
         </w:tc>
         <w:tc>
           <w:tcPr>
-            <w:tcW w:type="dxa" w:w="2837"/>
+            <w:tcW w:type="dxa" w:w="3557"/>
             <w:vAlign w:val="center"/>
             <w:tcBorders>
               <w:top w:val="single" w:sz="4" w:color="D9D9D9"/>
@@ -3188,7 +3422,7 @@
           <w:color w:val="000000"/>
           <w:sz w:val="24"/>
         </w:rPr>
-        <w:t>E92 detected 159 of 160 AI images in each condition. It passed ten numerical requirements for originals and the same ten for processed views. However, it newly missed one original AI image that E43 had caught. Other recovered AI images could not cancel that loss under the predeclared retention rule. Consequently, the complete acceptance contract failed despite the 20/20 numerical milestone.</w:t>
+        <w:t>E92 detected 159 of 160 AI images in each condition. It passed ten numerical requirements for originals and the same ten for processed views. However, it newly missed one original AI image that E43 had caught. Other recovered AI images could not cancel that loss under the predeclared retention rule. Consequently, the full set of acceptance requirements failed despite the 20/20 numerical milestone.</w:t>
       </w:r>
     </w:p>
     <w:p>
@@ -3245,7 +3479,7 @@
           <w:color w:val="000000"/>
           <w:sz w:val="24"/>
         </w:rPr>
-        <w:t>The local demonstration reports AI evidence, no clear AI evidence or uncertainty. It does not certify a photograph as real. On the displayed 0–100 score scale, the upper threshold is about 7.94 and the lower threshold about 1.15. The upper threshold came from earlier E48 calibration with limits on real-photo false alerts. The lower one came from E49 analysis of already-used calibration and development data. Neither is a probability or a universal optimum. Exact values are preserved in the project records.</w:t>
+        <w:t>The demo reports AI evidence, no clear AI evidence or uncertainty. It cannot certify authenticity. On its 0–100 score scale, the upper threshold is about 7.94 and the lower about 1.15. The upper came from E48 calibration with real-photo false-alert limits; the lower came from E49 analysis of already-used calibration and development data. These are experimental operating points, not probabilities or universal optima.</w:t>
       </w:r>
     </w:p>
     <w:p>
@@ -3259,7 +3493,7 @@
           <w:color w:val="000000"/>
           <w:sz w:val="24"/>
         </w:rPr>
-        <w:t>An original score at or above the upper cut keeps an AI alert visible. If both E92 views are below the lower cut, the interface reports no clear signal. Other cases need uncertainty handling. An original AI alert with disagreement can carry a review warning. E43 supplies a separate advisory and no longer vetoes two low E92 scores. Thus the final paired display cannot be reconstructed from one displayed percentage or from an assumed 50% boundary.</w:t>
+        <w:t>An original score at or above the upper threshold keeps an AI alert visible, with a review warning if needed. Both E92 views below the lower threshold yield no clear AI evidence; remaining cases are uncertain. E43 provides a separate advisory and cannot veto two low E92 scores. Decisions use unrounded scores rather than a 50% boundary.</w:t>
       </w:r>
     </w:p>
     <w:p>
@@ -3273,7 +3507,7 @@
           <w:color w:val="000000"/>
           <w:sz w:val="24"/>
         </w:rPr>
-        <w:t>The final interface rule was also checked on the same 320 development images. Of 160 real images, 139 received no clear AI evidence and 21 remained uncertain; none received an AI alert. Of 160 AI images, 159 received an AI alert and one remained uncertain. These counts combine two views into one user result. Thus 14 processed-view false alerts do not mean 14 final AI warnings: a low original score can instead leave the result uncertain. These development counts cannot predict every future upload (Keleş, 2026, current-policy audit).</w:t>
+        <w:t>The combined rule was checked on the same 320 development images. Among 160 real images, 139 received no clear AI evidence, 21 were uncertain and none received an AI alert. Among 160 AI images, 159 received an alert and one was uncertain. Thus 14 processed-view false alerts do not mean 14 final website warnings: a low original score can leave the combined result uncertain. These reused observations do not predict every future upload (Keleş, 2026, current-policy audit).</w:t>
       </w:r>
     </w:p>
     <w:p>
@@ -3287,7 +3521,7 @@
           <w:color w:val="000000"/>
           <w:sz w:val="24"/>
         </w:rPr>
-        <w:t>The service rejects unsupported or oversized uploads and gives an explicit error when the model is unavailable. It checks the saved model files before loading them. Cancellation handling prevents a second heavy inference job from starting while an earlier one still runs. The browser checks the response format before showing a result. These repairs make the demo more dependable to use; they do not increase the model’s measured accuracy.</w:t>
+        <w:t>The service rejects unsupported or oversized uploads, checks model files before loading and reports unavailable models explicitly. Cancellation handling prevents overlapping heavy inference jobs, and the browser validates response fields. These repairs improve reliable operation; they do not increase measured detection accuracy.</w:t>
       </w:r>
     </w:p>
     <w:p>
@@ -4677,7 +4911,7 @@
           <w:color w:val="000000"/>
           <w:sz w:val="24"/>
         </w:rPr>
-        <w:t>The main result has a clear limit. The 20 numerical checks passed, but one AI image caught by the reference became a new miss. Repeated use of the development data also restricts how far the result can be generalized. Later source tests and the Model2 pilot found further weaknesses. These findings explain why the system remains a research prototype.</w:t>
+        <w:t>The main result has a clear limit. All 20 numerical checks passed, but one AI image caught by the reference became a new miss. Reusing the development collection also limits claims about new sources. Later source tests and the Model2 pilot exposed other weaknesses. Keeping these failures in the records helped explain why candidates were rejected and why the demo remained a research prototype.</w:t>
       </w:r>
     </w:p>
     <w:p>

</xml_diff>

<commit_message>
docs: shorten internship report and verify reference relevance
</commit_message>
<xml_diff>
--- a/rapor/final_2026/deliverables/CS395_FinalReport_EfeHan_Keles_25September2026.docx
+++ b/rapor/final_2026/deliverables/CS395_FinalReport_EfeHan_Keles_25September2026.docx
@@ -297,7 +297,7 @@
         <w:tabs>
           <w:tab w:pos="9029" w:val="right" w:leader="dot"/>
         </w:tabs>
-        <w:spacing w:line="348" w:lineRule="auto"/>
+        <w:spacing w:line="264" w:lineRule="auto"/>
         <w:jc w:val="left"/>
       </w:pPr>
       <w:r>
@@ -308,7 +308,7 @@
         </w:rPr>
         <w:t>1. Introduction</w:t>
         <w:tab/>
-        <w:t>5</w:t>
+        <w:t>4</w:t>
       </w:r>
     </w:p>
     <w:p>
@@ -316,7 +316,7 @@
         <w:tabs>
           <w:tab w:pos="9029" w:val="right" w:leader="dot"/>
         </w:tabs>
-        <w:spacing w:line="348" w:lineRule="auto"/>
+        <w:spacing w:line="264" w:lineRule="auto"/>
         <w:jc w:val="left"/>
       </w:pPr>
       <w:r>
@@ -327,7 +327,7 @@
         </w:rPr>
         <w:t>2. Company information</w:t>
         <w:tab/>
-        <w:t>6</w:t>
+        <w:t>4</w:t>
       </w:r>
     </w:p>
     <w:p>
@@ -335,7 +335,7 @@
         <w:tabs>
           <w:tab w:pos="9029" w:val="right" w:leader="dot"/>
         </w:tabs>
-        <w:spacing w:line="348" w:lineRule="auto"/>
+        <w:spacing w:line="264" w:lineRule="auto"/>
         <w:jc w:val="left"/>
       </w:pPr>
       <w:r>
@@ -346,7 +346,7 @@
         </w:rPr>
         <w:t>2.1 Corporate profile and services</w:t>
         <w:tab/>
-        <w:t>6</w:t>
+        <w:t>4</w:t>
       </w:r>
     </w:p>
     <w:p>
@@ -354,7 +354,7 @@
         <w:tabs>
           <w:tab w:pos="9029" w:val="right" w:leader="dot"/>
         </w:tabs>
-        <w:spacing w:line="348" w:lineRule="auto"/>
+        <w:spacing w:line="264" w:lineRule="auto"/>
         <w:jc w:val="left"/>
       </w:pPr>
       <w:r>
@@ -365,7 +365,7 @@
         </w:rPr>
         <w:t>2.2 Organization and internship context</w:t>
         <w:tab/>
-        <w:t>7</w:t>
+        <w:t>5</w:t>
       </w:r>
     </w:p>
     <w:p>
@@ -373,7 +373,7 @@
         <w:tabs>
           <w:tab w:pos="9029" w:val="right" w:leader="dot"/>
         </w:tabs>
-        <w:spacing w:line="348" w:lineRule="auto"/>
+        <w:spacing w:line="264" w:lineRule="auto"/>
         <w:jc w:val="left"/>
       </w:pPr>
       <w:r>
@@ -384,7 +384,7 @@
         </w:rPr>
         <w:t>3. Project background</w:t>
         <w:tab/>
-        <w:t>8</w:t>
+        <w:t>5</w:t>
       </w:r>
     </w:p>
     <w:p>
@@ -392,7 +392,7 @@
         <w:tabs>
           <w:tab w:pos="9029" w:val="right" w:leader="dot"/>
         </w:tabs>
-        <w:spacing w:line="348" w:lineRule="auto"/>
+        <w:spacing w:line="264" w:lineRule="auto"/>
         <w:jc w:val="left"/>
       </w:pPr>
       <w:r>
@@ -403,7 +403,7 @@
         </w:rPr>
         <w:t>3.1 Department information</w:t>
         <w:tab/>
-        <w:t>8</w:t>
+        <w:t>5</w:t>
       </w:r>
     </w:p>
     <w:p>
@@ -411,7 +411,7 @@
         <w:tabs>
           <w:tab w:pos="9029" w:val="right" w:leader="dot"/>
         </w:tabs>
-        <w:spacing w:line="348" w:lineRule="auto"/>
+        <w:spacing w:line="264" w:lineRule="auto"/>
         <w:jc w:val="left"/>
       </w:pPr>
       <w:r>
@@ -422,7 +422,7 @@
         </w:rPr>
         <w:t>3.2 Initial project status</w:t>
         <w:tab/>
-        <w:t>8</w:t>
+        <w:t>6</w:t>
       </w:r>
     </w:p>
     <w:p>
@@ -430,7 +430,7 @@
         <w:tabs>
           <w:tab w:pos="9029" w:val="right" w:leader="dot"/>
         </w:tabs>
-        <w:spacing w:line="348" w:lineRule="auto"/>
+        <w:spacing w:line="264" w:lineRule="auto"/>
         <w:jc w:val="left"/>
       </w:pPr>
       <w:r>
@@ -441,7 +441,7 @@
         </w:rPr>
         <w:t>3.3 Motivation and problem definition</w:t>
         <w:tab/>
-        <w:t>9</w:t>
+        <w:t>6</w:t>
       </w:r>
     </w:p>
     <w:p>
@@ -449,7 +449,7 @@
         <w:tabs>
           <w:tab w:pos="9029" w:val="right" w:leader="dot"/>
         </w:tabs>
-        <w:spacing w:line="348" w:lineRule="auto"/>
+        <w:spacing w:line="264" w:lineRule="auto"/>
         <w:jc w:val="left"/>
       </w:pPr>
       <w:r>
@@ -460,7 +460,7 @@
         </w:rPr>
         <w:t>3.4 Related literature</w:t>
         <w:tab/>
-        <w:t>9</w:t>
+        <w:t>6</w:t>
       </w:r>
     </w:p>
     <w:p>
@@ -468,7 +468,7 @@
         <w:tabs>
           <w:tab w:pos="9029" w:val="right" w:leader="dot"/>
         </w:tabs>
-        <w:spacing w:line="348" w:lineRule="auto"/>
+        <w:spacing w:line="264" w:lineRule="auto"/>
         <w:jc w:val="left"/>
       </w:pPr>
       <w:r>
@@ -479,7 +479,7 @@
         </w:rPr>
         <w:t>4. Internship project</w:t>
         <w:tab/>
-        <w:t>11</w:t>
+        <w:t>7</w:t>
       </w:r>
     </w:p>
     <w:p>
@@ -487,7 +487,7 @@
         <w:tabs>
           <w:tab w:pos="9029" w:val="right" w:leader="dot"/>
         </w:tabs>
-        <w:spacing w:line="348" w:lineRule="auto"/>
+        <w:spacing w:line="264" w:lineRule="auto"/>
         <w:jc w:val="left"/>
       </w:pPr>
       <w:r>
@@ -498,7 +498,7 @@
         </w:rPr>
         <w:t>4.1 Project objective and scope</w:t>
         <w:tab/>
-        <w:t>11</w:t>
+        <w:t>7</w:t>
       </w:r>
     </w:p>
     <w:p>
@@ -506,7 +506,7 @@
         <w:tabs>
           <w:tab w:pos="9029" w:val="right" w:leader="dot"/>
         </w:tabs>
-        <w:spacing w:line="348" w:lineRule="auto"/>
+        <w:spacing w:line="264" w:lineRule="auto"/>
         <w:jc w:val="left"/>
       </w:pPr>
       <w:r>
@@ -517,7 +517,7 @@
         </w:rPr>
         <w:t>4.2 My responsibilities</w:t>
         <w:tab/>
-        <w:t>11</w:t>
+        <w:t>7</w:t>
       </w:r>
     </w:p>
     <w:p>
@@ -525,7 +525,7 @@
         <w:tabs>
           <w:tab w:pos="9029" w:val="right" w:leader="dot"/>
         </w:tabs>
-        <w:spacing w:line="348" w:lineRule="auto"/>
+        <w:spacing w:line="264" w:lineRule="auto"/>
         <w:jc w:val="left"/>
       </w:pPr>
       <w:r>
@@ -536,7 +536,7 @@
         </w:rPr>
         <w:t>4.3 Methodology and tools</w:t>
         <w:tab/>
-        <w:t>12</w:t>
+        <w:t>7</w:t>
       </w:r>
     </w:p>
     <w:p>
@@ -544,7 +544,7 @@
         <w:tabs>
           <w:tab w:pos="9029" w:val="right" w:leader="dot"/>
         </w:tabs>
-        <w:spacing w:line="348" w:lineRule="auto"/>
+        <w:spacing w:line="264" w:lineRule="auto"/>
         <w:jc w:val="left"/>
       </w:pPr>
       <w:r>
@@ -555,7 +555,7 @@
         </w:rPr>
         <w:t>4.4 Expected outcomes and deliverables</w:t>
         <w:tab/>
-        <w:t>13</w:t>
+        <w:t>8</w:t>
       </w:r>
     </w:p>
     <w:p>
@@ -563,7 +563,7 @@
         <w:tabs>
           <w:tab w:pos="9029" w:val="right" w:leader="dot"/>
         </w:tabs>
-        <w:spacing w:line="348" w:lineRule="auto"/>
+        <w:spacing w:line="264" w:lineRule="auto"/>
         <w:jc w:val="left"/>
       </w:pPr>
       <w:r>
@@ -574,7 +574,7 @@
         </w:rPr>
         <w:t>4.5 Project details</w:t>
         <w:tab/>
-        <w:t>13</w:t>
+        <w:t>8</w:t>
       </w:r>
     </w:p>
     <w:p>
@@ -582,7 +582,7 @@
         <w:tabs>
           <w:tab w:pos="9029" w:val="right" w:leader="dot"/>
         </w:tabs>
-        <w:spacing w:line="348" w:lineRule="auto"/>
+        <w:spacing w:line="264" w:lineRule="auto"/>
         <w:jc w:val="left"/>
       </w:pPr>
       <w:r>
@@ -593,7 +593,7 @@
         </w:rPr>
         <w:t>4.5.1 Early models and the first transfer failures</w:t>
         <w:tab/>
-        <w:t>13</w:t>
+        <w:t>8</w:t>
       </w:r>
     </w:p>
     <w:p>
@@ -601,7 +601,7 @@
         <w:tabs>
           <w:tab w:pos="9029" w:val="right" w:leader="dot"/>
         </w:tabs>
-        <w:spacing w:line="348" w:lineRule="auto"/>
+        <w:spacing w:line="264" w:lineRule="auto"/>
         <w:jc w:val="left"/>
       </w:pPr>
       <w:r>
@@ -612,7 +612,7 @@
         </w:rPr>
         <w:t>4.5.2 Data integrity and corrected conclusions</w:t>
         <w:tab/>
-        <w:t>14</w:t>
+        <w:t>9</w:t>
       </w:r>
     </w:p>
     <w:p>
@@ -620,7 +620,7 @@
         <w:tabs>
           <w:tab w:pos="9029" w:val="right" w:leader="dot"/>
         </w:tabs>
-        <w:spacing w:line="348" w:lineRule="auto"/>
+        <w:spacing w:line="264" w:lineRule="auto"/>
         <w:jc w:val="left"/>
       </w:pPr>
       <w:r>
@@ -631,7 +631,7 @@
         </w:rPr>
         <w:t>4.5.3 Data roles and processing conditions</w:t>
         <w:tab/>
-        <w:t>15</w:t>
+        <w:t>9</w:t>
       </w:r>
     </w:p>
     <w:p>
@@ -639,7 +639,7 @@
         <w:tabs>
           <w:tab w:pos="9029" w:val="right" w:leader="dot"/>
         </w:tabs>
-        <w:spacing w:line="348" w:lineRule="auto"/>
+        <w:spacing w:line="264" w:lineRule="auto"/>
         <w:jc w:val="left"/>
       </w:pPr>
       <w:r>
@@ -650,7 +650,7 @@
         </w:rPr>
         <w:t>4.5.4 E92 representation and learning</w:t>
         <w:tab/>
-        <w:t>16</w:t>
+        <w:t>10</w:t>
       </w:r>
     </w:p>
     <w:p>
@@ -658,7 +658,7 @@
         <w:tabs>
           <w:tab w:pos="9029" w:val="right" w:leader="dot"/>
         </w:tabs>
-        <w:spacing w:line="348" w:lineRule="auto"/>
+        <w:spacing w:line="264" w:lineRule="auto"/>
         <w:jc w:val="left"/>
       </w:pPr>
       <w:r>
@@ -669,7 +669,7 @@
         </w:rPr>
         <w:t>4.5.5 Development improvement and acceptance limits</w:t>
         <w:tab/>
-        <w:t>18</w:t>
+        <w:t>10</w:t>
       </w:r>
     </w:p>
     <w:p>
@@ -677,7 +677,7 @@
         <w:tabs>
           <w:tab w:pos="9029" w:val="right" w:leader="dot"/>
         </w:tabs>
-        <w:spacing w:line="348" w:lineRule="auto"/>
+        <w:spacing w:line="264" w:lineRule="auto"/>
         <w:jc w:val="left"/>
       </w:pPr>
       <w:r>
@@ -688,7 +688,7 @@
         </w:rPr>
         <w:t>4.5.6 Honest scores and the web demonstration</w:t>
         <w:tab/>
-        <w:t>19</w:t>
+        <w:t>11</w:t>
       </w:r>
     </w:p>
     <w:p>
@@ -696,7 +696,7 @@
         <w:tabs>
           <w:tab w:pos="9029" w:val="right" w:leader="dot"/>
         </w:tabs>
-        <w:spacing w:line="348" w:lineRule="auto"/>
+        <w:spacing w:line="264" w:lineRule="auto"/>
         <w:jc w:val="left"/>
       </w:pPr>
       <w:r>
@@ -707,7 +707,7 @@
         </w:rPr>
         <w:t>4.5.7 Broader checks and rejected improvements</w:t>
         <w:tab/>
-        <w:t>20</w:t>
+        <w:t>12</w:t>
       </w:r>
     </w:p>
     <w:p>
@@ -715,7 +715,7 @@
         <w:tabs>
           <w:tab w:pos="9029" w:val="right" w:leader="dot"/>
         </w:tabs>
-        <w:spacing w:line="348" w:lineRule="auto"/>
+        <w:spacing w:line="264" w:lineRule="auto"/>
         <w:jc w:val="left"/>
       </w:pPr>
       <w:r>
@@ -726,40 +726,15 @@
         </w:rPr>
         <w:t>4.5.8 Model2 localization and its limits</w:t>
         <w:tab/>
-        <w:t>21</w:t>
+        <w:t>12</w:t>
       </w:r>
     </w:p>
     <w:p>
-      <w:r>
-        <w:rPr>
-          <w:rFonts w:ascii="Times New Roman" w:hAnsi="Times New Roman"/>
-          <w:color w:val="000000"/>
-          <w:sz w:val="24"/>
-        </w:rPr>
-        <w:br w:type="page"/>
-      </w:r>
-    </w:p>
-    <w:p>
-      <w:pPr>
-        <w:pStyle w:val="Title"/>
-        <w:widowControl/>
-        <w:spacing w:line="480" w:lineRule="auto" w:before="0" w:after="0"/>
-      </w:pPr>
-      <w:r>
-        <w:rPr>
-          <w:rFonts w:ascii="Times New Roman" w:hAnsi="Times New Roman"/>
-          <w:color w:val="000000"/>
-          <w:sz w:val="24"/>
-        </w:rPr>
-        <w:t>Table of Contents continued</w:t>
-      </w:r>
-    </w:p>
-    <w:p>
       <w:pPr>
         <w:tabs>
           <w:tab w:pos="9029" w:val="right" w:leader="dot"/>
         </w:tabs>
-        <w:spacing w:line="348" w:lineRule="auto"/>
+        <w:spacing w:line="264" w:lineRule="auto"/>
         <w:jc w:val="left"/>
       </w:pPr>
       <w:r>
@@ -770,7 +745,7 @@
         </w:rPr>
         <w:t>4.6 Results</w:t>
         <w:tab/>
-        <w:t>22</w:t>
+        <w:t>13</w:t>
       </w:r>
     </w:p>
     <w:p>
@@ -778,7 +753,7 @@
         <w:tabs>
           <w:tab w:pos="9029" w:val="right" w:leader="dot"/>
         </w:tabs>
-        <w:spacing w:line="348" w:lineRule="auto"/>
+        <w:spacing w:line="264" w:lineRule="auto"/>
         <w:jc w:val="left"/>
       </w:pPr>
       <w:r>
@@ -789,7 +764,7 @@
         </w:rPr>
         <w:t>5. Internship experience</w:t>
         <w:tab/>
-        <w:t>23</w:t>
+        <w:t>13</w:t>
       </w:r>
     </w:p>
     <w:p>
@@ -797,7 +772,7 @@
         <w:tabs>
           <w:tab w:pos="9029" w:val="right" w:leader="dot"/>
         </w:tabs>
-        <w:spacing w:line="348" w:lineRule="auto"/>
+        <w:spacing w:line="264" w:lineRule="auto"/>
         <w:jc w:val="left"/>
       </w:pPr>
       <w:r>
@@ -808,7 +783,7 @@
         </w:rPr>
         <w:t>5.1 Learning</w:t>
         <w:tab/>
-        <w:t>23</w:t>
+        <w:t>13</w:t>
       </w:r>
     </w:p>
     <w:p>
@@ -816,7 +791,7 @@
         <w:tabs>
           <w:tab w:pos="9029" w:val="right" w:leader="dot"/>
         </w:tabs>
-        <w:spacing w:line="348" w:lineRule="auto"/>
+        <w:spacing w:line="264" w:lineRule="auto"/>
         <w:jc w:val="left"/>
       </w:pPr>
       <w:r>
@@ -827,7 +802,7 @@
         </w:rPr>
         <w:t>5.2 Relation to undergraduate education</w:t>
         <w:tab/>
-        <w:t>23</w:t>
+        <w:t>14</w:t>
       </w:r>
     </w:p>
     <w:p>
@@ -835,7 +810,7 @@
         <w:tabs>
           <w:tab w:pos="9029" w:val="right" w:leader="dot"/>
         </w:tabs>
-        <w:spacing w:line="348" w:lineRule="auto"/>
+        <w:spacing w:line="264" w:lineRule="auto"/>
         <w:jc w:val="left"/>
       </w:pPr>
       <w:r>
@@ -846,7 +821,7 @@
         </w:rPr>
         <w:t>5.3 Major difficulties</w:t>
         <w:tab/>
-        <w:t>24</w:t>
+        <w:t>14</w:t>
       </w:r>
     </w:p>
     <w:p>
@@ -854,7 +829,7 @@
         <w:tabs>
           <w:tab w:pos="9029" w:val="right" w:leader="dot"/>
         </w:tabs>
-        <w:spacing w:line="348" w:lineRule="auto"/>
+        <w:spacing w:line="264" w:lineRule="auto"/>
         <w:jc w:val="left"/>
       </w:pPr>
       <w:r>
@@ -865,7 +840,7 @@
         </w:rPr>
         <w:t>5.4 A typical day</w:t>
         <w:tab/>
-        <w:t>24</w:t>
+        <w:t>14</w:t>
       </w:r>
     </w:p>
     <w:p>
@@ -873,7 +848,7 @@
         <w:tabs>
           <w:tab w:pos="9029" w:val="right" w:leader="dot"/>
         </w:tabs>
-        <w:spacing w:line="348" w:lineRule="auto"/>
+        <w:spacing w:line="264" w:lineRule="auto"/>
         <w:jc w:val="left"/>
       </w:pPr>
       <w:r>
@@ -884,7 +859,7 @@
         </w:rPr>
         <w:t>6. Conclusions</w:t>
         <w:tab/>
-        <w:t>25</w:t>
+        <w:t>15</w:t>
       </w:r>
     </w:p>
     <w:p>
@@ -892,7 +867,7 @@
         <w:tabs>
           <w:tab w:pos="9029" w:val="right" w:leader="dot"/>
         </w:tabs>
-        <w:spacing w:line="348" w:lineRule="auto"/>
+        <w:spacing w:line="264" w:lineRule="auto"/>
         <w:jc w:val="left"/>
       </w:pPr>
       <w:r>
@@ -903,7 +878,7 @@
         </w:rPr>
         <w:t>7. Recommendations</w:t>
         <w:tab/>
-        <w:t>26</w:t>
+        <w:t>15</w:t>
       </w:r>
     </w:p>
     <w:p>
@@ -911,7 +886,7 @@
         <w:tabs>
           <w:tab w:pos="9029" w:val="right" w:leader="dot"/>
         </w:tabs>
-        <w:spacing w:line="348" w:lineRule="auto"/>
+        <w:spacing w:line="264" w:lineRule="auto"/>
         <w:jc w:val="left"/>
       </w:pPr>
       <w:r>
@@ -922,7 +897,7 @@
         </w:rPr>
         <w:t>8. References</w:t>
         <w:tab/>
-        <w:t>27</w:t>
+        <w:t>16</w:t>
       </w:r>
     </w:p>
     <w:p>
@@ -930,7 +905,7 @@
         <w:tabs>
           <w:tab w:pos="9029" w:val="right" w:leader="dot"/>
         </w:tabs>
-        <w:spacing w:line="348" w:lineRule="auto"/>
+        <w:spacing w:line="264" w:lineRule="auto"/>
         <w:jc w:val="left"/>
       </w:pPr>
       <w:r>
@@ -941,7 +916,7 @@
         </w:rPr>
         <w:t>9. Appendices</w:t>
         <w:tab/>
-        <w:t>29</w:t>
+        <w:t>18</w:t>
       </w:r>
     </w:p>
     <w:p>
@@ -949,7 +924,7 @@
         <w:tabs>
           <w:tab w:pos="9029" w:val="right" w:leader="dot"/>
         </w:tabs>
-        <w:spacing w:line="348" w:lineRule="auto"/>
+        <w:spacing w:line="264" w:lineRule="auto"/>
         <w:jc w:val="left"/>
       </w:pPr>
       <w:r>
@@ -960,7 +935,7 @@
         </w:rPr>
         <w:t>9.1 Development criteria</w:t>
         <w:tab/>
-        <w:t>29</w:t>
+        <w:t>18</w:t>
       </w:r>
     </w:p>
     <w:p>
@@ -968,7 +943,7 @@
         <w:tabs>
           <w:tab w:pos="9029" w:val="right" w:leader="dot"/>
         </w:tabs>
-        <w:spacing w:line="348" w:lineRule="auto"/>
+        <w:spacing w:line="264" w:lineRule="auto"/>
         <w:jc w:val="left"/>
       </w:pPr>
       <w:r>
@@ -979,7 +954,7 @@
         </w:rPr>
         <w:t>9.2 Evidence and reproduction map</w:t>
         <w:tab/>
-        <w:t>30</w:t>
+        <w:t>18</w:t>
       </w:r>
       <w:r>
         <w:rPr>
@@ -1017,7 +992,7 @@
           <w:color w:val="000000"/>
           <w:sz w:val="24"/>
         </w:rPr>
-        <w:t>PixelProof addresses a practical question: can a system identify evidence of AI generation without routinely accusing genuine photographs? Visually convincing generated images make this task difficult, while resizing and compression can change the signals available to a detector. The project also explored a related question: can a model locate a small AI-edited region inside an otherwise genuine photograph? These are different tasks and require different evidence.</w:t>
+        <w:t>PixelProof investigates whether a photograph contains evidence of AI generation while limiting false accusations against real images. It also explores locating AI-edited regions. The main result is a working research demo with improved detection on a defined development collection; reliable performance across all image sources remains unproven.</w:t>
       </w:r>
     </w:p>
     <w:p>
@@ -1031,41 +1006,12 @@
           <w:color w:val="000000"/>
           <w:sz w:val="24"/>
         </w:rPr>
-        <w:t>The internship ran from 20 July to 18 September 2026 under the approved 40-day CS395 arrangement at Türk Telekom. This report covers the technical record through 16 September, the latest completed research checkpoint before the end of that period. Report preparation took place afterwards. Experiment identifiers refer to recorded protocols and findings, rather than a count of independent trials. The implementation and append-only records provide the primary evidence for project-specific claims (Keleş, 2026).</w:t>
+        <w:t>My CS395 internship at Türk Telekom ran from 20 July to 18 September 2026 under an approved 40-day arrangement. This report covers completed research through 16 September. Experiment identifiers refer to protocols in the project records, not independent tests (Keleş, 2026). Sections 2 and 3 introduce the company and problem; Section 4 explains development and results; Sections 5–7 cover experience, conclusions and recommendations. References and an appendix support the account.</w:t>
       </w:r>
     </w:p>
     <w:p>
       <w:pPr>
-        <w:widowControl/>
-        <w:spacing w:line="480" w:lineRule="auto" w:before="0" w:after="0"/>
-      </w:pPr>
-      <w:r>
-        <w:rPr>
-          <w:rFonts w:ascii="Times New Roman" w:hAnsi="Times New Roman"/>
-          <w:color w:val="000000"/>
-          <w:sz w:val="24"/>
-        </w:rPr>
-        <w:t>The main achievement is a functioning research system with measurable development improvements, a usable local interface and an evaluation process that also records failures. The current local demonstration uses E92. It passes 20 numerical checks on reused development images, but newly misses one AI image caught by the reference model. That new miss breaks a separate acceptance rule. Independent universal reliability remains unproven.</w:t>
-      </w:r>
-    </w:p>
-    <w:p>
-      <w:pPr>
-        <w:widowControl/>
-        <w:spacing w:line="480" w:lineRule="auto" w:before="0" w:after="0"/>
-      </w:pPr>
-      <w:r>
-        <w:rPr>
-          <w:rFonts w:ascii="Times New Roman" w:hAnsi="Times New Roman"/>
-          <w:color w:val="000000"/>
-          <w:sz w:val="24"/>
-        </w:rPr>
-        <w:t>Section 2 introduces the host organization. Section 3 explains the problem and relevant literature. Section 4 describes responsibilities, methods, implementation, representative experiments and results. Section 5 discusses learning and difficulties. Sections 6 and 7 give conclusions and recommendations. References and a compact evidence appendix support the main account without reproducing every experiment or implementation detail.</w:t>
-      </w:r>
-    </w:p>
-    <w:p>
-      <w:pPr>
         <w:pStyle w:val="Heading1"/>
-        <w:pageBreakBefore/>
         <w:widowControl/>
         <w:spacing w:line="480" w:lineRule="auto" w:before="0" w:after="0"/>
       </w:pPr>
@@ -1104,7 +1050,7 @@
           <w:color w:val="000000"/>
           <w:sz w:val="24"/>
         </w:rPr>
-        <w:t>The host organization is Türk Telekomünikasyon A.Ş. Its registered office is Turgut Özal Bulvarı, 06103 Aydınlıkevler, Ankara (Türk Telekom, 2026a). I completed my internship at Fatih Sultan Mehmet Mah., Balkan Cad. No:49, 34771 Ümraniye, İstanbul. This is the internship office, distinct from the registered headquarters. The corporate website is https://www.turktelekom.com.tr. The internship contact supplied in the approved record is +90 312 555 93 92.</w:t>
+        <w:t>Türk Telekomünikasyon A.Ş. provides fixed, mobile, broadband, television and corporate data services to households, businesses and wholesale operators. Its history exceeds 185 years; its services were brought under one brand in 2016. It operates offices and communications infrastructure across 81 provinces, with 31,756 employees reported alongside June 2026 figures (Türk Telekom, 2026b).</w:t>
       </w:r>
     </w:p>
     <w:p>
@@ -1118,7 +1064,7 @@
           <w:color w:val="000000"/>
           <w:sz w:val="24"/>
         </w:rPr>
-        <w:t>Türk Telekom has a history extending over 185 years. It adopted an integrated operating structure in 2015 and brought mobile, internet, telephone and television services under one brand in 2016. Its facilities are communications infrastructure, service operations and offices rather than a manufacturing plant. The corporate profile reports operations in 81 provinces and 31,756 employees alongside its 30 June 2026 operating figures (Türk Telekom, 2026b).</w:t>
+        <w:t>Its registered address is Turgut Özal Bulvarı, 06103 Aydınlıkevler, Ankara. My internship office was Fatih Sultan Mehmet Mah., Balkan Cad. No:49, 34771 Ümraniye, İstanbul. The website is https://www.turktelekom.com.tr; the supplied internship contact number is +90 312 555 93 92. Ownership is 60% Türkiye Wealth Fund, 25% Treasury and Finance Ministry and 15% publicly traded shares. Subsidiaries include TT Mobil, TTNET, Argela, İnnova, SEBİT and AssisTT (Türk Telekom, 2026a).</w:t>
       </w:r>
     </w:p>
     <w:p>
@@ -1132,21 +1078,7 @@
           <w:color w:val="000000"/>
           <w:sz w:val="24"/>
         </w:rPr>
-        <w:t>The group supplies fixed access, broadband, mobile, television and corporate data services. Customers include households, businesses and wholesale operators. Group companies include TT Mobil, TTNET, Argela, İnnova, SEBİT, AssisTT and Türk Telekom International. The disclosed ownership structure allocates 60% to Türkiye Wealth Fund, 25% to the Ministry of Treasury and Finance and 15% to publicly traded shares. The fund also holds 1.68% within the publicly traded portion; that holding must not be added to the 100% ownership total (Türk Telekom, 2026a, 2026b).</w:t>
-      </w:r>
-    </w:p>
-    <w:p>
-      <w:pPr>
-        <w:widowControl/>
-        <w:spacing w:line="480" w:lineRule="auto" w:before="0" w:after="0"/>
-      </w:pPr>
-      <w:r>
-        <w:rPr>
-          <w:rFonts w:ascii="Times New Roman" w:hAnsi="Times New Roman"/>
-          <w:color w:val="000000"/>
-          <w:sz w:val="24"/>
-        </w:rPr>
-        <w:t>The company operates in the telecommunications market, with competition across mobile and fixed connectivity. Competitors and suppliers were mentioned during my internship, but we did not discuss them in detail. The main competitors and major suppliers relevant to the unit remain [TO COMPLETE: confirmed competitor and supplier names]. I have not inferred a supplier ranking from these brief discussions. PixelProof used research datasets and public pretrained components, not customer telecommunications records.</w:t>
+        <w:t>Relevant main competitors and suppliers were discussed briefly during the internship; their names remain [TO COMPLETE: confirmed competitor and supplier names].</w:t>
       </w:r>
     </w:p>
     <w:p>
@@ -1175,7 +1107,7 @@
           <w:color w:val="000000"/>
           <w:sz w:val="24"/>
         </w:rPr>
-        <w:t>Figure 1 summarizes the corporate reporting structure published in the 2025 Annual Report. It retains the distinction between functions reporting to the general manager and internal audit reporting to the board. Functional descriptions are summarized from the published department titles. The diagram provides corporate context; the reporting line of my host unit still requires confirmation (Türk Telekom, 2026a, p. 33).</w:t>
+        <w:t>Figure 1 summarizes the published corporate structure: network and IT support infrastructure, commercial units serve customers, and support units cover finance, staff and coordination (Türk Telekom, 2026a, p. 33). My host unit was Planlama ve Geliştirme Müdürlüğü (Planning and Development Directorate); its reporting line remains [TO COMPLETE: department reporting line].</w:t>
       </w:r>
     </w:p>
     <w:p>
@@ -1244,22 +1176,7 @@
     </w:p>
     <w:p>
       <w:pPr>
-        <w:widowControl/>
-        <w:spacing w:line="480" w:lineRule="auto" w:before="0" w:after="0"/>
-      </w:pPr>
-      <w:r>
-        <w:rPr>
-          <w:rFonts w:ascii="Times New Roman" w:hAnsi="Times New Roman"/>
-          <w:color w:val="000000"/>
-          <w:sz w:val="24"/>
-        </w:rPr>
-        <w:t>Network and IT cover communications infrastructure and information systems. Commercial functions include customer experience, consumer sales, corporate sales and wholesale services. Support functions include finance, people operations, procurement, legal compliance and risk. Regional directorates coordinate local operations. My host unit was Planlama ve Geliştirme Müdürlüğü (Planning and Development Directorate). Its formal reporting line remains [TO COMPLETE: department reporting line].</w:t>
-      </w:r>
-    </w:p>
-    <w:p>
-      <w:pPr>
         <w:pStyle w:val="Heading1"/>
-        <w:pageBreakBefore/>
         <w:widowControl/>
         <w:spacing w:line="480" w:lineRule="auto" w:before="0" w:after="0"/>
       </w:pPr>
@@ -1298,21 +1215,7 @@
           <w:color w:val="000000"/>
           <w:sz w:val="24"/>
         </w:rPr>
-        <w:t>My host unit was Planlama ve Geliştirme Müdürlüğü (Planning and Development Directorate). Its specific responsibilities remain [TO COMPLETE: department responsibilities]. My supervisor was Önder Çelebi, whose supplied contact is onder.celebi@turktelekom.com.tr. He is the Director of this unit. I also consulted mentors, whose names, titles and work email addresses remain [TO COMPLETE: mentor details]. These consultations supported an individually conducted project.</w:t>
-      </w:r>
-    </w:p>
-    <w:p>
-      <w:pPr>
-        <w:widowControl/>
-        <w:spacing w:line="480" w:lineRule="auto" w:before="0" w:after="0"/>
-      </w:pPr>
-      <w:r>
-        <w:rPr>
-          <w:rFonts w:ascii="Times New Roman" w:hAnsi="Times New Roman"/>
-          <w:color w:val="000000"/>
-          <w:sz w:val="24"/>
-        </w:rPr>
-        <w:t>The approved arrangement was hybrid, with Monday through Thursday on site and Friday remote. The project record concerns a student research prototype. It does not establish that Türk Telekom already operated this detector, requested a particular production deployment, or used its outputs in customer decisions. Any department-specific business process description requires confirmation before submission.</w:t>
+        <w:t>The Planning and Development Directorate’s responsibilities remain [TO COMPLETE: department responsibilities]. My supervisor was Önder Çelebi, Director, at onder.celebi@turktelekom.com.tr. I also consulted mentors: [TO COMPLETE: mentor details]. I worked individually under a hybrid arrangement, Monday–Thursday on site and Friday remote. PixelProof was a student prototype using research data, with no documented company production deployment.</w:t>
       </w:r>
     </w:p>
     <w:p>
@@ -1341,21 +1244,7 @@
           <w:color w:val="000000"/>
           <w:sz w:val="24"/>
         </w:rPr>
-        <w:t>The first recorded experiment on 20 July used a small convolutional neural network trained on CIFAKE. The initial workflow was conventional: prepare labelled images, train a classifier, evaluate it and inspect mistakes. A 96.75% result on the familiar test collection initially looked promising, but accuracy fell to 77.1% on a separate 995-image collection. Later auditing also exposed confounds in that external collection. These historical values describe early diagnostics, not a certified deployment benchmark (Keleş, 2026, E1 and E10).</w:t>
-      </w:r>
-    </w:p>
-    <w:p>
-      <w:pPr>
-        <w:widowControl/>
-        <w:spacing w:line="480" w:lineRule="auto" w:before="0" w:after="0"/>
-      </w:pPr>
-      <w:r>
-        <w:rPr>
-          <w:rFonts w:ascii="Times New Roman" w:hAnsi="Times New Roman"/>
-          <w:color w:val="000000"/>
-          <w:sz w:val="24"/>
-        </w:rPr>
-        <w:t>Information flowed from dataset sources to local preparation and training scripts, then to saved scores, error analysis and experimental decisions. The work evolved from improving a single accuracy number into controlling what data meant, which populations could influence learning, and how results should reach a user. There was no verified production decision process to replace.</w:t>
+        <w:t>The initial workflow was to prepare labelled images, train a small CNN on CIFAKE and inspect classification errors. Its 96.75% familiar-test accuracy fell to 77.1% on a separate 995-image collection. Later audits found confounds in that collection, so these remain historical diagnostics. Data flowed through local preparation and training scripts to saved scores, error analysis and the next experiment (Keleş, 2026, E1 and E10).</w:t>
       </w:r>
     </w:p>
     <w:p>
@@ -1384,21 +1273,7 @@
           <w:color w:val="000000"/>
           <w:sz w:val="24"/>
         </w:rPr>
-        <w:t>The objective was to build and evaluate an image-screening prototype that could find AI-related evidence while limiting false alarms on real photographs. A false positive labels a real image as AI. A false negative misses an AI image. Reducing only one of these errors can make the other worse, so both must remain visible.</w:t>
-      </w:r>
-    </w:p>
-    <w:p>
-      <w:pPr>
-        <w:widowControl/>
-        <w:spacing w:line="480" w:lineRule="auto" w:before="0" w:after="0"/>
-      </w:pPr>
-      <w:r>
-        <w:rPr>
-          <w:rFonts w:ascii="Times New Roman" w:hAnsi="Times New Roman"/>
-          <w:color w:val="000000"/>
-          <w:sz w:val="24"/>
-        </w:rPr>
-        <w:t>The central technical problem was distribution shift: images from a new camera, generator or processing pipeline could behave very differently from the training examples. A separate localization objective required pixel-level evidence about edited regions. An image-level score alone cannot establish that a highlighted area was edited, and a low score cannot prove that an image is authentic.</w:t>
+        <w:t>A false positive flags a real photograph as AI; a false negative misses an AI image. Improving one error can worsen the other. The main difficulty was distribution shift: a new camera, generator or processing method could change performance. Model1 addressed whole-image detection, while Model2 investigated edited regions using pixel masks. A low detection score cannot prove authenticity.</w:t>
       </w:r>
     </w:p>
     <w:p>
@@ -1427,7 +1302,7 @@
           <w:color w:val="000000"/>
           <w:sz w:val="24"/>
         </w:rPr>
-        <w:t>Wang et al. (2020) studied transfer from a detector trained on one generator to several other synthesis methods. Ojha et al. (2023) showed that pretrained visual representations can support broader fake-image detection with simple classifiers. These studies motivated comparison of learned representations with the early convolutional and handcrafted baselines. Their published results belong to their own protocols and are not PixelProof measurements.</w:t>
+        <w:t>Wang et al. (2020) investigated detection across different image generators. Ojha et al. (2023) showed that pretrained visual features can support broader detection through simple classifiers. CLIP learns from image–text pairs (Radford et al., 2021), while DINOv2 learns reusable features without task-specific labels (Oquab et al., 2024). These works motivated feature-based transfer learning in PixelProof.</w:t>
       </w:r>
     </w:p>
     <w:p>
@@ -1441,7 +1316,7 @@
           <w:color w:val="000000"/>
           <w:sz w:val="24"/>
         </w:rPr>
-        <w:t>CLIP learns visual representations from image-text supervision (Radford et al., 2021). DINOv2 learns reusable visual features without task-specific labels (Oquab et al., 2024). PixelProof used such pretrained representations and trained adaptation components around them. The contribution is therefore not training an entire foundation model from scratch. It lies in data preparation, learned adaptation, evaluation and integration.</w:t>
+        <w:t>Compression and image-size differences can become misleading dataset shortcuts (Grommelt et al., 2024). DEAR prunes features using inpainting-based analysis to improve robustness (Kim et al., 2026). PixelProof used a pretrained DEAR component, but its published benchmark results do not establish our system’s performance.</w:t>
       </w:r>
     </w:p>
     <w:p>
@@ -1455,7 +1330,7 @@
           <w:color w:val="000000"/>
           <w:sz w:val="24"/>
         </w:rPr>
-        <w:t>Grommelt et al. (2024) show how compression and image-size differences can become shortcuts in generated-image detection datasets. This matters because matching file extensions or resizing every image does not erase previous processing. PixelProof investigated processing history and matched transformations, while avoiding claims that cropping automatically removes source bias.</w:t>
+        <w:t>SIDD provides smartphone images from ten scenes and five cameras (Abdelhamed et al., 2018); SID provides short- and long-exposure low-light raw pairs (Chen et al., 2018). These sources supported real-image coverage, with limited scene diversity and processing conditions that differ from ordinary camera JPEGs.</w:t>
       </w:r>
     </w:p>
     <w:p>
@@ -1469,55 +1344,12 @@
           <w:color w:val="000000"/>
           <w:sz w:val="24"/>
         </w:rPr>
-        <w:t>Kim et al. (2026) introduce DEAR, using inpainting-related analysis to prune features that are less robust to processing. PixelProof incorporated a pinned pretrained DEAR component alongside other visual features. A published claim about unseen-generator robustness cannot be inherited merely by loading those weights. Local data lineage and task-specific evaluation remain necessary.</w:t>
+        <w:t>Guo et al. (2017) explain why classifier scores need calibration before interpretation as confidence. Dwork et al. (2015) show the risks of repeatedly adapting to holdout results. Both issues shaped our evaluation and interface. As an industry comparison, Adobe Content Credentials records origin and editing information (Adobe, 2026). PixelProof estimates evidence from pixels; credential verification was not implemented.</w:t>
       </w:r>
     </w:p>
     <w:p>
       <w:pPr>
-        <w:widowControl/>
-        <w:spacing w:line="480" w:lineRule="auto" w:before="0" w:after="0"/>
-      </w:pPr>
-      <w:r>
-        <w:rPr>
-          <w:rFonts w:ascii="Times New Roman" w:hAnsi="Times New Roman"/>
-          <w:color w:val="000000"/>
-          <w:sz w:val="24"/>
-        </w:rPr>
-        <w:t>SIDD supplies smartphone denoising data from ten scenes and five cameras (Abdelhamed et al., 2018). SID supplies paired short- and long-exposure low-light raw images (Chen et al., 2018). They provided documented real-image coverage, but neither is a survey of all current phone photography. Multiple observations from a scene remain dependent, and a research raw rendering need not match a consumer camera JPEG.</w:t>
-      </w:r>
-    </w:p>
-    <w:p>
-      <w:pPr>
-        <w:widowControl/>
-        <w:spacing w:line="480" w:lineRule="auto" w:before="0" w:after="0"/>
-      </w:pPr>
-      <w:r>
-        <w:rPr>
-          <w:rFonts w:ascii="Times New Roman" w:hAnsi="Times New Roman"/>
-          <w:color w:val="000000"/>
-          <w:sz w:val="24"/>
-        </w:rPr>
-        <w:t>Guo et al. (2017) distinguish classifier outputs from well-calibrated confidence estimates. That distinction informs the interface: multiplying a score by 100 does not make it a probability of AI generation. Dwork et al. (2015) explain the risk of adaptively reusing holdout data. PixelProof therefore identifies previously inspected collections as development evidence even when individual runs freeze their settings before scoring.</w:t>
-      </w:r>
-    </w:p>
-    <w:p>
-      <w:pPr>
-        <w:widowControl/>
-        <w:spacing w:line="480" w:lineRule="auto" w:before="0" w:after="0"/>
-      </w:pPr>
-      <w:r>
-        <w:rPr>
-          <w:rFonts w:ascii="Times New Roman" w:hAnsi="Times New Roman"/>
-          <w:color w:val="000000"/>
-          <w:sz w:val="24"/>
-        </w:rPr>
-        <w:t>An industry example addresses the same trust problem through a different form of evidence. Adobe Content Credentials can record a file’s origin, edits and use of generative AI (Adobe, n.d.). PixelProof instead estimates a signal from image pixels. These approaches could complement each other, but this project did not implement credential verification. The comparison helps explain why a detector score alone should not be presented as proof of authenticity.</w:t>
-      </w:r>
-    </w:p>
-    <w:p>
-      <w:pPr>
         <w:pStyle w:val="Heading1"/>
-        <w:pageBreakBefore/>
         <w:widowControl/>
         <w:spacing w:line="480" w:lineRule="auto" w:before="0" w:after="0"/>
       </w:pPr>
@@ -1556,21 +1388,7 @@
           <w:color w:val="000000"/>
           <w:sz w:val="24"/>
         </w:rPr>
-        <w:t>Model1 aimed to detect image-level AI evidence across a wider range of real and generated photographs while preserving detection of AI images already caught by a reference model. Model2 investigated localization of AI edits with ground-truth masks. The practical deliverable was a local student demonstration with clear uncertainty handling, backed by reproducible research records.</w:t>
-      </w:r>
-    </w:p>
-    <w:p>
-      <w:pPr>
-        <w:widowControl/>
-        <w:spacing w:line="480" w:lineRule="auto" w:before="0" w:after="0"/>
-      </w:pPr>
-      <w:r>
-        <w:rPr>
-          <w:rFonts w:ascii="Times New Roman" w:hAnsi="Times New Roman"/>
-          <w:color w:val="000000"/>
-          <w:sz w:val="24"/>
-        </w:rPr>
-        <w:t>The scope included source auditing, training and comparison of candidate models, original-versus-processed evaluation, software validation and readable outputs. It excluded certification of authenticity, unrestricted commercial deployment and a guarantee against all future generators. Classical splicing, generative editing and full-image generation were not treated as interchangeable labels.</w:t>
+        <w:t>Model1 aimed to reduce real-photo false alerts while preserving AI detections already made by a reference model. Model2 explored edit localization. The scope covered data auditing, learned adaptation, evaluation and a local web demo with uncertainty handling. Universal detection and production readiness were longer-term goals, not achieved outcomes.</w:t>
       </w:r>
     </w:p>
     <w:p>
@@ -1599,21 +1417,7 @@
           <w:color w:val="000000"/>
           <w:sz w:val="24"/>
         </w:rPr>
-        <w:t>My project responsibilities covered defining the objectives, directing the experiment sequence, organizing the research material and reviewing the recorded results. The development process used AI coding assistance for implementation, analysis and documentation. Reproducible scripts, source checks and tests were used to verify outputs rather than treating generated explanations as evidence. The report distinguishes those engineering checks from proof that a model generalizes.</w:t>
-      </w:r>
-    </w:p>
-    <w:p>
-      <w:pPr>
-        <w:widowControl/>
-        <w:spacing w:line="480" w:lineRule="auto" w:before="0" w:after="0"/>
-      </w:pPr>
-      <w:r>
-        <w:rPr>
-          <w:rFonts w:ascii="Times New Roman" w:hAnsi="Times New Roman"/>
-          <w:color w:val="000000"/>
-          <w:sz w:val="24"/>
-        </w:rPr>
-        <w:t>I carried out the project individually. I consulted my supervisor and mentors when I needed guidance, but generally made the project decisions myself. They explained evaluation concepts such as true positives and false negatives. Their role was advisory rather than shared implementation. My work covered dataset acquisition and admission records, label mapping, duplicate and ancestry checks, model experiments, API and interface development, and maintenance of PLAN.md, HISTORY.md, ml/EXPERIMENTS.md and DATASETS.md. Public pretrained encoders and external datasets are acknowledged separately from the project-owned adaptation and application code.</w:t>
+        <w:t>I directed the experiments, organized data, reviewed results and generally made project decisions, consulting my supervisor and mentors for advice. They explained concepts such as true positives and false negatives. My work covered dataset checks, model adaptation, the API, interface and research records. AI coding assistance supported implementation, analysis and documentation; scripts and tests checked outputs. Pretrained models and external datasets are credited separately from our adaptation and application work.</w:t>
       </w:r>
     </w:p>
     <w:p>
@@ -1642,13 +1446,16 @@
           <w:color w:val="000000"/>
           <w:sz w:val="24"/>
         </w:rPr>
-        <w:t>The workflow became more disciplined as problems emerged. In later experiments, PLAN.md stated the question, allowed data and acceptance rules before a run. The experiment log recorded the settings and measurements, including failures. HISTORY.md explained what those results changed, while DATASETS.md recorded acquisition, source checks and permitted use. Earlier entries were retained when a later audit corrected them. This made it possible to trace an idea from its original motivation through its test to the decision that followed.</w:t>
+        <w:t>In later experiments, PLAN.md recorded the question and acceptance rules before a run. ml/EXPERIMENTS.md retained measurements, HISTORY.md explained decisions and DATASETS.md recorded sources and permitted use. Corrections remained alongside earlier entries. Table 1 shows how findings changed the next step (Keleş, 2026).</w:t>
       </w:r>
     </w:p>
     <w:p>
       <w:pPr>
+        <w:pStyle w:val="Caption"/>
+        <w:keepNext/>
         <w:widowControl/>
         <w:spacing w:line="480" w:lineRule="auto" w:before="0" w:after="0"/>
+        <w:jc w:val="center"/>
       </w:pPr>
       <w:r>
         <w:rPr>
@@ -1656,38 +1463,7 @@
           <w:color w:val="000000"/>
           <w:sz w:val="24"/>
         </w:rPr>
-        <w:t>Training data taught the model. Calibration data helped choose the score threshold. Development data revealed weaknesses and guided further changes. Final evaluation required data that had not influenced these decisions. Repeatedly checking the same collection makes it development evidence, even when each new run has fixed settings. The main error measures were AI detection rate and false alerts on real photographs. AUC measured ranking across thresholds; it did not establish that a particular decision rule was safe.</w:t>
-      </w:r>
-    </w:p>
-    <w:p>
-      <w:pPr>
-        <w:widowControl/>
-        <w:spacing w:line="480" w:lineRule="auto" w:before="0" w:after="0"/>
-      </w:pPr>
-      <w:r>
-        <w:rPr>
-          <w:rFonts w:ascii="Times New Roman" w:hAnsi="Times New Roman"/>
-          <w:color w:val="000000"/>
-          <w:sz w:val="24"/>
-        </w:rPr>
-        <w:t>Python, PyTorch, NumPy, SciPy and scikit-learn supported modelling and analysis. React and TypeScript provided the interface, with FastAPI serving inference. Git preserved changes and automated checks tested the software. Saved models and key inputs were identified by file hashes so that later comparisons could use the intended versions. Table 1 gives representative decisions recorded during this workflow (Keleş, 2026).</w:t>
-      </w:r>
-    </w:p>
-    <w:p>
-      <w:pPr>
-        <w:pStyle w:val="Caption"/>
-        <w:keepNext/>
-        <w:widowControl/>
-        <w:spacing w:line="480" w:lineRule="auto" w:before="0" w:after="0"/>
-        <w:jc w:val="center"/>
-      </w:pPr>
-      <w:r>
-        <w:rPr>
-          <w:rFonts w:ascii="Times New Roman" w:hAnsi="Times New Roman"/>
-          <w:color w:val="000000"/>
-          <w:sz w:val="24"/>
-        </w:rPr>
-        <w:t>Table 1. How recorded findings changed development.</w:t>
+        <w:t>Table 1. Examples of findings that changed development.</w:t>
       </w:r>
     </w:p>
     <w:tbl>
@@ -1760,7 +1536,7 @@
                 <w:color w:val="000000"/>
                 <w:sz w:val="24"/>
               </w:rPr>
-              <w:t>Recorded response</w:t>
+              <w:t>Response</w:t>
             </w:r>
           </w:p>
         </w:tc>
@@ -1793,7 +1569,7 @@
                 <w:color w:val="000000"/>
                 <w:sz w:val="24"/>
               </w:rPr>
-              <w:t>Weak transfer to new image sources</w:t>
+              <w:t>Reversed source labels</w:t>
             </w:r>
           </w:p>
         </w:tc>
@@ -1821,7 +1597,7 @@
                 <w:color w:val="000000"/>
                 <w:sz w:val="24"/>
               </w:rPr>
-              <w:t>Compare sources and processing conditions</w:t>
+              <w:t>Remap labels and rerun experiments</w:t>
             </w:r>
           </w:p>
         </w:tc>
@@ -1854,7 +1630,7 @@
                 <w:color w:val="000000"/>
                 <w:sz w:val="24"/>
               </w:rPr>
-              <w:t>Reversed source labels in E19b</w:t>
+              <w:t>Evaluation-dependent threshold</w:t>
             </w:r>
           </w:p>
         </w:tc>
@@ -1882,129 +1658,7 @@
                 <w:color w:val="000000"/>
                 <w:sz w:val="24"/>
               </w:rPr>
-              <w:t>Remap labels and rerun affected experiments</w:t>
-            </w:r>
-          </w:p>
-        </w:tc>
-      </w:tr>
-      <w:tr>
-        <w:trPr>
-          <w:cantSplit/>
-        </w:trPr>
-        <w:tc>
-          <w:tcPr>
-            <w:tcW w:type="dxa" w:w="4176"/>
-            <w:vAlign w:val="center"/>
-            <w:tcBorders>
-              <w:top w:val="single" w:sz="4" w:color="D9D9D9"/>
-              <w:left w:val="single" w:sz="4" w:color="D9D9D9"/>
-              <w:bottom w:val="single" w:sz="4" w:color="D9D9D9"/>
-              <w:right w:val="single" w:sz="4" w:color="D9D9D9"/>
-            </w:tcBorders>
-          </w:tcPr>
-          <w:p>
-            <w:pPr>
-              <w:keepNext/>
-              <w:spacing w:line="480" w:lineRule="auto" w:before="0" w:after="0"/>
-              <w:jc w:val="both"/>
-            </w:pPr>
-            <w:r>
-              <w:rPr>
-                <w:rFonts w:ascii="Times New Roman" w:hAnsi="Times New Roman"/>
-                <w:b w:val="0"/>
-                <w:color w:val="000000"/>
-                <w:sz w:val="24"/>
-              </w:rPr>
-              <w:t>Evaluation used in E27 threshold selection</w:t>
-            </w:r>
-          </w:p>
-        </w:tc>
-        <w:tc>
-          <w:tcPr>
-            <w:tcW w:type="dxa" w:w="4853"/>
-            <w:vAlign w:val="center"/>
-            <w:tcBorders>
-              <w:top w:val="single" w:sz="4" w:color="D9D9D9"/>
-              <w:left w:val="single" w:sz="4" w:color="D9D9D9"/>
-              <w:bottom w:val="single" w:sz="4" w:color="D9D9D9"/>
-              <w:right w:val="single" w:sz="4" w:color="D9D9D9"/>
-            </w:tcBorders>
-          </w:tcPr>
-          <w:p>
-            <w:pPr>
-              <w:keepNext/>
-              <w:spacing w:line="480" w:lineRule="auto" w:before="0" w:after="0"/>
-              <w:jc w:val="both"/>
-            </w:pPr>
-            <w:r>
-              <w:rPr>
-                <w:rFonts w:ascii="Times New Roman" w:hAnsi="Times New Roman"/>
-                <w:b w:val="0"/>
-                <w:color w:val="000000"/>
-                <w:sz w:val="24"/>
-              </w:rPr>
-              <w:t>Recompute using calibration data only</w:t>
-            </w:r>
-          </w:p>
-        </w:tc>
-      </w:tr>
-      <w:tr>
-        <w:trPr>
-          <w:cantSplit/>
-        </w:trPr>
-        <w:tc>
-          <w:tcPr>
-            <w:tcW w:type="dxa" w:w="4176"/>
-            <w:vAlign w:val="center"/>
-            <w:tcBorders>
-              <w:top w:val="single" w:sz="4" w:color="D9D9D9"/>
-              <w:left w:val="single" w:sz="4" w:color="D9D9D9"/>
-              <w:bottom w:val="single" w:sz="4" w:color="D9D9D9"/>
-              <w:right w:val="single" w:sz="4" w:color="D9D9D9"/>
-            </w:tcBorders>
-          </w:tcPr>
-          <w:p>
-            <w:pPr>
-              <w:keepNext/>
-              <w:spacing w:line="480" w:lineRule="auto" w:before="0" w:after="0"/>
-              <w:jc w:val="both"/>
-            </w:pPr>
-            <w:r>
-              <w:rPr>
-                <w:rFonts w:ascii="Times New Roman" w:hAnsi="Times New Roman"/>
-                <w:b w:val="0"/>
-                <w:color w:val="000000"/>
-                <w:sz w:val="24"/>
-              </w:rPr>
-              <w:t>E92 reduced false alerts but added an AI miss</w:t>
-            </w:r>
-          </w:p>
-        </w:tc>
-        <w:tc>
-          <w:tcPr>
-            <w:tcW w:type="dxa" w:w="4853"/>
-            <w:vAlign w:val="center"/>
-            <w:tcBorders>
-              <w:top w:val="single" w:sz="4" w:color="D9D9D9"/>
-              <w:left w:val="single" w:sz="4" w:color="D9D9D9"/>
-              <w:bottom w:val="single" w:sz="4" w:color="D9D9D9"/>
-              <w:right w:val="single" w:sz="4" w:color="D9D9D9"/>
-            </w:tcBorders>
-          </w:tcPr>
-          <w:p>
-            <w:pPr>
-              <w:keepNext/>
-              <w:spacing w:line="480" w:lineRule="auto" w:before="0" w:after="0"/>
-              <w:jc w:val="both"/>
-            </w:pPr>
-            <w:r>
-              <w:rPr>
-                <w:rFonts w:ascii="Times New Roman" w:hAnsi="Times New Roman"/>
-                <w:b w:val="0"/>
-                <w:color w:val="000000"/>
-                <w:sz w:val="24"/>
-              </w:rPr>
-              <w:t>Retain the failed acceptance result</w:t>
+              <w:t>Use calibration data only</w:t>
             </w:r>
           </w:p>
         </w:tc>
@@ -2037,7 +1691,7 @@
                 <w:color w:val="000000"/>
                 <w:sz w:val="24"/>
               </w:rPr>
-              <w:t>E151 features harmed processed-image detection</w:t>
+              <w:t>Better average but new AI misses</w:t>
             </w:r>
           </w:p>
         </w:tc>
@@ -2065,12 +1719,26 @@
                 <w:color w:val="000000"/>
                 <w:sz w:val="24"/>
               </w:rPr>
-              <w:t>Reject the candidate and investigate its errors</w:t>
+              <w:t>Reject the candidate</w:t>
             </w:r>
           </w:p>
         </w:tc>
       </w:tr>
     </w:tbl>
+    <w:p>
+      <w:pPr>
+        <w:widowControl/>
+        <w:spacing w:line="480" w:lineRule="auto" w:before="0" w:after="0"/>
+      </w:pPr>
+      <w:r>
+        <w:rPr>
+          <w:rFonts w:ascii="Times New Roman" w:hAnsi="Times New Roman"/>
+          <w:color w:val="000000"/>
+          <w:sz w:val="24"/>
+        </w:rPr>
+        <w:t>Training fitted the model; calibration selected thresholds; development comparisons guided changes. Final evaluation required data uninvolved in those decisions. I tracked AI recall, real-image false alerts and AUC, which measures ranking across thresholds. Python, PyTorch, NumPy, SciPy and scikit-learn supported modelling; React, TypeScript and FastAPI supported the demo. Git, saved scores, artifact hashes and automated checks made changes traceable.</w:t>
+      </w:r>
+    </w:p>
     <w:p>
       <w:pPr>
         <w:pStyle w:val="Heading2"/>
@@ -2097,7 +1765,7 @@
           <w:color w:val="000000"/>
           <w:sz w:val="24"/>
         </w:rPr>
-        <w:t>The intended outcome was a demonstrable image-screening workflow supported by traceable measurements. Deliverables include trained research artifacts, command-line experiments, a local web demo, dataset provenance records and aggregate evidence files. Model2 contributes an experimental localization evaluator and controlled tests. A production-ready universal detector was an aspiration, not a completed deliverable.</w:t>
+        <w:t>The deliverables were trained research components, a local upload demo, reproducible experiment scripts and documented data and results. Model2 contributed an experimental localization evaluator. The prototype was intended for demonstration and further study.</w:t>
       </w:r>
     </w:p>
     <w:p>
@@ -2141,7 +1809,7 @@
           <w:color w:val="000000"/>
           <w:sz w:val="24"/>
         </w:rPr>
-        <w:t>The first phase compared a small CNN, classifiers on frozen embeddings and a pretrained ResNet-18. The CNN used 90,000 CIFAKE training images and 10,000 validation images; its familiar test contained 20,000 images. ResNet improved familiar-test accuracy to 97.66%, yet accuracy on the separate 995-image collection fell to 25.2%. Reproducing the training resolution bottleneck recovered much of that loss. These comparisons showed why a larger familiar dataset and a stronger architecture did not establish reliable transfer (Keleş, 2026, E1–E6).</w:t>
+        <w:t>The first CNN used 90,000 CIFAKE training images, 10,000 validation images and a 20,000-image familiar test. A pretrained ResNet-18 reached 97.66% on the familiar test but only 25.2% on the separate 995-image collection. Matching the training resolution recovered much of this loss. A stronger architecture alone had not solved source transfer (Keleş, 2026, E1–E6).</w:t>
       </w:r>
     </w:p>
     <w:p>
@@ -2155,49 +1823,7 @@
           <w:color w:val="000000"/>
           <w:sz w:val="24"/>
         </w:rPr>
-        <w:t>Native-resolution data, image statistics and tile features were then tested to retain fine detail. Some methods helped particular sources but harmed others. Averaging their scores did not consistently improve detection, so attention shifted toward source coverage and evaluation design.</w:t>
-      </w:r>
-    </w:p>
-    <w:p>
-      <w:pPr>
-        <w:widowControl/>
-        <w:spacing w:line="480" w:lineRule="auto" w:before="0" w:after="0"/>
-      </w:pPr>
-      <w:r>
-        <w:rPr>
-          <w:rFonts w:ascii="Times New Roman" w:hAnsi="Times New Roman"/>
-          <w:color w:val="000000"/>
-          <w:sz w:val="24"/>
-        </w:rPr>
-        <w:t>Later audits qualified the early explanations. Fixed-size crops do not remove every dataset shortcut, and plausible camera-noise arguments do not establish what a model learned. These were hypotheses to test, not universal rules.</w:t>
-      </w:r>
-    </w:p>
-    <w:p>
-      <w:pPr>
-        <w:widowControl/>
-        <w:spacing w:line="480" w:lineRule="auto" w:before="0" w:after="0"/>
-      </w:pPr>
-      <w:r>
-        <w:rPr>
-          <w:rFonts w:ascii="Times New Roman" w:hAnsi="Times New Roman"/>
-          <w:color w:val="000000"/>
-          <w:sz w:val="24"/>
-        </w:rPr>
-        <w:t>The E20 tile model was compared with frozen Community-Forensics and B-Free detectors. Each still falsely flagged particular real-image sources. E26 combined source-calibrated alerts, but modern-generator probes found blind spots. E31 and E32 also lost performance on new real sources, showing why the first working demo required further research (Keleş, 2026, E20–E32).</w:t>
-      </w:r>
-    </w:p>
-    <w:p>
-      <w:pPr>
-        <w:widowControl/>
-        <w:spacing w:line="480" w:lineRule="auto" w:before="0" w:after="0"/>
-      </w:pPr>
-      <w:r>
-        <w:rPr>
-          <w:rFonts w:ascii="Times New Roman" w:hAnsi="Times New Roman"/>
-          <w:color w:val="000000"/>
-          <w:sz w:val="24"/>
-        </w:rPr>
-        <w:t>Threshold changes and balanced sources did not consistently solve transfer. E42 failed an RR evaluation of 16,953 images and 50,858 linked views. E43 improved familiar RR results but struggled with reconstructed images. Specialist combinations also missed GAN images or raised real-photo errors. Later correction models therefore had to reduce false alerts while protecting previously detected AI examples (Keleş, 2026, E33–E50).</w:t>
+        <w:t>Native-resolution statistics, tile features, external detectors and combined scores were then compared. Gains on particular sources often came with new real-photo errors or missed AI types. Fixed crops and camera-noise explanations also needed controls rather than being assumed reliable. These failures shifted attention toward data quality, source coverage and explicit acceptance rules (Keleş, 2026, E8–E50).</w:t>
       </w:r>
     </w:p>
     <w:p>
@@ -2226,35 +1852,7 @@
           <w:color w:val="000000"/>
           <w:sz w:val="24"/>
         </w:rPr>
-        <w:t>A major audit found that two source datasets used the opposite numeric label convention from the project. PixelProof defines 0 as real and 1 as AI, but raw source labels had entered a shared pool without translation. The error affected several earlier experiments. The remedy was an explicit source-to-project label mapping, checks against declared label names, rebuilt indices and reruns of affected experiments (Keleş, 2026, E19b–E19c).</w:t>
-      </w:r>
-    </w:p>
-    <w:p>
-      <w:pPr>
-        <w:widowControl/>
-        <w:spacing w:line="480" w:lineRule="auto" w:before="0" w:after="0"/>
-      </w:pPr>
-      <w:r>
-        <w:rPr>
-          <w:rFonts w:ascii="Times New Roman" w:hAnsi="Times New Roman"/>
-          <w:color w:val="000000"/>
-          <w:sz w:val="24"/>
-        </w:rPr>
-        <w:t>The corrected labels changed which methods were worth pursuing. DINOv2 had scored AUC 0.480 on Defactify, leading to an explanation that its features were unsuitable. After correction, AUC rose to 0.764 and that explanation was withdrawn. The claim that a larger training pool brought little benefit also needed revision: it reduced false alerts more than first reported, although performance still varied by source. The correction changed both the measurements and the next research direction (Keleş, 2026, E19c).</w:t>
-      </w:r>
-    </w:p>
-    <w:p>
-      <w:pPr>
-        <w:widowControl/>
-        <w:spacing w:line="480" w:lineRule="auto" w:before="0" w:after="0"/>
-      </w:pPr>
-      <w:r>
-        <w:rPr>
-          <w:rFonts w:ascii="Times New Roman" w:hAnsi="Times New Roman"/>
-          <w:color w:val="000000"/>
-          <w:sz w:val="24"/>
-        </w:rPr>
-        <w:t>A separate E27 audit found that a threshold-selection procedure could consult evaluation data. The corrected procedure used only calibration data before evaluation. The revised candidate then failed its admission requirement and was removed from the serving path. These corrections establish why the provenance of a score matters as much as its size.</w:t>
+        <w:t>Two datasets used numeric labels opposite to our convention of 0 for real and 1 for AI. Explicit mapping and reruns corrected affected experiments. DINOv2’s Defactify AUC changed from 0.480 to 0.764, invalidating an earlier explanation that its features were unsuitable. The larger training pool also reduced false alerts more than first reported. A separate threshold-selection procedure was repaired because it could consult evaluation data; the corrected candidate failed admission and was removed (Keleş, 2026, E19b–E19c and E27).</w:t>
       </w:r>
     </w:p>
     <w:p>
@@ -2283,7 +1881,7 @@
           <w:color w:val="000000"/>
           <w:sz w:val="24"/>
         </w:rPr>
-        <w:t>The dataset register recorded each source, its licence, intended use and integrity checks. Acquired archives, selected training images and evaluation images were distinct populations. Download size therefore did not measure how many examples trained E92 or how reliable it was. The audit checked identical files, similar images and known shared scenes or prompts. Where origins remained unknown, that uncertainty was retained. A parent image means an original observation before this project creates resized or compressed versions of it.</w:t>
+        <w:t>A parent is one image before project-created transformations. E92 training used 12,269 parents: 7,674 real and 4,595 AI. Four processing conditions produced 49,076 views. These comprised clean input, an assigned transport transformation, JPEG75 and a social-style view capped at 1080 pixels before JPEG75 encoding. Downloaded archive size, selected training data and evaluation size are different quantities. Source, licence, duplicate and known ancestry checks governed admission.</w:t>
       </w:r>
     </w:p>
     <w:p>
@@ -2297,7 +1895,7 @@
           <w:color w:val="000000"/>
           <w:sz w:val="24"/>
         </w:rPr>
-        <w:t>E92 used 12,269 training parent images: 7,674 real and 4,595 AI. Four processing conditions produced 49,076 views. Later research added real images, giving 12,525 parents and 50,100 views; these were not the earlier E92 training counts. Table 2 places the E92 comparison alongside larger earlier evaluations. Each row describes a different model or data role, and the rows must not be summed into one independent test (Keleş, 2026, E42, E49, E92 and E139).</w:t>
+        <w:t>Table 2 separates the major populations; its rows are not additive independent evidence. Earlier E42 and E43 evaluations failed acceptance. E43 passed 11/20 checks on 1,000 real plus 1,000 AI images, with 391 original and 490 processed real false alerts. E92 never reached that final stage because its preceding acceptance rule failed (Keleş, 2026, E42, E49, E92 and E139).</w:t>
       </w:r>
     </w:p>
     <w:p>
@@ -2314,7 +1912,7 @@
           <w:color w:val="000000"/>
           <w:sz w:val="24"/>
         </w:rPr>
-        <w:t>Table 2. Training and evaluation populations at different project stages.</w:t>
+        <w:t>Table 2. Training and evaluation populations at different stages.</w:t>
       </w:r>
     </w:p>
     <w:tbl>
@@ -2325,10 +1923,10 @@
         <w:tblLook w:firstColumn="1" w:firstRow="1" w:lastColumn="0" w:lastRow="0" w:noHBand="0" w:noVBand="1" w:val="04A0"/>
       </w:tblPr>
       <w:tblGrid>
-        <w:gridCol w:w="3096"/>
+        <w:gridCol w:w="2880"/>
         <w:gridCol w:w="1152"/>
         <w:gridCol w:w="1224"/>
-        <w:gridCol w:w="3557"/>
+        <w:gridCol w:w="3773"/>
       </w:tblGrid>
       <w:tr>
         <w:trPr>
@@ -2337,7 +1935,7 @@
         </w:trPr>
         <w:tc>
           <w:tcPr>
-            <w:tcW w:type="dxa" w:w="3096"/>
+            <w:tcW w:type="dxa" w:w="2880"/>
             <w:vAlign w:val="center"/>
             <w:tcBorders>
               <w:top w:val="single" w:sz="4" w:color="D9D9D9"/>
@@ -2424,7 +2022,7 @@
         </w:tc>
         <w:tc>
           <w:tcPr>
-            <w:tcW w:type="dxa" w:w="3557"/>
+            <w:tcW w:type="dxa" w:w="3773"/>
             <w:vAlign w:val="center"/>
             <w:tcBorders>
               <w:top w:val="single" w:sz="4" w:color="D9D9D9"/>
@@ -2458,7 +2056,7 @@
         </w:trPr>
         <w:tc>
           <w:tcPr>
-            <w:tcW w:type="dxa" w:w="3096"/>
+            <w:tcW w:type="dxa" w:w="2880"/>
             <w:vAlign w:val="center"/>
             <w:tcBorders>
               <w:top w:val="single" w:sz="4" w:color="D9D9D9"/>
@@ -2480,7 +2078,7 @@
                 <w:color w:val="000000"/>
                 <w:sz w:val="24"/>
               </w:rPr>
-              <w:t>E42 RR evaluation</w:t>
+              <w:t>E42 evaluation</w:t>
             </w:r>
           </w:p>
         </w:tc>
@@ -2542,7 +2140,7 @@
         </w:tc>
         <w:tc>
           <w:tcPr>
-            <w:tcW w:type="dxa" w:w="3557"/>
+            <w:tcW w:type="dxa" w:w="3773"/>
             <w:vAlign w:val="center"/>
             <w:tcBorders>
               <w:top w:val="single" w:sz="4" w:color="D9D9D9"/>
@@ -2564,7 +2162,7 @@
                 <w:color w:val="000000"/>
                 <w:sz w:val="24"/>
               </w:rPr>
-              <w:t>Earlier model; failed acceptance</w:t>
+              <w:t>Earlier model evaluation</w:t>
             </w:r>
           </w:p>
         </w:tc>
@@ -2575,7 +2173,7 @@
         </w:trPr>
         <w:tc>
           <w:tcPr>
-            <w:tcW w:type="dxa" w:w="3096"/>
+            <w:tcW w:type="dxa" w:w="2880"/>
             <w:vAlign w:val="center"/>
             <w:tcBorders>
               <w:top w:val="single" w:sz="4" w:color="D9D9D9"/>
@@ -2659,7 +2257,7 @@
         </w:tc>
         <w:tc>
           <w:tcPr>
-            <w:tcW w:type="dxa" w:w="3557"/>
+            <w:tcW w:type="dxa" w:w="3773"/>
             <w:vAlign w:val="center"/>
             <w:tcBorders>
               <w:top w:val="single" w:sz="4" w:color="D9D9D9"/>
@@ -2681,7 +2279,7 @@
                 <w:color w:val="000000"/>
                 <w:sz w:val="24"/>
               </w:rPr>
-              <w:t>Earlier final; failed acceptance</w:t>
+              <w:t>Earlier final evaluation</w:t>
             </w:r>
           </w:p>
         </w:tc>
@@ -2692,7 +2290,7 @@
         </w:trPr>
         <w:tc>
           <w:tcPr>
-            <w:tcW w:type="dxa" w:w="3096"/>
+            <w:tcW w:type="dxa" w:w="2880"/>
             <w:vAlign w:val="center"/>
             <w:tcBorders>
               <w:top w:val="single" w:sz="4" w:color="D9D9D9"/>
@@ -2776,7 +2374,7 @@
         </w:tc>
         <w:tc>
           <w:tcPr>
-            <w:tcW w:type="dxa" w:w="3557"/>
+            <w:tcW w:type="dxa" w:w="3773"/>
             <w:vAlign w:val="center"/>
             <w:tcBorders>
               <w:top w:val="single" w:sz="4" w:color="D9D9D9"/>
@@ -2809,7 +2407,7 @@
         </w:trPr>
         <w:tc>
           <w:tcPr>
-            <w:tcW w:type="dxa" w:w="3096"/>
+            <w:tcW w:type="dxa" w:w="2880"/>
             <w:vAlign w:val="center"/>
             <w:tcBorders>
               <w:top w:val="single" w:sz="4" w:color="D9D9D9"/>
@@ -2893,7 +2491,7 @@
         </w:tc>
         <w:tc>
           <w:tcPr>
-            <w:tcW w:type="dxa" w:w="3557"/>
+            <w:tcW w:type="dxa" w:w="3773"/>
             <w:vAlign w:val="center"/>
             <w:tcBorders>
               <w:top w:val="single" w:sz="4" w:color="D9D9D9"/>
@@ -2926,7 +2524,7 @@
         </w:trPr>
         <w:tc>
           <w:tcPr>
-            <w:tcW w:type="dxa" w:w="3096"/>
+            <w:tcW w:type="dxa" w:w="2880"/>
             <w:vAlign w:val="center"/>
             <w:tcBorders>
               <w:top w:val="single" w:sz="4" w:color="D9D9D9"/>
@@ -2937,7 +2535,7 @@
           </w:tcPr>
           <w:p>
             <w:pPr>
-              <w:keepNext/>
+              <w:keepNext w:val="0"/>
               <w:spacing w:line="480" w:lineRule="auto" w:before="0" w:after="0"/>
               <w:jc w:val="both"/>
             </w:pPr>
@@ -2948,7 +2546,7 @@
                 <w:color w:val="000000"/>
                 <w:sz w:val="24"/>
               </w:rPr>
-              <w:t>Later source-fold research</w:t>
+              <w:t>Later research</w:t>
             </w:r>
           </w:p>
         </w:tc>
@@ -2965,7 +2563,7 @@
           </w:tcPr>
           <w:p>
             <w:pPr>
-              <w:keepNext/>
+              <w:keepNext w:val="0"/>
               <w:spacing w:line="480" w:lineRule="auto" w:before="0" w:after="0"/>
               <w:jc w:val="both"/>
             </w:pPr>
@@ -2993,7 +2591,7 @@
           </w:tcPr>
           <w:p>
             <w:pPr>
-              <w:keepNext/>
+              <w:keepNext w:val="0"/>
               <w:spacing w:line="480" w:lineRule="auto" w:before="0" w:after="0"/>
               <w:jc w:val="both"/>
             </w:pPr>
@@ -3010,40 +2608,7 @@
         </w:tc>
         <w:tc>
           <w:tcPr>
-            <w:tcW w:type="dxa" w:w="3557"/>
-            <w:vAlign w:val="center"/>
-            <w:tcBorders>
-              <w:top w:val="single" w:sz="4" w:color="D9D9D9"/>
-              <w:left w:val="single" w:sz="4" w:color="D9D9D9"/>
-              <w:bottom w:val="single" w:sz="4" w:color="D9D9D9"/>
-              <w:right w:val="single" w:sz="4" w:color="D9D9D9"/>
-            </w:tcBorders>
-          </w:tcPr>
-          <w:p>
-            <w:pPr>
-              <w:keepNext/>
-              <w:spacing w:line="480" w:lineRule="auto" w:before="0" w:after="0"/>
-              <w:jc w:val="both"/>
-            </w:pPr>
-            <w:r>
-              <w:rPr>
-                <w:rFonts w:ascii="Times New Roman" w:hAnsi="Times New Roman"/>
-                <w:b w:val="0"/>
-                <w:color w:val="000000"/>
-                <w:sz w:val="24"/>
-              </w:rPr>
-              <w:t>Internal diagnostics</w:t>
-            </w:r>
-          </w:p>
-        </w:tc>
-      </w:tr>
-      <w:tr>
-        <w:trPr>
-          <w:cantSplit/>
-        </w:trPr>
-        <w:tc>
-          <w:tcPr>
-            <w:tcW w:type="dxa" w:w="3096"/>
+            <w:tcW w:type="dxa" w:w="3773"/>
             <w:vAlign w:val="center"/>
             <w:tcBorders>
               <w:top w:val="single" w:sz="4" w:color="D9D9D9"/>
@@ -3065,124 +2630,12 @@
                 <w:color w:val="000000"/>
                 <w:sz w:val="24"/>
               </w:rPr>
-              <w:t>Model2 controlled pilot</w:t>
-            </w:r>
-          </w:p>
-        </w:tc>
-        <w:tc>
-          <w:tcPr>
-            <w:tcW w:type="dxa" w:w="1152"/>
-            <w:vAlign w:val="center"/>
-            <w:tcBorders>
-              <w:top w:val="single" w:sz="4" w:color="D9D9D9"/>
-              <w:left w:val="single" w:sz="4" w:color="D9D9D9"/>
-              <w:bottom w:val="single" w:sz="4" w:color="D9D9D9"/>
-              <w:right w:val="single" w:sz="4" w:color="D9D9D9"/>
-            </w:tcBorders>
-          </w:tcPr>
-          <w:p>
-            <w:pPr>
-              <w:keepNext w:val="0"/>
-              <w:spacing w:line="480" w:lineRule="auto" w:before="0" w:after="0"/>
-              <w:jc w:val="both"/>
-            </w:pPr>
-            <w:r>
-              <w:rPr>
-                <w:rFonts w:ascii="Times New Roman" w:hAnsi="Times New Roman"/>
-                <w:b w:val="0"/>
-                <w:color w:val="000000"/>
-                <w:sz w:val="24"/>
-              </w:rPr>
-              <w:t>16</w:t>
-            </w:r>
-          </w:p>
-        </w:tc>
-        <w:tc>
-          <w:tcPr>
-            <w:tcW w:type="dxa" w:w="1224"/>
-            <w:vAlign w:val="center"/>
-            <w:tcBorders>
-              <w:top w:val="single" w:sz="4" w:color="D9D9D9"/>
-              <w:left w:val="single" w:sz="4" w:color="D9D9D9"/>
-              <w:bottom w:val="single" w:sz="4" w:color="D9D9D9"/>
-              <w:right w:val="single" w:sz="4" w:color="D9D9D9"/>
-            </w:tcBorders>
-          </w:tcPr>
-          <w:p>
-            <w:pPr>
-              <w:keepNext w:val="0"/>
-              <w:spacing w:line="480" w:lineRule="auto" w:before="0" w:after="0"/>
-              <w:jc w:val="both"/>
-            </w:pPr>
-            <w:r>
-              <w:rPr>
-                <w:rFonts w:ascii="Times New Roman" w:hAnsi="Times New Roman"/>
-                <w:b w:val="0"/>
-                <w:color w:val="000000"/>
-                <w:sz w:val="24"/>
-              </w:rPr>
-              <w:t>192 in E135</w:t>
-            </w:r>
-          </w:p>
-        </w:tc>
-        <w:tc>
-          <w:tcPr>
-            <w:tcW w:type="dxa" w:w="3557"/>
-            <w:vAlign w:val="center"/>
-            <w:tcBorders>
-              <w:top w:val="single" w:sz="4" w:color="D9D9D9"/>
-              <w:left w:val="single" w:sz="4" w:color="D9D9D9"/>
-              <w:bottom w:val="single" w:sz="4" w:color="D9D9D9"/>
-              <w:right w:val="single" w:sz="4" w:color="D9D9D9"/>
-            </w:tcBorders>
-          </w:tcPr>
-          <w:p>
-            <w:pPr>
-              <w:keepNext w:val="0"/>
-              <w:spacing w:line="480" w:lineRule="auto" w:before="0" w:after="0"/>
-              <w:jc w:val="both"/>
-            </w:pPr>
-            <w:r>
-              <w:rPr>
-                <w:rFonts w:ascii="Times New Roman" w:hAnsi="Times New Roman"/>
-                <w:b w:val="0"/>
-                <w:color w:val="000000"/>
-                <w:sz w:val="24"/>
-              </w:rPr>
-              <w:t>Adaptive development</w:t>
+              <w:t>Internal diagnostics</w:t>
             </w:r>
           </w:p>
         </w:tc>
       </w:tr>
     </w:tbl>
-    <w:p>
-      <w:pPr>
-        <w:widowControl/>
-        <w:spacing w:line="480" w:lineRule="auto" w:before="0" w:after="0"/>
-      </w:pPr>
-      <w:r>
-        <w:rPr>
-          <w:rFonts w:ascii="Times New Roman" w:hAnsi="Times New Roman"/>
-          <w:color w:val="000000"/>
-          <w:sz w:val="24"/>
-        </w:rPr>
-        <w:t>The four training conditions were clean input, an assigned transport transformation, JPEG quality 75 and a social-style transformation that limited the longest side to 1080 pixels before JPEG quality 75 encoding. The development comparison used original and social-style views of the same 320 parents. More transformed views improve coverage of a processing question, but do not create more independent photographs.</w:t>
-      </w:r>
-    </w:p>
-    <w:p>
-      <w:pPr>
-        <w:widowControl/>
-        <w:spacing w:line="480" w:lineRule="auto" w:before="0" w:after="0"/>
-      </w:pPr>
-      <w:r>
-        <w:rPr>
-          <w:rFonts w:ascii="Times New Roman" w:hAnsi="Times New Roman"/>
-          <w:color w:val="000000"/>
-          <w:sz w:val="24"/>
-        </w:rPr>
-        <w:t>An earlier, larger E49-C test contained 1,000 real and 1,000 AI parent images. E43 falsely flagged 391 real originals and 490 processed copies, while detecting 943 and 955 AI images respectively. It passed 11 of 20 checks. After inspection, these results could guide research but no longer serve as an untouched final test. E92 was not evaluated on this collection because it failed the earlier acceptance stage. Its later 20/20 development result therefore cannot be reported as passing E49-C (Keleş, 2026, E49 and E92).</w:t>
-      </w:r>
-    </w:p>
     <w:p>
       <w:pPr>
         <w:pStyle w:val="Heading3"/>
@@ -3209,7 +2662,7 @@
           <w:color w:val="000000"/>
           <w:sz w:val="24"/>
         </w:rPr>
-        <w:t>The route to E92 involved several rejected alternatives. Broader real-image coverage reduced false alerts but sometimes lost AI detections. Fine-tuning, grayscale input and small score corrections did not meet the full requirements. Later work added CLIP and DEAR features, a learned representation, and processing conditions closer to web use. E83 and E86 each passed 17 of 20 development checks. Additional training coverage preceded E92, although this sequence alone does not prove which added source caused the improvement (Keleş, 2026, E51–E92).</w:t>
+        <w:t>Fine-tuning, grayscale inputs and early score corrections failed the full requirements. Later work added CLIP and DEAR features and learned adaptation; E83 and E86 passed 17/20 development checks before E92 reached 20/20. This sequence alone does not isolate which addition caused improvement (Keleş, 2026, E51–E92).</w:t>
       </w:r>
     </w:p>
     <w:p>
@@ -3223,21 +2676,7 @@
           <w:color w:val="000000"/>
           <w:sz w:val="24"/>
         </w:rPr>
-        <w:t>E92 uses pretrained DINOv2, CLIP and DEAR components to turn images into numerical features. Their weights stay fixed. Project-trained components then learn how to use those features, and a correction adjusts the reference score. The correction was constrained to protect AI responses on training examples while reducing errors on difficult real-image sources. This protection had to be checked again on development images; a training constraint alone could not guarantee it.</w:t>
-      </w:r>
-    </w:p>
-    <w:p>
-      <w:pPr>
-        <w:widowControl/>
-        <w:spacing w:line="480" w:lineRule="auto" w:before="0" w:after="0"/>
-      </w:pPr>
-      <w:r>
-        <w:rPr>
-          <w:rFonts w:ascii="Times New Roman" w:hAnsi="Times New Roman"/>
-          <w:color w:val="000000"/>
-          <w:sz w:val="24"/>
-        </w:rPr>
-        <w:t>Figure 2 shows the application-level information flow. It deliberately separates frozen pretrained components, project adaptation and the interface decision. The browser receives a validated response rather than fitting a model. The local service verifies required artifacts and uses the original image plus a fixed processed view. No file name or camera declaration is an automatic authenticity rule.</w:t>
+        <w:t>E92 uses feature-based transfer learning. Pretrained DINOv2, CLIP and DEAR components remain fixed, while project-trained components learn to use their features. A constrained correction adjusts the reference score to reduce real-image errors while protecting AI responses on training examples. That protection still needs evaluation on other images. Figure 2 shows how the learned system connects to the interface.</w:t>
       </w:r>
     </w:p>
     <w:p>
@@ -3301,21 +2740,7 @@
           <w:color w:val="000000"/>
           <w:sz w:val="24"/>
         </w:rPr>
-        <w:t>Figure 2. PixelProof inference flow and separation of model evidence from display policy.</w:t>
-      </w:r>
-    </w:p>
-    <w:p>
-      <w:pPr>
-        <w:widowControl/>
-        <w:spacing w:line="480" w:lineRule="auto" w:before="0" w:after="0"/>
-      </w:pPr>
-      <w:r>
-        <w:rPr>
-          <w:rFonts w:ascii="Times New Roman" w:hAnsi="Times New Roman"/>
-          <w:color w:val="000000"/>
-          <w:sz w:val="24"/>
-        </w:rPr>
-        <w:t>This architecture is a composite research system. Referring to it as one downloadable universal model would conceal its dependencies, provenance limits and licensing conditions. E92 is the identifier of a frozen candidate, not a percentage score or a count of training epochs.</w:t>
+        <w:t>Figure 2. PixelProof inference flow from upload to displayed evidence.</w:t>
       </w:r>
     </w:p>
     <w:p>
@@ -3344,7 +2769,7 @@
           <w:color w:val="000000"/>
           <w:sz w:val="24"/>
         </w:rPr>
-        <w:t>Figure 3 compares false alerts on exactly the same real development images. E92 reduced original-view false alerts from 68 of 160 for E43 to zero, and processed-view false alerts from 68 to 14. E86 was the preceding intermediate candidate. The comparison is paired and descriptive; it is not an independent estimate for all future photographs.</w:t>
+        <w:t>Figure 3 compares the same 160 real development images. False alerts fell from 68 to zero for originals and from 68 to 14 for processed views. E92 detected 159 of 160 AI images in each condition. Ten numerical requirements per condition passed, but one original AI image previously detected by E43 became a new miss. The separate retention rule therefore failed.</w:t>
       </w:r>
     </w:p>
     <w:p>
@@ -3408,7 +2833,7 @@
           <w:color w:val="000000"/>
           <w:sz w:val="24"/>
         </w:rPr>
-        <w:t>Figure 3. Real-image false alerts on the reused development set, with 160 real images per condition.</w:t>
+        <w:t>Figure 3. False alerts among 160 real development images per condition.</w:t>
       </w:r>
     </w:p>
     <w:p>
@@ -3422,35 +2847,7 @@
           <w:color w:val="000000"/>
           <w:sz w:val="24"/>
         </w:rPr>
-        <w:t>E92 detected 159 of 160 AI images in each condition. It passed ten numerical requirements for originals and the same ten for processed views. However, it newly missed one original AI image that E43 had caught. Other recovered AI images could not cancel that loss under the predeclared retention rule. Consequently, the full set of acceptance requirements failed despite the 20/20 numerical milestone.</w:t>
-      </w:r>
-    </w:p>
-    <w:p>
-      <w:pPr>
-        <w:widowControl/>
-        <w:spacing w:line="480" w:lineRule="auto" w:before="0" w:after="0"/>
-      </w:pPr>
-      <w:r>
-        <w:rPr>
-          <w:rFonts w:ascii="Times New Roman" w:hAnsi="Times New Roman"/>
-          <w:color w:val="000000"/>
-          <w:sz w:val="24"/>
-        </w:rPr>
-        <w:t>The development collection contains 160 real observations from only ten SIDD scenes and 160 AI images from two previously seen families. Repeated use influenced later research choices. The result therefore supports progress on this collection, while leaving adaptive selection bias and unseen-source reliability unresolved. Thirteen of the fourteen processed real false alerts concentrate in two scenes, which also shows why a pooled rate can conceal weaknesses.</w:t>
-      </w:r>
-    </w:p>
-    <w:p>
-      <w:pPr>
-        <w:widowControl/>
-        <w:spacing w:line="480" w:lineRule="auto" w:before="0" w:after="0"/>
-      </w:pPr>
-      <w:r>
-        <w:rPr>
-          <w:rFonts w:ascii="Times New Roman" w:hAnsi="Times New Roman"/>
-          <w:color w:val="000000"/>
-          <w:sz w:val="24"/>
-        </w:rPr>
-        <w:t>The later E102 candidate reduced processed-view real false alerts further, from 14 to 12 of 160, and retained every E92-detected AI image. Nevertheless, it still missed the same E43-detected original AI example and failed complete acceptance. It was not promoted, and its gallery and E49 evaluations were not opened. E92 therefore identifies the current demo version, not the lowest value ever recorded in a development table (Keleş, 2026, E102).</w:t>
+        <w:t>This reused collection contains only ten real SIDD scenes and two previously seen AI families. Thirteen of the fourteen processed real errors cluster in two scenes. Repeated use influenced later decisions, limiting generalization claims. E102 lowered processed false alerts to 12/160 but retained the same reference-relative AI miss, so it was not promoted (Keleş, 2026, E92 and E102).</w:t>
       </w:r>
     </w:p>
     <w:p>
@@ -3479,7 +2876,7 @@
           <w:color w:val="000000"/>
           <w:sz w:val="24"/>
         </w:rPr>
-        <w:t>The demo reports AI evidence, no clear AI evidence or uncertainty. It cannot certify authenticity. On its 0–100 score scale, the upper threshold is about 7.94 and the lower about 1.15. The upper came from E48 calibration with real-photo false-alert limits; the lower came from E49 analysis of already-used calibration and development data. These are experimental operating points, not probabilities or universal optima.</w:t>
+        <w:t>The demo’s 0–100 scale is a model score, not an AI probability. Its upper threshold is about 7.94, inherited from E48 calibration; its lower threshold is about 1.15, from already-used E49 calibration/development analysis. An original score at or above the upper threshold retains an AI alert. Two E92 scores below the lower threshold yield no clear AI evidence; other cases are uncertain. E43 provides advice without vetoing two low E92 scores. Decisions use unrounded values.</w:t>
       </w:r>
     </w:p>
     <w:p>
@@ -3493,35 +2890,7 @@
           <w:color w:val="000000"/>
           <w:sz w:val="24"/>
         </w:rPr>
-        <w:t>An original score at or above the upper threshold keeps an AI alert visible, with a review warning if needed. Both E92 views below the lower threshold yield no clear AI evidence; remaining cases are uncertain. E43 provides a separate advisory and cannot veto two low E92 scores. Decisions use unrounded scores rather than a 50% boundary.</w:t>
-      </w:r>
-    </w:p>
-    <w:p>
-      <w:pPr>
-        <w:widowControl/>
-        <w:spacing w:line="480" w:lineRule="auto" w:before="0" w:after="0"/>
-      </w:pPr>
-      <w:r>
-        <w:rPr>
-          <w:rFonts w:ascii="Times New Roman" w:hAnsi="Times New Roman"/>
-          <w:color w:val="000000"/>
-          <w:sz w:val="24"/>
-        </w:rPr>
-        <w:t>The combined rule was checked on the same 320 development images. Among 160 real images, 139 received no clear AI evidence, 21 were uncertain and none received an AI alert. Among 160 AI images, 159 received an alert and one was uncertain. Thus 14 processed-view false alerts do not mean 14 final website warnings: a low original score can leave the combined result uncertain. These reused observations do not predict every future upload (Keleş, 2026, current-policy audit).</w:t>
-      </w:r>
-    </w:p>
-    <w:p>
-      <w:pPr>
-        <w:widowControl/>
-        <w:spacing w:line="480" w:lineRule="auto" w:before="0" w:after="0"/>
-      </w:pPr>
-      <w:r>
-        <w:rPr>
-          <w:rFonts w:ascii="Times New Roman" w:hAnsi="Times New Roman"/>
-          <w:color w:val="000000"/>
-          <w:sz w:val="24"/>
-        </w:rPr>
-        <w:t>The service rejects unsupported or oversized uploads, checks model files before loading and reports unavailable models explicitly. Cancellation handling prevents overlapping heavy inference jobs, and the browser validates response fields. These repairs improve reliable operation; they do not increase measured detection accuracy.</w:t>
+        <w:t>On the same development collection, the combined rule gave 139 real images no clear AI evidence and left 21 uncertain, with zero real AI alerts. It alerted on 159 AI images and left one uncertain. Thus per-view false alerts and final website warnings are different measurements. Upload validation, artifact checks and cancellation handling improve software operation, not measured detection accuracy (Keleş, 2026, current-policy audit).</w:t>
       </w:r>
     </w:p>
     <w:p>
@@ -3550,7 +2919,7 @@
           <w:color w:val="000000"/>
           <w:sz w:val="24"/>
         </w:rPr>
-        <w:t>The owner-gallery check found 9 false AI alerts among 206 distinct original real-image files, rising to 18 after social-style processing: 4.37% and 8.74%. The gallery mostly represents one phone and related scenes. It had already influenced earlier development and calibration decisions, so it is not an independent test. It nevertheless shows practical mistakes that the main development result could hide. Private photographs and individual file identifiers are excluded from this report (Keleş, 2026, E95).</w:t>
+        <w:t>The owner gallery produced 9 false alerts among 206 real originals and 18 after processing. Mostly one phone and related scenes, it had already influenced development and was not independent. Separate source-fold research models also failed full acceptance; their results do not measure active E92 performance (Keleş, 2026, E95 and E146).</w:t>
       </w:r>
     </w:p>
     <w:p>
@@ -3564,49 +2933,7 @@
           <w:color w:val="000000"/>
           <w:sz w:val="24"/>
         </w:rPr>
-        <w:t>Later research compared fresh diagnostic heads using source-separated folds. E146 tested calibration on one source fold and evaluation on another. Three of six calibration assignments were feasible, but no assignment met the full evaluation conditions. These were separate diagnostic models, not changes to E92. The result rejects that tested calibration recipe rather than proving that all calibration is impossible.</w:t>
-      </w:r>
-    </w:p>
-    <w:p>
-      <w:pPr>
-        <w:widowControl/>
-        <w:spacing w:line="480" w:lineRule="auto" w:before="0" w:after="0"/>
-      </w:pPr>
-      <w:r>
-        <w:rPr>
-          <w:rFonts w:ascii="Times New Roman" w:hAnsi="Times New Roman"/>
-          <w:color w:val="000000"/>
-          <w:sz w:val="24"/>
-        </w:rPr>
-        <w:t>E148 found a processing imbalance in the existing training collection: known 224-pixel derivatives represented 29.18% of real images and 7.68% of AI images. Such differences are possible shortcuts, not evidence of a specific causal mechanism. E150B successfully extracted new source-pixel features for all 12,525 parents after a memory-safe implementation amendment.</w:t>
-      </w:r>
-    </w:p>
-    <w:p>
-      <w:pPr>
-        <w:widowControl/>
-        <w:spacing w:line="480" w:lineRule="auto" w:before="0" w:after="0"/>
-      </w:pPr>
-      <w:r>
-        <w:rPr>
-          <w:rFonts w:ascii="Times New Roman" w:hAnsi="Times New Roman"/>
-          <w:color w:val="000000"/>
-          <w:sz w:val="24"/>
-        </w:rPr>
-        <w:t>The added features slightly improved clean-image averages but reduced AI detection after all three tested processing conditions. In one JPEG75 comparison, detection fell from 75.73% to 74.15%. A follow-up analysis examined 131 newly missed AI views. The added residual feature term was the largest harmful score change in 94 cases. This helped locate a weakness, but did not prove that removing the term would fix it. The candidate was rejected (Keleş, 2026, E151–E152).</w:t>
-      </w:r>
-    </w:p>
-    <w:p>
-      <w:pPr>
-        <w:widowControl/>
-        <w:spacing w:line="480" w:lineRule="auto" w:before="0" w:after="0"/>
-      </w:pPr>
-      <w:r>
-        <w:rPr>
-          <w:rFonts w:ascii="Times New Roman" w:hAnsi="Times New Roman"/>
-          <w:color w:val="000000"/>
-          <w:sz w:val="24"/>
-        </w:rPr>
-        <w:t>The later training audit could form only three AI-bearing groups under the known source relationships. Some shared origins and prompts remained unknown. Another 300 AI images in MNW and 100 real images in HDR+ remained unscored, but they had not been approved together as a balanced, independent final test. Unused data are useful only if their coverage and independence answer the intended question (Keleş, 2026, E139–E146).</w:t>
+        <w:t>A processing audit found known 224-pixel derivatives in 29.18% of real training images versus 7.68% of AI images. Added source-pixel features slightly improved clean averages but harmed processed AI detection; one JPEG75 result fell from 75.73% to 74.15%. Follow-up decomposition identified harmful score contributions, without proving a physical cause. The candidate was rejected. Unscored reserves remained, but no balanced, independent final test was established (Keleş, 2026, E148–E152).</w:t>
       </w:r>
     </w:p>
     <w:p>
@@ -3635,7 +2962,7 @@
           <w:color w:val="000000"/>
           <w:sz w:val="24"/>
         </w:rPr>
-        <w:t>Model2 compares predicted edit regions with reference masks and checks authentic images for false alarms. Early tests used the true mask size to choose the predicted area, which made their overlap scores misleading. In the later 120-image CocoGlide evaluation, a simple central-region baseline still outperformed the detector. This prompted tests with edits placed elsewhere. A separate audit also found shared COCO image origins, limiting claims of independent data (Keleş, 2026, E17, E107 and E115–E117).</w:t>
+        <w:t>Model2 predicts edited regions and checks authentic images for false alarms. An early overlap evaluation improperly used true mask size to choose predicted area. Later, a central-region baseline outperformed the detector on 120 CocoGlide images; shared COCO origins also limited independence. These findings motivated a placement test using sixteen reused parents and one Stable Diffusion 1.5 editor (Keleş, 2026, E17 and E107–E135).</w:t>
       </w:r>
     </w:p>
     <w:p>
@@ -3649,7 +2976,7 @@
           <w:color w:val="000000"/>
           <w:sz w:val="24"/>
         </w:rPr>
-        <w:t>The controlled pilot used sixteen previously inspected images and one Stable Diffusion 1.5 editor. Moving edits reduced the earlier model’s pixel AUC from 0.742 to 0.566. Training on both placements partly recovered new-placement performance, but harmed original-placement performance and highlighted more authentic pixels incorrectly. Table 3 summarizes these trade-offs, with AUC rounded to two decimals (Keleş, 2026, E132–E135).</w:t>
+        <w:t>Table 3 shows that training on two edit placements improved the new placement but harmed the original placement and increased false markings on authentic images. The candidate was rejected. Moving edits also changes content, so the result does not isolate location as the sole cause. Model2 remains experimental.</w:t>
       </w:r>
     </w:p>
     <w:p>
@@ -3666,7 +2993,7 @@
           <w:color w:val="000000"/>
           <w:sz w:val="24"/>
         </w:rPr>
-        <w:t>Table 3. Model2 placement sensitivity on sixteen reused parents, original-image condition.</w:t>
+        <w:t>Table 3. Model2 trade-offs on sixteen reused parents, original-image condition.</w:t>
       </w:r>
     </w:p>
     <w:tbl>
@@ -4044,22 +3371,7 @@
     </w:tbl>
     <w:p>
       <w:pPr>
-        <w:widowControl/>
-        <w:spacing w:line="480" w:lineRule="auto" w:before="0" w:after="0"/>
-      </w:pPr>
-      <w:r>
-        <w:rPr>
-          <w:rFonts w:ascii="Times New Roman" w:hAnsi="Times New Roman"/>
-          <w:color w:val="000000"/>
-          <w:sz w:val="24"/>
-        </w:rPr>
-        <w:t>The candidate was rejected because improvements introduced other errors. Moving masks also changes edited content, so this is not pure causal proof of location bias. Model2 remains experimental and needs independent parents and more editors.</w:t>
-      </w:r>
-    </w:p>
-    <w:p>
-      <w:pPr>
         <w:pStyle w:val="Heading2"/>
-        <w:pageBreakBefore/>
         <w:widowControl/>
         <w:spacing w:line="480" w:lineRule="auto" w:before="0" w:after="0"/>
       </w:pPr>
@@ -4083,7 +3395,7 @@
           <w:color w:val="000000"/>
           <w:sz w:val="24"/>
         </w:rPr>
-        <w:t>The project delivered a trained E92 research system, a local web demonstration and a reproducible record of model development and rejection. Table 4 reports the central E92 per-view outcome at the fixed upper cut. The parent collection is reused development data, with 160 real and 160 AI images per condition. These rates do not describe the paired interface policy.</w:t>
+        <w:t>The completed outcome is an E92 research system, local demo and reproducible development record. Table 4 summarizes per-view results on 160 real plus 160 AI development images, not the paired website outcomes in Section 4.5.6.</w:t>
       </w:r>
     </w:p>
     <w:p>
@@ -4100,7 +3412,7 @@
           <w:color w:val="000000"/>
           <w:sz w:val="24"/>
         </w:rPr>
-        <w:t>Table 4. E92 per-view results on the reused E66 development collection.</w:t>
+        <w:t>Table 4. E92 per-view results on the reused development collection.</w:t>
       </w:r>
     </w:p>
     <w:tbl>
@@ -4665,13 +3977,12 @@
           <w:color w:val="000000"/>
           <w:sz w:val="24"/>
         </w:rPr>
-        <w:t>The 20 numerical checks passed, but full acceptance failed because of the one new original AI miss. Universal reliability and independent final-test success were not achieved. Model2 did not qualify as a reliable localization service. The latest recorded engineering checkpoint passed 1,245 Python tests; this measures software checks, not 1,245 successful image classifications. There is no measured company deployment impact or production rollout commitment. The completed outcome is a student research prototype with documented limitations (Keleş, 2026).</w:t>
+        <w:t>The numerical improvement did not meet full acceptance or prove universal reliability. Model2 also remained experimental. The engineering checkpoint passed 1,245 Python tests, which check software behavior rather than image accuracy. No production rollout or company deployment impact was measured (Keleş, 2026).</w:t>
       </w:r>
     </w:p>
     <w:p>
       <w:pPr>
         <w:pStyle w:val="Heading1"/>
-        <w:pageBreakBefore/>
         <w:widowControl/>
         <w:spacing w:line="480" w:lineRule="auto" w:before="0" w:after="0"/>
       </w:pPr>
@@ -4710,21 +4021,7 @@
           <w:color w:val="000000"/>
           <w:sz w:val="24"/>
         </w:rPr>
-        <w:t>The most useful lesson from the work is to ask what a good score actually proves. The first high accuracy values encouraged further development, but errors on new sources changed the priority. The project then needed better data checks and comparisons, not just a larger model. The reversed-label incident is the clearest example: checking the inputs overturned an explanation that had sounded convincing.</w:t>
-      </w:r>
-    </w:p>
-    <w:p>
-      <w:pPr>
-        <w:widowControl/>
-        <w:spacing w:line="480" w:lineRule="auto" w:before="0" w:after="0"/>
-      </w:pPr>
-      <w:r>
-        <w:rPr>
-          <w:rFonts w:ascii="Times New Roman" w:hAnsi="Times New Roman"/>
-          <w:color w:val="000000"/>
-          <w:sz w:val="24"/>
-        </w:rPr>
-        <w:t>I learned how to sustain a long project on my own and reduce its scope when the work became too complex. Asking focused questions helped me communicate problems and use advice while remaining responsible for my decisions. Running my own experiments made machine learning concepts more concrete. I was already interested in this field before the internship; applying it in a substantial project strengthened that interest and gave me a clearer understanding of the work involved.</w:t>
+        <w:t>I learned to ask what a good score actually proves. Early accuracy looked promising, but failures on new sources and the label correction changed my conclusions. I also learned to sustain an individual project, reduce scope when it became too complex and ask focused questions. Practical experiments made machine learning concepts clearer and strengthened my existing interest in the field.</w:t>
       </w:r>
     </w:p>
     <w:p>
@@ -4753,21 +4050,7 @@
           <w:color w:val="000000"/>
           <w:sz w:val="24"/>
         </w:rPr>
-        <w:t>CS412 Machine Learning gave me the concepts I used to start this project and develop the initial experiments. PROJ201 had introduced me to applied machine learning through a team project for an application intended to guide visually impaired users. We trained YOLOv11 on a custom dataset and integrated it into the application; our team placed first in our group. That experience gave me an initial understanding of model training and application integration. DSA210 provided my early foundations in data science, which helped me approach the data preparation and analysis in this internship.</w:t>
-      </w:r>
-    </w:p>
-    <w:p>
-      <w:pPr>
-        <w:widowControl/>
-        <w:spacing w:line="480" w:lineRule="auto" w:before="0" w:after="0"/>
-      </w:pPr>
-      <w:r>
-        <w:rPr>
-          <w:rFonts w:ascii="Times New Roman" w:hAnsi="Times New Roman"/>
-          <w:color w:val="000000"/>
-          <w:sz w:val="24"/>
-        </w:rPr>
-        <w:t>The internship exposed preparation needs beyond the initial model fit. Experimental design and data provenance required particular attention: valid image files could still have inconsistent labels, and different files could share scenes or generation ancestry. These issues became clearer through the project’s failed experiments and corrections.</w:t>
+        <w:t>CS412 Machine Learning provided the concepts for the first experiments. In PROJ201, our team trained YOLOv11 on a custom dataset and integrated it into an application intended to guide visually impaired users; we placed first in our group. DSA210 provided foundations in data science. The internship showed that I also needed stronger preparation in experimental design and data provenance, especially label consistency and shared image origins.</w:t>
       </w:r>
     </w:p>
     <w:p>
@@ -4796,35 +4079,7 @@
           <w:color w:val="000000"/>
           <w:sz w:val="24"/>
         </w:rPr>
-        <w:t>The first difficulty was unreliable transfer across sources. Strong internal scores did not prevent false alarms on unfamiliar real photographs. The response was to expand documented source coverage, report errors by group and distinguish training, calibration and evaluation. The generalization problem remains partly unresolved, so the report records the response without claiming a complete solution.</w:t>
-      </w:r>
-    </w:p>
-    <w:p>
-      <w:pPr>
-        <w:widowControl/>
-        <w:spacing w:line="480" w:lineRule="auto" w:before="0" w:after="0"/>
-      </w:pPr>
-      <w:r>
-        <w:rPr>
-          <w:rFonts w:ascii="Times New Roman" w:hAnsi="Times New Roman"/>
-          <w:color w:val="000000"/>
-          <w:sz w:val="24"/>
-        </w:rPr>
-        <w:t>The second difficulty was trustworthy measurement. Reversed source labels and an evaluation-dependent threshold procedure changed the meaning of earlier results. Explicit label mapping, isolated calibration and reruns corrected the affected evidence. The history retained both original and corrected conclusions, making the correction auditable.</w:t>
-      </w:r>
-    </w:p>
-    <w:p>
-      <w:pPr>
-        <w:widowControl/>
-        <w:spacing w:line="480" w:lineRule="auto" w:before="0" w:after="0"/>
-      </w:pPr>
-      <w:r>
-        <w:rPr>
-          <w:rFonts w:ascii="Times New Roman" w:hAnsi="Times New Roman"/>
-          <w:color w:val="000000"/>
-          <w:sz w:val="24"/>
-        </w:rPr>
-        <w:t>The third difficulty was running a multi-component research system within local resource and reliability limits. Feature caching, bounded batches and resource guards helped. An E150 memory failure led to a separately recorded, pixel-equivalent implementation amendment, E150B. Runtime checks addressed cancellation and artifact-manifest handling without changing the scientific model. These are concrete engineering repairs rather than proof of better detection.</w:t>
+        <w:t>The first difficulty was source transfer. Expanding documented coverage and inspecting group-level errors helped, but generalization remains unresolved. The second was measurement integrity: explicit label mapping, isolated calibration and reruns corrected misleading results. The third was local resource and runtime limits. Feature caching and bounded batches helped; a memory failure required a separately recorded implementation repair. Cancellation and artifact checks improved operation without changing the model.</w:t>
       </w:r>
     </w:p>
     <w:p>
@@ -4853,21 +4108,7 @@
           <w:color w:val="000000"/>
           <w:sz w:val="24"/>
         </w:rPr>
-        <w:t>The approved schedule was Monday through Thursday on site and Friday remote. On office days, I usually arrived at 7:30 a.m. After breakfast, I worked through the morning until around noon or early afternoon. I continued working afterwards, with occasional short tea or coffee breaks.</w:t>
-      </w:r>
-    </w:p>
-    <w:p>
-      <w:pPr>
-        <w:widowControl/>
-        <w:spacing w:line="480" w:lineRule="auto" w:before="0" w:after="0"/>
-      </w:pPr>
-      <w:r>
-        <w:rPr>
-          <w:rFonts w:ascii="Times New Roman" w:hAnsi="Times New Roman"/>
-          <w:color w:val="000000"/>
-          <w:sz w:val="24"/>
-        </w:rPr>
-        <w:t>My tasks followed the stage of the project: reviewing the plan, implementing a change, running experiments, interpreting results and updating the records. When a question arose, I consulted my supervisor or mentors for clarification and then decided how to proceed. This routine helped me maintain progress during a long individual project.</w:t>
+        <w:t>On office days, I usually arrived at 7:30 a.m. After breakfast, I worked through the morning until around noon or early afternoon, then continued with occasional tea or coffee breaks. Work involved reviewing the plan, implementation, experiments, interpretation and updating records. I asked my supervisor or mentors for clarification when needed and then decided how to proceed. Fridays were remote.</w:t>
       </w:r>
     </w:p>
     <w:p>
@@ -4897,41 +4138,12 @@
           <w:color w:val="000000"/>
           <w:sz w:val="24"/>
         </w:rPr>
-        <w:t>PixelProof progressed from early classifiers with large source-transfer failures to a working research demo with strong results on a defined development collection. E92 reduced real-image false alerts while maintaining high aggregate AI detection in that collection. The interface now distinguishes a model signal from an authenticity claim and separates the main model from an advisory reference.</w:t>
+        <w:t>PixelProof became a working research prototype that substantially reduced real-image false alerts on a defined development collection. Its value also lies in the record of corrections and rejected ideas. The remaining reference-relative AI miss, repeated development-data use and later source failures prevent a claim of universal reliability. Model2 needs broader evidence before use beyond experiments.</w:t>
       </w:r>
     </w:p>
     <w:p>
       <w:pPr>
-        <w:widowControl/>
-        <w:spacing w:line="480" w:lineRule="auto" w:before="0" w:after="0"/>
-      </w:pPr>
-      <w:r>
-        <w:rPr>
-          <w:rFonts w:ascii="Times New Roman" w:hAnsi="Times New Roman"/>
-          <w:color w:val="000000"/>
-          <w:sz w:val="24"/>
-        </w:rPr>
-        <w:t>The main result has a clear limit. All 20 numerical checks passed, but one AI image caught by the reference became a new miss. Reusing the development collection also limits claims about new sources. Later source tests and the Model2 pilot exposed other weaknesses. Keeping these failures in the records helped explain why candidates were rejected and why the demo remained a research prototype.</w:t>
-      </w:r>
-    </w:p>
-    <w:p>
-      <w:pPr>
-        <w:widowControl/>
-        <w:spacing w:line="480" w:lineRule="auto" w:before="0" w:after="0"/>
-      </w:pPr>
-      <w:r>
-        <w:rPr>
-          <w:rFonts w:ascii="Times New Roman" w:hAnsi="Times New Roman"/>
-          <w:color w:val="000000"/>
-          <w:sz w:val="24"/>
-        </w:rPr>
-        <w:t>The durable outcome is both an implemented prototype and a traceable method of evaluating it. Data corrections, rejected hypotheses and runtime repairs are part of that outcome. They support a credible student engineering project while identifying exactly which claims need further evidence.</w:t>
-      </w:r>
-    </w:p>
-    <w:p>
-      <w:pPr>
         <w:pStyle w:val="Heading1"/>
-        <w:pageBreakBefore/>
         <w:widowControl/>
         <w:spacing w:line="480" w:lineRule="auto" w:before="0" w:after="0"/>
       </w:pPr>
@@ -4955,35 +4167,7 @@
           <w:color w:val="000000"/>
           <w:sz w:val="24"/>
         </w:rPr>
-        <w:t>Future internship students should establish dataset meanings, permissible data roles and error metrics before a long training run. They should learn to reproduce a saved result and inspect individual changes, since a better average can hide newly harmed examples. Basic familiarity with version control, Python testing and the host organization’s data rules would reduce avoidable delays.</w:t>
-      </w:r>
-    </w:p>
-    <w:p>
-      <w:pPr>
-        <w:widowControl/>
-        <w:spacing w:line="480" w:lineRule="auto" w:before="0" w:after="0"/>
-      </w:pPr>
-      <w:r>
-        <w:rPr>
-          <w:rFonts w:ascii="Times New Roman" w:hAnsi="Times New Roman"/>
-          <w:color w:val="000000"/>
-          <w:sz w:val="24"/>
-        </w:rPr>
-        <w:t>For this project, the next research priority is an explicitly independent and sufficiently diverse evaluation design. Source ancestry, scene dependence and generator coverage should be resolved before claiming independence. Calibration must remain separate from evaluation, and operating costs should determine a prospectively chosen decision policy. Model2 needs more independent parents and editors together with authentic and conventional-edit controls.</w:t>
-      </w:r>
-    </w:p>
-    <w:p>
-      <w:pPr>
-        <w:widowControl/>
-        <w:spacing w:line="480" w:lineRule="auto" w:before="0" w:after="0"/>
-      </w:pPr>
-      <w:r>
-        <w:rPr>
-          <w:rFonts w:ascii="Times New Roman" w:hAnsi="Times New Roman"/>
-          <w:color w:val="000000"/>
-          <w:sz w:val="24"/>
-        </w:rPr>
-        <w:t>In the workplace, students should agree on scope and review expectations with their supervisor, record incomplete work honestly and protect personal or restricted data. Results should be communicated in plain language: what changed, which population supports the finding and what still fails. AI coding assistance can accelerate work, but the student must understand and verify what will be submitted and presented.</w:t>
+        <w:t>Future work should establish an independent evaluation with diverse cameras and generators, verified source ancestry and calibration separated from evaluation. Model2 needs more independent parents and editors, including authentic and conventional-edit controls. Future interns should agree on scope early, learn to reproduce saved results, keep failures in the record and communicate what the evidence supports. AI assistance requires checking its output and understanding the work personally.</w:t>
       </w:r>
     </w:p>
     <w:p>
@@ -5029,7 +4213,7 @@
           <w:color w:val="000000"/>
           <w:sz w:val="24"/>
         </w:rPr>
-        <w:t>Adobe. (n.d.). Content Credentials overview. Adobe Help Center. Retrieved September 25, 2026, from https://helpx.adobe.com/creative-cloud/apps/adobe-content-authenticity/content-credentials/overview.html</w:t>
+        <w:t>Adobe. (2026, August 25). Content Credentials overview. Adobe Help Center. Retrieved September 29, 2026, from https://helpx.adobe.com/creative-cloud/apps/adobe-content-authenticity/content-credentials/overview.html</w:t>
       </w:r>
     </w:p>
     <w:p>
@@ -6651,7 +5835,6 @@
     <w:p>
       <w:pPr>
         <w:pStyle w:val="Heading2"/>
-        <w:pageBreakBefore/>
         <w:widowControl/>
         <w:spacing w:line="480" w:lineRule="auto" w:before="0" w:after="0"/>
       </w:pPr>
@@ -6675,724 +5858,7 @@
           <w:color w:val="000000"/>
           <w:sz w:val="24"/>
         </w:rPr>
-        <w:t>Table 6 maps the principal findings to compact repository evidence. The source snapshot is commit 497d45c. Large weights, datasets and private predictions remain outside Git. Reproducing an existing receipt is distinct from training a new candidate or opening a protected final collection.</w:t>
-      </w:r>
-    </w:p>
-    <w:p>
-      <w:pPr>
-        <w:pStyle w:val="Caption"/>
-        <w:keepNext/>
-        <w:widowControl/>
-        <w:spacing w:line="480" w:lineRule="auto" w:before="0" w:after="0"/>
-        <w:jc w:val="center"/>
-      </w:pPr>
-      <w:r>
-        <w:rPr>
-          <w:rFonts w:ascii="Times New Roman" w:hAnsi="Times New Roman"/>
-          <w:color w:val="000000"/>
-          <w:sz w:val="24"/>
-        </w:rPr>
-        <w:t>Table 6. Primary project evidence for the report.</w:t>
-      </w:r>
-    </w:p>
-    <w:tbl>
-      <w:tblPr>
-        <w:tblW w:type="auto" w:w="0"/>
-        <w:jc w:val="center"/>
-        <w:tblLayout w:type="fixed"/>
-        <w:tblLook w:firstColumn="1" w:firstRow="1" w:lastColumn="0" w:lastRow="0" w:noHBand="0" w:noVBand="1" w:val="04A0"/>
-      </w:tblPr>
-      <w:tblGrid>
-        <w:gridCol w:w="3528"/>
-        <w:gridCol w:w="5501"/>
-      </w:tblGrid>
-      <w:tr>
-        <w:trPr>
-          <w:tblHeader/>
-          <w:cantSplit/>
-        </w:trPr>
-        <w:tc>
-          <w:tcPr>
-            <w:tcW w:type="dxa" w:w="3528"/>
-            <w:vAlign w:val="center"/>
-            <w:tcBorders>
-              <w:top w:val="single" w:sz="4" w:color="D9D9D9"/>
-              <w:left w:val="single" w:sz="4" w:color="D9D9D9"/>
-              <w:bottom w:val="single" w:sz="4" w:color="D9D9D9"/>
-              <w:right w:val="single" w:sz="4" w:color="D9D9D9"/>
-            </w:tcBorders>
-            <w:shd w:fill="EFEFEF"/>
-          </w:tcPr>
-          <w:p>
-            <w:pPr>
-              <w:keepNext/>
-              <w:spacing w:line="480" w:lineRule="auto" w:before="0" w:after="0"/>
-              <w:jc w:val="both"/>
-            </w:pPr>
-            <w:r>
-              <w:rPr>
-                <w:rFonts w:ascii="Times New Roman" w:hAnsi="Times New Roman"/>
-                <w:b/>
-                <w:color w:val="000000"/>
-                <w:sz w:val="24"/>
-              </w:rPr>
-              <w:t>Finding</w:t>
-            </w:r>
-          </w:p>
-        </w:tc>
-        <w:tc>
-          <w:tcPr>
-            <w:tcW w:type="dxa" w:w="5501"/>
-            <w:vAlign w:val="center"/>
-            <w:tcBorders>
-              <w:top w:val="single" w:sz="4" w:color="D9D9D9"/>
-              <w:left w:val="single" w:sz="4" w:color="D9D9D9"/>
-              <w:bottom w:val="single" w:sz="4" w:color="D9D9D9"/>
-              <w:right w:val="single" w:sz="4" w:color="D9D9D9"/>
-            </w:tcBorders>
-            <w:shd w:fill="EFEFEF"/>
-          </w:tcPr>
-          <w:p>
-            <w:pPr>
-              <w:keepNext/>
-              <w:spacing w:line="480" w:lineRule="auto" w:before="0" w:after="0"/>
-              <w:jc w:val="both"/>
-            </w:pPr>
-            <w:r>
-              <w:rPr>
-                <w:rFonts w:ascii="Times New Roman" w:hAnsi="Times New Roman"/>
-                <w:b/>
-                <w:color w:val="000000"/>
-                <w:sz w:val="24"/>
-              </w:rPr>
-              <w:t>Repository evidence</w:t>
-            </w:r>
-          </w:p>
-        </w:tc>
-      </w:tr>
-      <w:tr>
-        <w:trPr>
-          <w:cantSplit/>
-        </w:trPr>
-        <w:tc>
-          <w:tcPr>
-            <w:tcW w:type="dxa" w:w="3528"/>
-            <w:vAlign w:val="center"/>
-            <w:tcBorders>
-              <w:top w:val="single" w:sz="4" w:color="D9D9D9"/>
-              <w:left w:val="single" w:sz="4" w:color="D9D9D9"/>
-              <w:bottom w:val="single" w:sz="4" w:color="D9D9D9"/>
-              <w:right w:val="single" w:sz="4" w:color="D9D9D9"/>
-            </w:tcBorders>
-          </w:tcPr>
-          <w:p>
-            <w:pPr>
-              <w:keepNext/>
-              <w:spacing w:line="480" w:lineRule="auto" w:before="0" w:after="0"/>
-              <w:jc w:val="both"/>
-            </w:pPr>
-            <w:r>
-              <w:rPr>
-                <w:rFonts w:ascii="Times New Roman" w:hAnsi="Times New Roman"/>
-                <w:b w:val="0"/>
-                <w:color w:val="000000"/>
-                <w:sz w:val="24"/>
-              </w:rPr>
-              <w:t>Earlier comprehensive-final failure</w:t>
-            </w:r>
-          </w:p>
-        </w:tc>
-        <w:tc>
-          <w:tcPr>
-            <w:tcW w:type="dxa" w:w="5501"/>
-            <w:vAlign w:val="center"/>
-            <w:tcBorders>
-              <w:top w:val="single" w:sz="4" w:color="D9D9D9"/>
-              <w:left w:val="single" w:sz="4" w:color="D9D9D9"/>
-              <w:bottom w:val="single" w:sz="4" w:color="D9D9D9"/>
-              <w:right w:val="single" w:sz="4" w:color="D9D9D9"/>
-            </w:tcBorders>
-          </w:tcPr>
-          <w:p>
-            <w:pPr>
-              <w:keepNext/>
-              <w:spacing w:line="480" w:lineRule="auto" w:before="0" w:after="0"/>
-              <w:jc w:val="both"/>
-            </w:pPr>
-            <w:r>
-              <w:rPr>
-                <w:rFonts w:ascii="Times New Roman" w:hAnsi="Times New Roman"/>
-                <w:b w:val="0"/>
-                <w:color w:val="000000"/>
-                <w:sz w:val="24"/>
-              </w:rPr>
-              <w:t>evidence/e49_final_result.json</w:t>
-            </w:r>
-          </w:p>
-        </w:tc>
-      </w:tr>
-      <w:tr>
-        <w:trPr>
-          <w:cantSplit/>
-        </w:trPr>
-        <w:tc>
-          <w:tcPr>
-            <w:tcW w:type="dxa" w:w="3528"/>
-            <w:vAlign w:val="center"/>
-            <w:tcBorders>
-              <w:top w:val="single" w:sz="4" w:color="D9D9D9"/>
-              <w:left w:val="single" w:sz="4" w:color="D9D9D9"/>
-              <w:bottom w:val="single" w:sz="4" w:color="D9D9D9"/>
-              <w:right w:val="single" w:sz="4" w:color="D9D9D9"/>
-            </w:tcBorders>
-          </w:tcPr>
-          <w:p>
-            <w:pPr>
-              <w:keepNext/>
-              <w:spacing w:line="480" w:lineRule="auto" w:before="0" w:after="0"/>
-              <w:jc w:val="both"/>
-            </w:pPr>
-            <w:r>
-              <w:rPr>
-                <w:rFonts w:ascii="Times New Roman" w:hAnsi="Times New Roman"/>
-                <w:b w:val="0"/>
-                <w:color w:val="000000"/>
-                <w:sz w:val="24"/>
-              </w:rPr>
-              <w:t>E92 numerical result and failed retention</w:t>
-            </w:r>
-          </w:p>
-        </w:tc>
-        <w:tc>
-          <w:tcPr>
-            <w:tcW w:type="dxa" w:w="5501"/>
-            <w:vAlign w:val="center"/>
-            <w:tcBorders>
-              <w:top w:val="single" w:sz="4" w:color="D9D9D9"/>
-              <w:left w:val="single" w:sz="4" w:color="D9D9D9"/>
-              <w:bottom w:val="single" w:sz="4" w:color="D9D9D9"/>
-              <w:right w:val="single" w:sz="4" w:color="D9D9D9"/>
-            </w:tcBorders>
-          </w:tcPr>
-          <w:p>
-            <w:pPr>
-              <w:keepNext/>
-              <w:spacing w:line="480" w:lineRule="auto" w:before="0" w:after="0"/>
-              <w:jc w:val="both"/>
-            </w:pPr>
-            <w:r>
-              <w:rPr>
-                <w:rFonts w:ascii="Times New Roman" w:hAnsi="Times New Roman"/>
-                <w:b w:val="0"/>
-                <w:color w:val="000000"/>
-                <w:sz w:val="24"/>
-              </w:rPr>
-              <w:t>evidence/e92_development.json</w:t>
-            </w:r>
-          </w:p>
-        </w:tc>
-      </w:tr>
-      <w:tr>
-        <w:trPr>
-          <w:cantSplit/>
-        </w:trPr>
-        <w:tc>
-          <w:tcPr>
-            <w:tcW w:type="dxa" w:w="3528"/>
-            <w:vAlign w:val="center"/>
-            <w:tcBorders>
-              <w:top w:val="single" w:sz="4" w:color="D9D9D9"/>
-              <w:left w:val="single" w:sz="4" w:color="D9D9D9"/>
-              <w:bottom w:val="single" w:sz="4" w:color="D9D9D9"/>
-              <w:right w:val="single" w:sz="4" w:color="D9D9D9"/>
-            </w:tcBorders>
-          </w:tcPr>
-          <w:p>
-            <w:pPr>
-              <w:keepNext/>
-              <w:spacing w:line="480" w:lineRule="auto" w:before="0" w:after="0"/>
-              <w:jc w:val="both"/>
-            </w:pPr>
-            <w:r>
-              <w:rPr>
-                <w:rFonts w:ascii="Times New Roman" w:hAnsi="Times New Roman"/>
-                <w:b w:val="0"/>
-                <w:color w:val="000000"/>
-                <w:sz w:val="24"/>
-              </w:rPr>
-              <w:t>Unpromoted E102 successor</w:t>
-            </w:r>
-          </w:p>
-        </w:tc>
-        <w:tc>
-          <w:tcPr>
-            <w:tcW w:type="dxa" w:w="5501"/>
-            <w:vAlign w:val="center"/>
-            <w:tcBorders>
-              <w:top w:val="single" w:sz="4" w:color="D9D9D9"/>
-              <w:left w:val="single" w:sz="4" w:color="D9D9D9"/>
-              <w:bottom w:val="single" w:sz="4" w:color="D9D9D9"/>
-              <w:right w:val="single" w:sz="4" w:color="D9D9D9"/>
-            </w:tcBorders>
-          </w:tcPr>
-          <w:p>
-            <w:pPr>
-              <w:keepNext/>
-              <w:spacing w:line="480" w:lineRule="auto" w:before="0" w:after="0"/>
-              <w:jc w:val="both"/>
-            </w:pPr>
-            <w:r>
-              <w:rPr>
-                <w:rFonts w:ascii="Times New Roman" w:hAnsi="Times New Roman"/>
-                <w:b w:val="0"/>
-                <w:color w:val="000000"/>
-                <w:sz w:val="24"/>
-              </w:rPr>
-              <w:t>evidence/e102_development.json</w:t>
-            </w:r>
-          </w:p>
-        </w:tc>
-      </w:tr>
-      <w:tr>
-        <w:trPr>
-          <w:cantSplit/>
-        </w:trPr>
-        <w:tc>
-          <w:tcPr>
-            <w:tcW w:type="dxa" w:w="3528"/>
-            <w:vAlign w:val="center"/>
-            <w:tcBorders>
-              <w:top w:val="single" w:sz="4" w:color="D9D9D9"/>
-              <w:left w:val="single" w:sz="4" w:color="D9D9D9"/>
-              <w:bottom w:val="single" w:sz="4" w:color="D9D9D9"/>
-              <w:right w:val="single" w:sz="4" w:color="D9D9D9"/>
-            </w:tcBorders>
-          </w:tcPr>
-          <w:p>
-            <w:pPr>
-              <w:keepNext/>
-              <w:spacing w:line="480" w:lineRule="auto" w:before="0" w:after="0"/>
-              <w:jc w:val="both"/>
-            </w:pPr>
-            <w:r>
-              <w:rPr>
-                <w:rFonts w:ascii="Times New Roman" w:hAnsi="Times New Roman"/>
-                <w:b w:val="0"/>
-                <w:color w:val="000000"/>
-                <w:sz w:val="24"/>
-              </w:rPr>
-              <w:t>Bias and readiness audit</w:t>
-            </w:r>
-          </w:p>
-        </w:tc>
-        <w:tc>
-          <w:tcPr>
-            <w:tcW w:type="dxa" w:w="5501"/>
-            <w:vAlign w:val="center"/>
-            <w:tcBorders>
-              <w:top w:val="single" w:sz="4" w:color="D9D9D9"/>
-              <w:left w:val="single" w:sz="4" w:color="D9D9D9"/>
-              <w:bottom w:val="single" w:sz="4" w:color="D9D9D9"/>
-              <w:right w:val="single" w:sz="4" w:color="D9D9D9"/>
-            </w:tcBorders>
-          </w:tcPr>
-          <w:p>
-            <w:pPr>
-              <w:keepNext/>
-              <w:spacing w:line="480" w:lineRule="auto" w:before="0" w:after="0"/>
-              <w:jc w:val="both"/>
-            </w:pPr>
-            <w:r>
-              <w:rPr>
-                <w:rFonts w:ascii="Times New Roman" w:hAnsi="Times New Roman"/>
-                <w:b w:val="0"/>
-                <w:color w:val="000000"/>
-                <w:sz w:val="24"/>
-              </w:rPr>
-              <w:t>evidence/e92_readiness_audit_2026-09-14.json</w:t>
-            </w:r>
-          </w:p>
-        </w:tc>
-      </w:tr>
-      <w:tr>
-        <w:trPr>
-          <w:cantSplit/>
-        </w:trPr>
-        <w:tc>
-          <w:tcPr>
-            <w:tcW w:type="dxa" w:w="3528"/>
-            <w:vAlign w:val="center"/>
-            <w:tcBorders>
-              <w:top w:val="single" w:sz="4" w:color="D9D9D9"/>
-              <w:left w:val="single" w:sz="4" w:color="D9D9D9"/>
-              <w:bottom w:val="single" w:sz="4" w:color="D9D9D9"/>
-              <w:right w:val="single" w:sz="4" w:color="D9D9D9"/>
-            </w:tcBorders>
-          </w:tcPr>
-          <w:p>
-            <w:pPr>
-              <w:keepNext/>
-              <w:spacing w:line="480" w:lineRule="auto" w:before="0" w:after="0"/>
-              <w:jc w:val="both"/>
-            </w:pPr>
-            <w:r>
-              <w:rPr>
-                <w:rFonts w:ascii="Times New Roman" w:hAnsi="Times New Roman"/>
-                <w:b w:val="0"/>
-                <w:color w:val="000000"/>
-                <w:sz w:val="24"/>
-              </w:rPr>
-              <w:t>Current paired interface policy</w:t>
-            </w:r>
-          </w:p>
-        </w:tc>
-        <w:tc>
-          <w:tcPr>
-            <w:tcW w:type="dxa" w:w="5501"/>
-            <w:vAlign w:val="center"/>
-            <w:tcBorders>
-              <w:top w:val="single" w:sz="4" w:color="D9D9D9"/>
-              <w:left w:val="single" w:sz="4" w:color="D9D9D9"/>
-              <w:bottom w:val="single" w:sz="4" w:color="D9D9D9"/>
-              <w:right w:val="single" w:sz="4" w:color="D9D9D9"/>
-            </w:tcBorders>
-          </w:tcPr>
-          <w:p>
-            <w:pPr>
-              <w:keepNext/>
-              <w:spacing w:line="480" w:lineRule="auto" w:before="0" w:after="0"/>
-              <w:jc w:val="both"/>
-            </w:pPr>
-            <w:r>
-              <w:rPr>
-                <w:rFonts w:ascii="Times New Roman" w:hAnsi="Times New Roman"/>
-                <w:b w:val="0"/>
-                <w:color w:val="000000"/>
-                <w:sz w:val="24"/>
-              </w:rPr>
-              <w:t>evidence/project_audit_20260916.json</w:t>
-            </w:r>
-          </w:p>
-        </w:tc>
-      </w:tr>
-      <w:tr>
-        <w:trPr>
-          <w:cantSplit/>
-        </w:trPr>
-        <w:tc>
-          <w:tcPr>
-            <w:tcW w:type="dxa" w:w="3528"/>
-            <w:vAlign w:val="center"/>
-            <w:tcBorders>
-              <w:top w:val="single" w:sz="4" w:color="D9D9D9"/>
-              <w:left w:val="single" w:sz="4" w:color="D9D9D9"/>
-              <w:bottom w:val="single" w:sz="4" w:color="D9D9D9"/>
-              <w:right w:val="single" w:sz="4" w:color="D9D9D9"/>
-            </w:tcBorders>
-          </w:tcPr>
-          <w:p>
-            <w:pPr>
-              <w:keepNext/>
-              <w:spacing w:line="480" w:lineRule="auto" w:before="0" w:after="0"/>
-              <w:jc w:val="both"/>
-            </w:pPr>
-            <w:r>
-              <w:rPr>
-                <w:rFonts w:ascii="Times New Roman" w:hAnsi="Times New Roman"/>
-                <w:b w:val="0"/>
-                <w:color w:val="000000"/>
-                <w:sz w:val="24"/>
-              </w:rPr>
-              <w:t>Owner-gallery aggregate results</w:t>
-            </w:r>
-          </w:p>
-        </w:tc>
-        <w:tc>
-          <w:tcPr>
-            <w:tcW w:type="dxa" w:w="5501"/>
-            <w:vAlign w:val="center"/>
-            <w:tcBorders>
-              <w:top w:val="single" w:sz="4" w:color="D9D9D9"/>
-              <w:left w:val="single" w:sz="4" w:color="D9D9D9"/>
-              <w:bottom w:val="single" w:sz="4" w:color="D9D9D9"/>
-              <w:right w:val="single" w:sz="4" w:color="D9D9D9"/>
-            </w:tcBorders>
-          </w:tcPr>
-          <w:p>
-            <w:pPr>
-              <w:keepNext/>
-              <w:spacing w:line="480" w:lineRule="auto" w:before="0" w:after="0"/>
-              <w:jc w:val="both"/>
-            </w:pPr>
-            <w:r>
-              <w:rPr>
-                <w:rFonts w:ascii="Times New Roman" w:hAnsi="Times New Roman"/>
-                <w:b w:val="0"/>
-                <w:color w:val="000000"/>
-                <w:sz w:val="24"/>
-              </w:rPr>
-              <w:t>evidence/e95_gallery_report.json</w:t>
-            </w:r>
-          </w:p>
-        </w:tc>
-      </w:tr>
-      <w:tr>
-        <w:trPr>
-          <w:cantSplit/>
-        </w:trPr>
-        <w:tc>
-          <w:tcPr>
-            <w:tcW w:type="dxa" w:w="3528"/>
-            <w:vAlign w:val="center"/>
-            <w:tcBorders>
-              <w:top w:val="single" w:sz="4" w:color="D9D9D9"/>
-              <w:left w:val="single" w:sz="4" w:color="D9D9D9"/>
-              <w:bottom w:val="single" w:sz="4" w:color="D9D9D9"/>
-              <w:right w:val="single" w:sz="4" w:color="D9D9D9"/>
-            </w:tcBorders>
-          </w:tcPr>
-          <w:p>
-            <w:pPr>
-              <w:keepNext/>
-              <w:spacing w:line="480" w:lineRule="auto" w:before="0" w:after="0"/>
-              <w:jc w:val="both"/>
-            </w:pPr>
-            <w:r>
-              <w:rPr>
-                <w:rFonts w:ascii="Times New Roman" w:hAnsi="Times New Roman"/>
-                <w:b w:val="0"/>
-                <w:color w:val="000000"/>
-                <w:sz w:val="24"/>
-              </w:rPr>
-              <w:t>Model2 placement comparison</w:t>
-            </w:r>
-          </w:p>
-        </w:tc>
-        <w:tc>
-          <w:tcPr>
-            <w:tcW w:type="dxa" w:w="5501"/>
-            <w:vAlign w:val="center"/>
-            <w:tcBorders>
-              <w:top w:val="single" w:sz="4" w:color="D9D9D9"/>
-              <w:left w:val="single" w:sz="4" w:color="D9D9D9"/>
-              <w:bottom w:val="single" w:sz="4" w:color="D9D9D9"/>
-              <w:right w:val="single" w:sz="4" w:color="D9D9D9"/>
-            </w:tcBorders>
-          </w:tcPr>
-          <w:p>
-            <w:pPr>
-              <w:keepNext/>
-              <w:spacing w:line="480" w:lineRule="auto" w:before="0" w:after="0"/>
-              <w:jc w:val="both"/>
-            </w:pPr>
-            <w:r>
-              <w:rPr>
-                <w:rFonts w:ascii="Times New Roman" w:hAnsi="Times New Roman"/>
-                <w:b w:val="0"/>
-                <w:color w:val="000000"/>
-                <w:sz w:val="24"/>
-              </w:rPr>
-              <w:t>evidence/e135_location_learning.json</w:t>
-            </w:r>
-          </w:p>
-        </w:tc>
-      </w:tr>
-      <w:tr>
-        <w:trPr>
-          <w:cantSplit/>
-        </w:trPr>
-        <w:tc>
-          <w:tcPr>
-            <w:tcW w:type="dxa" w:w="3528"/>
-            <w:vAlign w:val="center"/>
-            <w:tcBorders>
-              <w:top w:val="single" w:sz="4" w:color="D9D9D9"/>
-              <w:left w:val="single" w:sz="4" w:color="D9D9D9"/>
-              <w:bottom w:val="single" w:sz="4" w:color="D9D9D9"/>
-              <w:right w:val="single" w:sz="4" w:color="D9D9D9"/>
-            </w:tcBorders>
-          </w:tcPr>
-          <w:p>
-            <w:pPr>
-              <w:keepNext/>
-              <w:spacing w:line="480" w:lineRule="auto" w:before="0" w:after="0"/>
-              <w:jc w:val="both"/>
-            </w:pPr>
-            <w:r>
-              <w:rPr>
-                <w:rFonts w:ascii="Times New Roman" w:hAnsi="Times New Roman"/>
-                <w:b w:val="0"/>
-                <w:color w:val="000000"/>
-                <w:sz w:val="24"/>
-              </w:rPr>
-              <w:t>Processing imbalance</w:t>
-            </w:r>
-          </w:p>
-        </w:tc>
-        <w:tc>
-          <w:tcPr>
-            <w:tcW w:type="dxa" w:w="5501"/>
-            <w:vAlign w:val="center"/>
-            <w:tcBorders>
-              <w:top w:val="single" w:sz="4" w:color="D9D9D9"/>
-              <w:left w:val="single" w:sz="4" w:color="D9D9D9"/>
-              <w:bottom w:val="single" w:sz="4" w:color="D9D9D9"/>
-              <w:right w:val="single" w:sz="4" w:color="D9D9D9"/>
-            </w:tcBorders>
-          </w:tcPr>
-          <w:p>
-            <w:pPr>
-              <w:keepNext/>
-              <w:spacing w:line="480" w:lineRule="auto" w:before="0" w:after="0"/>
-              <w:jc w:val="both"/>
-            </w:pPr>
-            <w:r>
-              <w:rPr>
-                <w:rFonts w:ascii="Times New Roman" w:hAnsi="Times New Roman"/>
-                <w:b w:val="0"/>
-                <w:color w:val="000000"/>
-                <w:sz w:val="24"/>
-              </w:rPr>
-              <w:t>evidence/e148_processing_inventory.json</w:t>
-            </w:r>
-          </w:p>
-        </w:tc>
-      </w:tr>
-      <w:tr>
-        <w:trPr>
-          <w:cantSplit/>
-        </w:trPr>
-        <w:tc>
-          <w:tcPr>
-            <w:tcW w:type="dxa" w:w="3528"/>
-            <w:vAlign w:val="center"/>
-            <w:tcBorders>
-              <w:top w:val="single" w:sz="4" w:color="D9D9D9"/>
-              <w:left w:val="single" w:sz="4" w:color="D9D9D9"/>
-              <w:bottom w:val="single" w:sz="4" w:color="D9D9D9"/>
-              <w:right w:val="single" w:sz="4" w:color="D9D9D9"/>
-            </w:tcBorders>
-          </w:tcPr>
-          <w:p>
-            <w:pPr>
-              <w:keepNext/>
-              <w:spacing w:line="480" w:lineRule="auto" w:before="0" w:after="0"/>
-              <w:jc w:val="both"/>
-            </w:pPr>
-            <w:r>
-              <w:rPr>
-                <w:rFonts w:ascii="Times New Roman" w:hAnsi="Times New Roman"/>
-                <w:b w:val="0"/>
-                <w:color w:val="000000"/>
-                <w:sz w:val="24"/>
-              </w:rPr>
-              <w:t>Residual-feature rejection</w:t>
-            </w:r>
-          </w:p>
-        </w:tc>
-        <w:tc>
-          <w:tcPr>
-            <w:tcW w:type="dxa" w:w="5501"/>
-            <w:vAlign w:val="center"/>
-            <w:tcBorders>
-              <w:top w:val="single" w:sz="4" w:color="D9D9D9"/>
-              <w:left w:val="single" w:sz="4" w:color="D9D9D9"/>
-              <w:bottom w:val="single" w:sz="4" w:color="D9D9D9"/>
-              <w:right w:val="single" w:sz="4" w:color="D9D9D9"/>
-            </w:tcBorders>
-          </w:tcPr>
-          <w:p>
-            <w:pPr>
-              <w:keepNext/>
-              <w:spacing w:line="480" w:lineRule="auto" w:before="0" w:after="0"/>
-              <w:jc w:val="both"/>
-            </w:pPr>
-            <w:r>
-              <w:rPr>
-                <w:rFonts w:ascii="Times New Roman" w:hAnsi="Times New Roman"/>
-                <w:b w:val="0"/>
-                <w:color w:val="000000"/>
-                <w:sz w:val="24"/>
-              </w:rPr>
-              <w:t>evidence/e151_source_pixel_comparison.json</w:t>
-            </w:r>
-          </w:p>
-        </w:tc>
-      </w:tr>
-      <w:tr>
-        <w:trPr>
-          <w:cantSplit/>
-        </w:trPr>
-        <w:tc>
-          <w:tcPr>
-            <w:tcW w:type="dxa" w:w="3528"/>
-            <w:vAlign w:val="center"/>
-            <w:tcBorders>
-              <w:top w:val="single" w:sz="4" w:color="D9D9D9"/>
-              <w:left w:val="single" w:sz="4" w:color="D9D9D9"/>
-              <w:bottom w:val="single" w:sz="4" w:color="D9D9D9"/>
-              <w:right w:val="single" w:sz="4" w:color="D9D9D9"/>
-            </w:tcBorders>
-          </w:tcPr>
-          <w:p>
-            <w:pPr>
-              <w:keepNext w:val="0"/>
-              <w:spacing w:line="480" w:lineRule="auto" w:before="0" w:after="0"/>
-              <w:jc w:val="both"/>
-            </w:pPr>
-            <w:r>
-              <w:rPr>
-                <w:rFonts w:ascii="Times New Roman" w:hAnsi="Times New Roman"/>
-                <w:b w:val="0"/>
-                <w:color w:val="000000"/>
-                <w:sz w:val="24"/>
-              </w:rPr>
-              <w:t>Fixed-model score decomposition</w:t>
-            </w:r>
-          </w:p>
-        </w:tc>
-        <w:tc>
-          <w:tcPr>
-            <w:tcW w:type="dxa" w:w="5501"/>
-            <w:vAlign w:val="center"/>
-            <w:tcBorders>
-              <w:top w:val="single" w:sz="4" w:color="D9D9D9"/>
-              <w:left w:val="single" w:sz="4" w:color="D9D9D9"/>
-              <w:bottom w:val="single" w:sz="4" w:color="D9D9D9"/>
-              <w:right w:val="single" w:sz="4" w:color="D9D9D9"/>
-            </w:tcBorders>
-          </w:tcPr>
-          <w:p>
-            <w:pPr>
-              <w:keepNext w:val="0"/>
-              <w:spacing w:line="480" w:lineRule="auto" w:before="0" w:after="0"/>
-              <w:jc w:val="both"/>
-            </w:pPr>
-            <w:r>
-              <w:rPr>
-                <w:rFonts w:ascii="Times New Roman" w:hAnsi="Times New Roman"/>
-                <w:b w:val="0"/>
-                <w:color w:val="000000"/>
-                <w:sz w:val="24"/>
-              </w:rPr>
-              <w:t>evidence/e152_logit_decomposition.json</w:t>
-            </w:r>
-          </w:p>
-        </w:tc>
-      </w:tr>
-    </w:tbl>
-    <w:p>
-      <w:pPr>
-        <w:widowControl/>
-        <w:spacing w:line="480" w:lineRule="auto" w:before="0" w:after="0"/>
-      </w:pPr>
-      <w:r>
-        <w:rPr>
-          <w:rFonts w:ascii="Times New Roman" w:hAnsi="Times New Roman"/>
-          <w:color w:val="000000"/>
-          <w:sz w:val="24"/>
-        </w:rPr>
-        <w:t>AI recall is TP divided by TP plus FN. Real false-positive rate is FP divided by FP plus TN. Balanced accuracy averages AI recall and real specificity. Automatic coverage is the fraction receiving an automatic decision; accuracy among those decisions excludes abstentions from its denominator. Pixel AUC ranks edited against unedited locations, while intersection-over-union measures overlap at a chosen map threshold. These quantities answer different questions and should not be exchanged.</w:t>
+        <w:t>Full experiment settings, corrections and aggregate evidence remain in the repository snapshot cited as Keleş (2026). Private images and large weights are excluded from Git.</w:t>
       </w:r>
     </w:p>
     <w:sectPr>

</xml_diff>

<commit_message>
docs: simplify internship package to 21 pages and ten-minute talk
</commit_message>
<xml_diff>
--- a/rapor/final_2026/deliverables/CS395_FinalReport_EfeHan_Keles_25September2026.docx
+++ b/rapor/final_2026/deliverables/CS395_FinalReport_EfeHan_Keles_25September2026.docx
@@ -536,7 +536,7 @@
         </w:rPr>
         <w:t>4.3 Methodology and tools</w:t>
         <w:tab/>
-        <w:t>7</w:t>
+        <w:t>8</w:t>
       </w:r>
     </w:p>
     <w:p>
@@ -555,7 +555,7 @@
         </w:rPr>
         <w:t>4.4 Expected outcomes and deliverables</w:t>
         <w:tab/>
-        <w:t>8</w:t>
+        <w:t>9</w:t>
       </w:r>
     </w:p>
     <w:p>
@@ -574,7 +574,7 @@
         </w:rPr>
         <w:t>4.5 Project details</w:t>
         <w:tab/>
-        <w:t>8</w:t>
+        <w:t>9</w:t>
       </w:r>
     </w:p>
     <w:p>
@@ -593,7 +593,7 @@
         </w:rPr>
         <w:t>4.5.1 Early models and the first transfer failures</w:t>
         <w:tab/>
-        <w:t>8</w:t>
+        <w:t>9</w:t>
       </w:r>
     </w:p>
     <w:p>
@@ -631,7 +631,7 @@
         </w:rPr>
         <w:t>4.5.3 Data roles and processing conditions</w:t>
         <w:tab/>
-        <w:t>9</w:t>
+        <w:t>10</w:t>
       </w:r>
     </w:p>
     <w:p>
@@ -650,7 +650,7 @@
         </w:rPr>
         <w:t>4.5.4 E92 representation and learning</w:t>
         <w:tab/>
-        <w:t>10</w:t>
+        <w:t>11</w:t>
       </w:r>
     </w:p>
     <w:p>
@@ -669,7 +669,7 @@
         </w:rPr>
         <w:t>4.5.5 Development improvement and acceptance limits</w:t>
         <w:tab/>
-        <w:t>10</w:t>
+        <w:t>12</w:t>
       </w:r>
     </w:p>
     <w:p>
@@ -688,7 +688,7 @@
         </w:rPr>
         <w:t>4.5.6 Honest scores and the web demonstration</w:t>
         <w:tab/>
-        <w:t>11</w:t>
+        <w:t>13</w:t>
       </w:r>
     </w:p>
     <w:p>
@@ -707,7 +707,7 @@
         </w:rPr>
         <w:t>4.5.7 Broader checks and rejected improvements</w:t>
         <w:tab/>
-        <w:t>12</w:t>
+        <w:t>14</w:t>
       </w:r>
     </w:p>
     <w:p>
@@ -726,7 +726,7 @@
         </w:rPr>
         <w:t>4.5.8 Model2 localization and its limits</w:t>
         <w:tab/>
-        <w:t>12</w:t>
+        <w:t>14</w:t>
       </w:r>
     </w:p>
     <w:p>
@@ -745,7 +745,7 @@
         </w:rPr>
         <w:t>4.6 Results</w:t>
         <w:tab/>
-        <w:t>13</w:t>
+        <w:t>16</w:t>
       </w:r>
     </w:p>
     <w:p>
@@ -764,7 +764,7 @@
         </w:rPr>
         <w:t>5. Internship experience</w:t>
         <w:tab/>
-        <w:t>13</w:t>
+        <w:t>16</w:t>
       </w:r>
     </w:p>
     <w:p>
@@ -783,7 +783,7 @@
         </w:rPr>
         <w:t>5.1 Learning</w:t>
         <w:tab/>
-        <w:t>13</w:t>
+        <w:t>16</w:t>
       </w:r>
     </w:p>
     <w:p>
@@ -802,7 +802,7 @@
         </w:rPr>
         <w:t>5.2 Relation to undergraduate education</w:t>
         <w:tab/>
-        <w:t>14</w:t>
+        <w:t>17</w:t>
       </w:r>
     </w:p>
     <w:p>
@@ -821,7 +821,7 @@
         </w:rPr>
         <w:t>5.3 Major difficulties</w:t>
         <w:tab/>
-        <w:t>14</w:t>
+        <w:t>17</w:t>
       </w:r>
     </w:p>
     <w:p>
@@ -840,7 +840,7 @@
         </w:rPr>
         <w:t>5.4 A typical day</w:t>
         <w:tab/>
-        <w:t>14</w:t>
+        <w:t>17</w:t>
       </w:r>
     </w:p>
     <w:p>
@@ -859,7 +859,7 @@
         </w:rPr>
         <w:t>6. Conclusions</w:t>
         <w:tab/>
-        <w:t>15</w:t>
+        <w:t>18</w:t>
       </w:r>
     </w:p>
     <w:p>
@@ -878,7 +878,7 @@
         </w:rPr>
         <w:t>7. Recommendations</w:t>
         <w:tab/>
-        <w:t>15</w:t>
+        <w:t>18</w:t>
       </w:r>
     </w:p>
     <w:p>
@@ -897,7 +897,7 @@
         </w:rPr>
         <w:t>8. References</w:t>
         <w:tab/>
-        <w:t>16</w:t>
+        <w:t>19</w:t>
       </w:r>
     </w:p>
     <w:p>
@@ -916,7 +916,7 @@
         </w:rPr>
         <w:t>9. Appendices</w:t>
         <w:tab/>
-        <w:t>18</w:t>
+        <w:t>21</w:t>
       </w:r>
     </w:p>
     <w:p>
@@ -935,7 +935,7 @@
         </w:rPr>
         <w:t>9.1 Development criteria</w:t>
         <w:tab/>
-        <w:t>18</w:t>
+        <w:t>21</w:t>
       </w:r>
     </w:p>
     <w:p>
@@ -954,7 +954,7 @@
         </w:rPr>
         <w:t>9.2 Evidence and reproduction map</w:t>
         <w:tab/>
-        <w:t>18</w:t>
+        <w:t>21</w:t>
       </w:r>
       <w:r>
         <w:rPr>
@@ -1278,6 +1278,20 @@
     </w:p>
     <w:p>
       <w:pPr>
+        <w:widowControl/>
+        <w:spacing w:line="480" w:lineRule="auto" w:before="0" w:after="0"/>
+      </w:pPr>
+      <w:r>
+        <w:rPr>
+          <w:rFonts w:ascii="Times New Roman" w:hAnsi="Times New Roman"/>
+          <w:color w:val="000000"/>
+          <w:sz w:val="24"/>
+        </w:rPr>
+        <w:t>In this report, generalization means working on image sources that were not used to guide development. A detector may learn a camera or compression pattern instead of a reliable sign of generation. If that pattern changes, its predictions can change even when the image still looks similar to a person. This is why the project compared sources and processing conditions separately.</w:t>
+      </w:r>
+    </w:p>
+    <w:p>
+      <w:pPr>
         <w:pStyle w:val="Heading2"/>
         <w:widowControl/>
         <w:spacing w:line="480" w:lineRule="auto" w:before="0" w:after="0"/>
@@ -1345,6 +1359,20 @@
           <w:sz w:val="24"/>
         </w:rPr>
         <w:t>Guo et al. (2017) explain why classifier scores need calibration before interpretation as confidence. Dwork et al. (2015) show the risks of repeatedly adapting to holdout results. Both issues shaped our evaluation and interface. As an industry comparison, Adobe Content Credentials records origin and editing information (Adobe, 2026). PixelProof estimates evidence from pixels; credential verification was not implemented.</w:t>
+      </w:r>
+    </w:p>
+    <w:p>
+      <w:pPr>
+        <w:widowControl/>
+        <w:spacing w:line="480" w:lineRule="auto" w:before="0" w:after="0"/>
+      </w:pPr>
+      <w:r>
+        <w:rPr>
+          <w:rFonts w:ascii="Times New Roman" w:hAnsi="Times New Roman"/>
+          <w:color w:val="000000"/>
+          <w:sz w:val="24"/>
+        </w:rPr>
+        <w:t>The literature suggested useful starting points, but it could not settle the project question. A method that performs well in its own paper may use different generators, cameras or decision rules. I therefore used these studies to choose experiments and explain possible failures. The report separates published findings from measurements made in PixelProof, so that the reputation of a pretrained model does not stand in for local evidence.</w:t>
       </w:r>
     </w:p>
     <w:p>
@@ -1741,6 +1769,20 @@
     </w:p>
     <w:p>
       <w:pPr>
+        <w:widowControl/>
+        <w:spacing w:line="480" w:lineRule="auto" w:before="0" w:after="0"/>
+      </w:pPr>
+      <w:r>
+        <w:rPr>
+          <w:rFonts w:ascii="Times New Roman" w:hAnsi="Times New Roman"/>
+          <w:color w:val="000000"/>
+          <w:sz w:val="24"/>
+        </w:rPr>
+        <w:t>For each candidate, the practical question was whether the change solved a known problem without creating an unacceptable one elsewhere. A lower total error count was insufficient if the model newly missed an AI image that the reference had detected. Keeping the failed candidates in the records helped explain why a newer experiment did not automatically replace the current demo model.</w:t>
+      </w:r>
+    </w:p>
+    <w:p>
+      <w:pPr>
         <w:pStyle w:val="Heading2"/>
         <w:widowControl/>
         <w:spacing w:line="480" w:lineRule="auto" w:before="0" w:after="0"/>
@@ -1828,6 +1870,20 @@
     </w:p>
     <w:p>
       <w:pPr>
+        <w:widowControl/>
+        <w:spacing w:line="480" w:lineRule="auto" w:before="0" w:after="0"/>
+      </w:pPr>
+      <w:r>
+        <w:rPr>
+          <w:rFonts w:ascii="Times New Roman" w:hAnsi="Times New Roman"/>
+          <w:color w:val="000000"/>
+          <w:sz w:val="24"/>
+        </w:rPr>
+        <w:t>I treated the familiar test as a check that the training procedure worked on similar data. The external collection asked a harder question about transfer to other sources. The large gap between them showed why one accuracy number was not enough. It also motivated checking input preparation before making a more expensive model change.</w:t>
+      </w:r>
+    </w:p>
+    <w:p>
+      <w:pPr>
         <w:pStyle w:val="Heading3"/>
         <w:widowControl/>
         <w:spacing w:line="480" w:lineRule="auto" w:before="0" w:after="0"/>
@@ -1853,6 +1909,20 @@
           <w:sz w:val="24"/>
         </w:rPr>
         <w:t>Two datasets used numeric labels opposite to our convention of 0 for real and 1 for AI. Explicit mapping and reruns corrected affected experiments. DINOv2’s Defactify AUC changed from 0.480 to 0.764, invalidating an earlier explanation that its features were unsuitable. The larger training pool also reduced false alerts more than first reported. A separate threshold-selection procedure was repaired because it could consult evaluation data; the corrected candidate failed admission and was removed (Keleş, 2026, E19b–E19c and E27).</w:t>
+      </w:r>
+    </w:p>
+    <w:p>
+      <w:pPr>
+        <w:widowControl/>
+        <w:spacing w:line="480" w:lineRule="auto" w:before="0" w:after="0"/>
+      </w:pPr>
+      <w:r>
+        <w:rPr>
+          <w:rFonts w:ascii="Times New Roman" w:hAnsi="Times New Roman"/>
+          <w:color w:val="000000"/>
+          <w:sz w:val="24"/>
+        </w:rPr>
+        <w:t>A label is the answer supplied during learning or evaluation. Reversing its meaning can make a useful model appear poor and can teach a new model the wrong relationship. The repair therefore required more than changing a chart caption. Affected measurements had to be rerun, and the earlier explanation had to be corrected in the written record.</w:t>
       </w:r>
     </w:p>
     <w:p>
@@ -2638,6 +2708,20 @@
     </w:tbl>
     <w:p>
       <w:pPr>
+        <w:widowControl/>
+        <w:spacing w:line="480" w:lineRule="auto" w:before="0" w:after="0"/>
+      </w:pPr>
+      <w:r>
+        <w:rPr>
+          <w:rFonts w:ascii="Times New Roman" w:hAnsi="Times New Roman"/>
+          <w:color w:val="000000"/>
+          <w:sz w:val="24"/>
+        </w:rPr>
+        <w:t>The same photograph can appear at several sizes or compression levels. These versions help reveal sensitivity to processing, but they still come from one parent. Similarly, different photographs of the same scene may share useful clues. Counting views, files or downloaded gigabytes as independent examples would overstate the strength of the evidence. The useful question is which sources, scenes and generators a measurement actually covers.</w:t>
+      </w:r>
+    </w:p>
+    <w:p>
+      <w:pPr>
         <w:pStyle w:val="Heading3"/>
         <w:widowControl/>
         <w:spacing w:line="480" w:lineRule="auto" w:before="0" w:after="0"/>
@@ -2745,6 +2829,20 @@
     </w:p>
     <w:p>
       <w:pPr>
+        <w:widowControl/>
+        <w:spacing w:line="480" w:lineRule="auto" w:before="0" w:after="0"/>
+      </w:pPr>
+      <w:r>
+        <w:rPr>
+          <w:rFonts w:ascii="Times New Roman" w:hAnsi="Times New Roman"/>
+          <w:color w:val="000000"/>
+          <w:sz w:val="24"/>
+        </w:rPr>
+        <w:t>Transfer learning reuses knowledge learned before this project. Here, an encoder converts pixels into a numerical description of the image. Keeping the encoder fixed means its pretrained weights stay unchanged while smaller project components learn from those descriptions. This made adaptation practical on the available computer. It also means that our contribution is the adaptation, evaluation and application around the existing representations, rather than the creation of DINOv2, CLIP or DEAR.</w:t>
+      </w:r>
+    </w:p>
+    <w:p>
+      <w:pPr>
         <w:pStyle w:val="Heading3"/>
         <w:widowControl/>
         <w:spacing w:line="480" w:lineRule="auto" w:before="0" w:after="0"/>
@@ -2852,6 +2950,20 @@
     </w:p>
     <w:p>
       <w:pPr>
+        <w:widowControl/>
+        <w:spacing w:line="480" w:lineRule="auto" w:before="0" w:after="0"/>
+      </w:pPr>
+      <w:r>
+        <w:rPr>
+          <w:rFonts w:ascii="Times New Roman" w:hAnsi="Times New Roman"/>
+          <w:color w:val="000000"/>
+          <w:sz w:val="24"/>
+        </w:rPr>
+        <w:t>The comparison asks both how many errors occurred and which images caused them. Two models can detect the same number of AI images while missing different examples. Under the retention rule, recovering one example cannot compensate for newly missing another. This explains how E92 could improve the overall measurements and still fail the full decision rule. It also keeps the report from treating 20/20 as proof of perfect classification.</w:t>
+      </w:r>
+    </w:p>
+    <w:p>
+      <w:pPr>
         <w:pStyle w:val="Heading3"/>
         <w:widowControl/>
         <w:spacing w:line="480" w:lineRule="auto" w:before="0" w:after="0"/>
@@ -2895,6 +3007,20 @@
     </w:p>
     <w:p>
       <w:pPr>
+        <w:widowControl/>
+        <w:spacing w:line="480" w:lineRule="auto" w:before="0" w:after="0"/>
+      </w:pPr>
+      <w:r>
+        <w:rPr>
+          <w:rFonts w:ascii="Times New Roman" w:hAnsi="Times New Roman"/>
+          <w:color w:val="000000"/>
+          <w:sz w:val="24"/>
+        </w:rPr>
+        <w:t>The second processed view acts as a consistency check. When ordinary resizing and compression change the response, the user needs to know that the evidence is unstable. The interface therefore has an uncertain outcome instead of forcing every upload into a real-or-AI answer. Even the no-clear-evidence result only describes what the detector found. Establishing where a photograph came from requires additional information about its source.</w:t>
+      </w:r>
+    </w:p>
+    <w:p>
+      <w:pPr>
         <w:pStyle w:val="Heading3"/>
         <w:widowControl/>
         <w:spacing w:line="480" w:lineRule="auto" w:before="0" w:after="0"/>
@@ -2934,6 +3060,20 @@
           <w:sz w:val="24"/>
         </w:rPr>
         <w:t>A processing audit found known 224-pixel derivatives in 29.18% of real training images versus 7.68% of AI images. Added source-pixel features slightly improved clean averages but harmed processed AI detection; one JPEG75 result fell from 75.73% to 74.15%. Follow-up decomposition identified harmful score contributions, without proving a physical cause. The candidate was rejected. Unscored reserves remained, but no balanced, independent final test was established (Keleş, 2026, E148–E152).</w:t>
+      </w:r>
+    </w:p>
+    <w:p>
+      <w:pPr>
+        <w:widowControl/>
+        <w:spacing w:line="480" w:lineRule="auto" w:before="0" w:after="0"/>
+      </w:pPr>
+      <w:r>
+        <w:rPr>
+          <w:rFonts w:ascii="Times New Roman" w:hAnsi="Times New Roman"/>
+          <w:color w:val="000000"/>
+          <w:sz w:val="24"/>
+        </w:rPr>
+        <w:t>These checks changed the next development priority. Adding another feature was less useful than learning whether the apparent improvement survived a change in source or processing. A suitable final evaluation must therefore be planned before inspecting its results. Its images should not have influenced training, threshold selection or decisions about which candidate to keep. More files from the same familiar sources would not resolve this problem by themselves.</w:t>
       </w:r>
     </w:p>
     <w:p>
@@ -3371,7 +3511,22 @@
     </w:tbl>
     <w:p>
       <w:pPr>
+        <w:widowControl/>
+        <w:spacing w:line="480" w:lineRule="auto" w:before="0" w:after="0"/>
+      </w:pPr>
+      <w:r>
+        <w:rPr>
+          <w:rFonts w:ascii="Times New Roman" w:hAnsi="Times New Roman"/>
+          <w:color w:val="000000"/>
+          <w:sz w:val="24"/>
+        </w:rPr>
+        <w:t>A localization map gives a score at each location. To assess it, we need a mask identifying the edited pixels and authentic images that should not contain an edited region. Pixel AUC measures how well scores rank edited pixels above authentic ones across thresholds. It is not the percentage of an edit correctly outlined. False markings on authentic images provide a separate practical check.</w:t>
+      </w:r>
+    </w:p>
+    <w:p>
+      <w:pPr>
         <w:pStyle w:val="Heading2"/>
+        <w:pageBreakBefore/>
         <w:widowControl/>
         <w:spacing w:line="480" w:lineRule="auto" w:before="0" w:after="0"/>
       </w:pPr>
@@ -4026,6 +4181,20 @@
     </w:p>
     <w:p>
       <w:pPr>
+        <w:widowControl/>
+        <w:spacing w:line="480" w:lineRule="auto" w:before="0" w:after="0"/>
+      </w:pPr>
+      <w:r>
+        <w:rPr>
+          <w:rFonts w:ascii="Times New Roman" w:hAnsi="Times New Roman"/>
+          <w:color w:val="000000"/>
+          <w:sz w:val="24"/>
+        </w:rPr>
+        <w:t>The records also helped me manage the work. After a run, I needed to explain what changed, what the result supported and what should happen next. Writing that decision made it easier to return to the project after an interruption and avoid repeating a rejected approach. I learned that narrowing a claim can be more useful than defending an attractive but weak result.</w:t>
+      </w:r>
+    </w:p>
+    <w:p>
+      <w:pPr>
         <w:pStyle w:val="Heading2"/>
         <w:widowControl/>
         <w:spacing w:line="480" w:lineRule="auto" w:before="0" w:after="0"/>
@@ -4198,7 +4367,7 @@
           <w:color w:val="000000"/>
           <w:sz w:val="24"/>
         </w:rPr>
-        <w:t>Abdelhamed, A., Lin, S., &amp; Brown, M. S. (2018). A high-quality denoising dataset for smartphone cameras. Proceedings of the IEEE Conference on Computer Vision and Pattern Recognition. Retrieved September 25, 2026, from https://abdokamel.github.io/sidd/</w:t>
+        <w:t>Abdelhamed, A., Lin, S., &amp; Brown, M. S. (2018). A high-quality denoising dataset for smartphone cameras. Proceedings of the IEEE Conference on Computer Vision and Pattern Recognition, 1692–1700. Retrieved September 29, 2026, from https://abdokamel.github.io/sidd/</w:t>
       </w:r>
     </w:p>
     <w:p>
@@ -4228,7 +4397,7 @@
           <w:color w:val="000000"/>
           <w:sz w:val="24"/>
         </w:rPr>
-        <w:t>Chen, C., Chen, Q., Xu, J., &amp; Koltun, V. (2018). Learning to see in the dark. Proceedings of the IEEE Conference on Computer Vision and Pattern Recognition. Retrieved September 25, 2026, from https://cchen156.github.io/SID.html</w:t>
+        <w:t>Chen, C., Chen, Q., Xu, J., &amp; Koltun, V. (2018). Learning to see in the dark. Proceedings of the IEEE Conference on Computer Vision and Pattern Recognition, 3291–3300. Retrieved September 29, 2026, from https://cchen156.github.io/SID.html</w:t>
       </w:r>
     </w:p>
     <w:p>

</xml_diff>